<commit_message>
refactor(memo-inquiry-90): apply 45-day structural architecture to 90-day inquiry memo and save as reference
</commit_message>
<xml_diff>
--- a/frontend/static/docs/ขอส่งใบติดตามทวงถาม_90_วัน_Rebuild_Thai.docx
+++ b/frontend/static/docs/ขอส่งใบติดตามทวงถาม_90_วัน_Rebuild_Thai.docx
@@ -2,6 +2,22 @@
 <file path=word/document.xml><?xml version="1.0" encoding="utf-8"?>
 <w:document xmlns:wpc="http://schemas.microsoft.com/office/word/2010/wordprocessingCanvas" xmlns:mo="http://schemas.microsoft.com/office/mac/office/2008/main" xmlns:mc="http://schemas.openxmlformats.org/markup-compatibility/2006" xmlns:mv="urn:schemas-microsoft-com:mac:vml" xmlns:o="urn:schemas-microsoft-com:office:office" xmlns:r="http://schemas.openxmlformats.org/officeDocument/2006/relationships" xmlns:m="http://schemas.openxmlformats.org/officeDocument/2006/math" xmlns:v="urn:schemas-microsoft-com:vml" xmlns:wp14="http://schemas.microsoft.com/office/word/2010/wordprocessingDrawing" xmlns:wp="http://schemas.openxmlformats.org/drawingml/2006/wordprocessingDrawing" xmlns:w10="urn:schemas-microsoft-com:office:word" xmlns:w="http://schemas.openxmlformats.org/wordprocessingml/2006/main" xmlns:w14="http://schemas.microsoft.com/office/word/2010/wordml" xmlns:wpg="http://schemas.microsoft.com/office/word/2010/wordprocessingGroup" xmlns:wpi="http://schemas.microsoft.com/office/word/2010/wordprocessingInk" xmlns:wne="http://schemas.microsoft.com/office/word/2006/wordml" xmlns:wps="http://schemas.microsoft.com/office/word/2010/wordprocessingShape" mc:Ignorable="w14 wp14">
   <w:body>
+    <w:p>
+      <w:pPr>
+        <w:spacing w:after="40"/>
+        <w:jc w:val="center"/>
+      </w:pPr>
+      <w:r>
+        <w:rPr>
+          <w:rFonts w:ascii="TH Sarabun PSK" w:hAnsi="TH Sarabun PSK"/>
+          <w:b w:val="0"/>
+          <w:i w:val="0"/>
+          <w:sz w:val="26"/>
+          <w:rFonts w:ascii="TH Sarabun PSK" w:hAnsi="TH Sarabun PSK" w:cs="TH Sarabun PSK"/>
+        </w:rPr>
+        <w:t>( สำเนาคู่ฉบับ )</w:t>
+      </w:r>
+    </w:p>
     <w:tbl>
       <w:tblPr>
         <w:tblW w:type="auto" w:w="0"/>
@@ -15,7 +31,7 @@
       <w:tr>
         <w:tc>
           <w:tcPr>
-            <w:tcW w:type="dxa" w:w="1872"/>
+            <w:tcW w:type="dxa" w:w="1728"/>
             <w:tcBorders/>
           </w:tcPr>
           <w:p>
@@ -25,7 +41,7 @@
             <w:r>
               <w:drawing>
                 <wp:inline xmlns:a="http://schemas.openxmlformats.org/drawingml/2006/main" xmlns:pic="http://schemas.openxmlformats.org/drawingml/2006/picture">
-                  <wp:extent cx="1078992" cy="1233134"/>
+                  <wp:extent cx="1078992" cy="1078992"/>
                   <wp:docPr id="1" name="Picture 1"/>
                   <wp:cNvGraphicFramePr>
                     <a:graphicFrameLocks noChangeAspect="1"/>
@@ -46,7 +62,7 @@
                         <pic:spPr>
                           <a:xfrm>
                             <a:off x="0" y="0"/>
-                            <a:ext cx="1078992" cy="1233134"/>
+                            <a:ext cx="1078992" cy="1078992"/>
                           </a:xfrm>
                           <a:prstGeom prst="rect"/>
                         </pic:spPr>
@@ -60,7 +76,7 @@
         </w:tc>
         <w:tc>
           <w:tcPr>
-            <w:tcW w:type="dxa" w:w="7776"/>
+            <w:tcW w:type="dxa" w:w="7920"/>
             <w:tcBorders/>
           </w:tcPr>
           <w:p>
@@ -70,9 +86,11 @@
             </w:pPr>
             <w:r>
               <w:rPr>
-                <w:rFonts w:ascii="TH Sarabun PSK" w:hAnsi="TH Sarabun PSK" w:eastAsia="TH Sarabun PSK" w:cs="TH Sarabun PSK"/>
+                <w:rFonts w:ascii="TH Sarabun PSK" w:hAnsi="TH Sarabun PSK"/>
                 <w:b/>
+                <w:i w:val="0"/>
                 <w:sz w:val="48"/>
+                <w:rFonts w:ascii="TH Sarabun PSK" w:hAnsi="TH Sarabun PSK" w:cs="TH Sarabun PSK"/>
               </w:rPr>
               <w:t>บันทึกข้อความ</w:t>
             </w:r>
@@ -82,156 +100,184 @@
     </w:tbl>
     <w:p>
       <w:pPr>
-        <w:spacing w:after="40" w:line="360" w:lineRule="auto"/>
+        <w:spacing w:after="40" w:line="300" w:lineRule="auto"/>
       </w:pPr>
       <w:r>
         <w:rPr>
-          <w:rFonts w:ascii="TH Sarabun PSK" w:hAnsi="TH Sarabun PSK" w:eastAsia="TH Sarabun PSK" w:cs="TH Sarabun PSK"/>
+          <w:rFonts w:ascii="TH Sarabun PSK" w:hAnsi="TH Sarabun PSK"/>
           <w:b/>
-          <w:sz w:val="28"/>
+          <w:i w:val="0"/>
+          <w:sz w:val="34"/>
+          <w:rFonts w:ascii="TH Sarabun PSK" w:hAnsi="TH Sarabun PSK" w:cs="TH Sarabun PSK"/>
         </w:rPr>
         <w:t xml:space="preserve">ส่วนราชการ  </w:t>
       </w:r>
       <w:r>
         <w:rPr>
-          <w:rFonts w:ascii="TH Sarabun PSK" w:hAnsi="TH Sarabun PSK" w:eastAsia="TH Sarabun PSK" w:cs="TH Sarabun PSK"/>
+          <w:rFonts w:ascii="TH Sarabun PSK" w:hAnsi="TH Sarabun PSK"/>
           <w:b w:val="0"/>
-          <w:sz w:val="24"/>
+          <w:i w:val="0"/>
+          <w:sz w:val="34"/>
+          <w:rFonts w:ascii="TH Sarabun PSK" w:hAnsi="TH Sarabun PSK" w:cs="TH Sarabun PSK"/>
         </w:rPr>
         <w:t>ป.พัน.๔ ร้อย.๒  ( โทร. ๓๑๑๙๓ )</w:t>
       </w:r>
     </w:p>
     <w:p>
       <w:pPr>
-        <w:spacing w:after="40" w:line="360" w:lineRule="auto"/>
+        <w:spacing w:after="40" w:line="300" w:lineRule="auto"/>
       </w:pPr>
       <w:r>
         <w:rPr>
-          <w:rFonts w:ascii="TH Sarabun PSK" w:hAnsi="TH Sarabun PSK" w:eastAsia="TH Sarabun PSK" w:cs="TH Sarabun PSK"/>
+          <w:rFonts w:ascii="TH Sarabun PSK" w:hAnsi="TH Sarabun PSK"/>
           <w:b/>
-          <w:sz w:val="28"/>
+          <w:i w:val="0"/>
+          <w:sz w:val="34"/>
+          <w:rFonts w:ascii="TH Sarabun PSK" w:hAnsi="TH Sarabun PSK" w:cs="TH Sarabun PSK"/>
         </w:rPr>
         <w:t xml:space="preserve">ที่  กห ๐๔๘๓.๑.๔.๑ /  </w:t>
       </w:r>
       <w:r>
         <w:rPr>
-          <w:rFonts w:ascii="TH Sarabun PSK" w:hAnsi="TH Sarabun PSK" w:eastAsia="TH Sarabun PSK" w:cs="TH Sarabun PSK"/>
+          <w:rFonts w:ascii="TH Sarabun PSK" w:hAnsi="TH Sarabun PSK"/>
           <w:b w:val="0"/>
-          <w:sz w:val="24"/>
+          <w:i w:val="0"/>
+          <w:sz w:val="34"/>
+          <w:rFonts w:ascii="TH Sarabun PSK" w:hAnsi="TH Sarabun PSK" w:cs="TH Sarabun PSK"/>
         </w:rPr>
         <w:t>วันที่            มิ.ย. ๕๔</w:t>
       </w:r>
     </w:p>
     <w:p>
       <w:pPr>
-        <w:spacing w:after="40" w:line="360" w:lineRule="auto"/>
+        <w:spacing w:after="40" w:line="300" w:lineRule="auto"/>
       </w:pPr>
       <w:r>
         <w:rPr>
-          <w:rFonts w:ascii="TH Sarabun PSK" w:hAnsi="TH Sarabun PSK" w:eastAsia="TH Sarabun PSK" w:cs="TH Sarabun PSK"/>
+          <w:rFonts w:ascii="TH Sarabun PSK" w:hAnsi="TH Sarabun PSK"/>
           <w:b/>
-          <w:sz w:val="28"/>
+          <w:i w:val="0"/>
+          <w:sz w:val="34"/>
+          <w:rFonts w:ascii="TH Sarabun PSK" w:hAnsi="TH Sarabun PSK" w:cs="TH Sarabun PSK"/>
         </w:rPr>
         <w:t xml:space="preserve">เรื่อง  </w:t>
       </w:r>
       <w:r>
         <w:rPr>
-          <w:rFonts w:ascii="TH Sarabun PSK" w:hAnsi="TH Sarabun PSK" w:eastAsia="TH Sarabun PSK" w:cs="TH Sarabun PSK"/>
+          <w:rFonts w:ascii="TH Sarabun PSK" w:hAnsi="TH Sarabun PSK"/>
           <w:b w:val="0"/>
-          <w:sz w:val="24"/>
+          <w:i w:val="0"/>
+          <w:sz w:val="34"/>
+          <w:rFonts w:ascii="TH Sarabun PSK" w:hAnsi="TH Sarabun PSK" w:cs="TH Sarabun PSK"/>
         </w:rPr>
         <w:t>ขอส่งใบติดตามใบเบิก</w:t>
       </w:r>
     </w:p>
     <w:p>
       <w:pPr>
-        <w:spacing w:after="40" w:line="360" w:lineRule="auto"/>
+        <w:spacing w:after="40" w:line="300" w:lineRule="auto"/>
       </w:pPr>
       <w:r>
         <w:rPr>
-          <w:rFonts w:ascii="TH Sarabun PSK" w:hAnsi="TH Sarabun PSK" w:eastAsia="TH Sarabun PSK" w:cs="TH Sarabun PSK"/>
+          <w:rFonts w:ascii="TH Sarabun PSK" w:hAnsi="TH Sarabun PSK"/>
           <w:b/>
-          <w:sz w:val="28"/>
+          <w:i w:val="0"/>
+          <w:sz w:val="34"/>
+          <w:rFonts w:ascii="TH Sarabun PSK" w:hAnsi="TH Sarabun PSK" w:cs="TH Sarabun PSK"/>
         </w:rPr>
         <w:t xml:space="preserve">เรียน  </w:t>
       </w:r>
       <w:r>
         <w:rPr>
-          <w:rFonts w:ascii="TH Sarabun PSK" w:hAnsi="TH Sarabun PSK" w:eastAsia="TH Sarabun PSK" w:cs="TH Sarabun PSK"/>
+          <w:rFonts w:ascii="TH Sarabun PSK" w:hAnsi="TH Sarabun PSK"/>
           <w:b w:val="0"/>
-          <w:sz w:val="24"/>
+          <w:i w:val="0"/>
+          <w:sz w:val="34"/>
+          <w:rFonts w:ascii="TH Sarabun PSK" w:hAnsi="TH Sarabun PSK" w:cs="TH Sarabun PSK"/>
         </w:rPr>
         <w:t>ผบ.ป.พัน.๔ ( ผ่าน ฝกบ. )</w:t>
       </w:r>
     </w:p>
     <w:p>
       <w:pPr>
-        <w:spacing w:after="40" w:line="360" w:lineRule="auto"/>
+        <w:spacing w:after="40" w:line="300" w:lineRule="auto"/>
       </w:pPr>
       <w:r>
         <w:rPr>
-          <w:rFonts w:ascii="TH Sarabun PSK" w:hAnsi="TH Sarabun PSK" w:eastAsia="TH Sarabun PSK" w:cs="TH Sarabun PSK"/>
+          <w:rFonts w:ascii="TH Sarabun PSK" w:hAnsi="TH Sarabun PSK"/>
           <w:b/>
-          <w:sz w:val="28"/>
+          <w:i w:val="0"/>
+          <w:sz w:val="34"/>
+          <w:rFonts w:ascii="TH Sarabun PSK" w:hAnsi="TH Sarabun PSK" w:cs="TH Sarabun PSK"/>
         </w:rPr>
         <w:t xml:space="preserve">อ้างถึง  </w:t>
       </w:r>
       <w:r>
         <w:rPr>
-          <w:rFonts w:ascii="TH Sarabun PSK" w:hAnsi="TH Sarabun PSK" w:eastAsia="TH Sarabun PSK" w:cs="TH Sarabun PSK"/>
+          <w:rFonts w:ascii="TH Sarabun PSK" w:hAnsi="TH Sarabun PSK"/>
           <w:b w:val="0"/>
-          <w:sz w:val="24"/>
+          <w:i w:val="0"/>
+          <w:sz w:val="34"/>
+          <w:rFonts w:ascii="TH Sarabun PSK" w:hAnsi="TH Sarabun PSK" w:cs="TH Sarabun PSK"/>
         </w:rPr>
         <w:t>ระเบียบ ทบ. ว่าด้วยการส่งกำลัง สิ่งอุปกรณ์ ประเภท ๒ และ ๔ พ.ศ. ๒๕๓๔</w:t>
       </w:r>
     </w:p>
     <w:p>
       <w:pPr>
-        <w:spacing w:after="40" w:line="360" w:lineRule="auto"/>
+        <w:spacing w:after="40" w:line="300" w:lineRule="auto"/>
       </w:pPr>
       <w:r>
         <w:rPr>
-          <w:rFonts w:ascii="TH Sarabun PSK" w:hAnsi="TH Sarabun PSK" w:eastAsia="TH Sarabun PSK" w:cs="TH Sarabun PSK"/>
+          <w:rFonts w:ascii="TH Sarabun PSK" w:hAnsi="TH Sarabun PSK"/>
           <w:b/>
-          <w:sz w:val="28"/>
+          <w:i w:val="0"/>
+          <w:sz w:val="34"/>
+          <w:rFonts w:ascii="TH Sarabun PSK" w:hAnsi="TH Sarabun PSK" w:cs="TH Sarabun PSK"/>
         </w:rPr>
         <w:t xml:space="preserve">สิ่งที่ส่งมาด้วย  </w:t>
       </w:r>
       <w:r>
         <w:rPr>
-          <w:rFonts w:ascii="TH Sarabun PSK" w:hAnsi="TH Sarabun PSK" w:eastAsia="TH Sarabun PSK" w:cs="TH Sarabun PSK"/>
+          <w:rFonts w:ascii="TH Sarabun PSK" w:hAnsi="TH Sarabun PSK"/>
           <w:b w:val="0"/>
-          <w:sz w:val="24"/>
+          <w:i w:val="0"/>
+          <w:sz w:val="34"/>
+          <w:rFonts w:ascii="TH Sarabun PSK" w:hAnsi="TH Sarabun PSK" w:cs="TH Sarabun PSK"/>
         </w:rPr>
-        <w:t>- ใบติดตามใบเบิก     จำนวน ๒ ฉบับ</w:t>
+        <w:t>ใบติดตามใบเบิก     จำนวน ๒ ฉบับ</w:t>
       </w:r>
     </w:p>
     <w:p>
       <w:pPr>
-        <w:spacing w:after="80" w:line="360" w:lineRule="auto"/>
+        <w:spacing w:after="80" w:line="300" w:lineRule="auto"/>
         <w:ind w:firstLine="1411"/>
         <w:jc w:val="both"/>
       </w:pPr>
       <w:r>
         <w:rPr>
-          <w:rFonts w:ascii="TH Sarabun PSK" w:hAnsi="TH Sarabun PSK" w:eastAsia="TH Sarabun PSK" w:cs="TH Sarabun PSK"/>
+          <w:rFonts w:ascii="TH Sarabun PSK" w:hAnsi="TH Sarabun PSK"/>
           <w:b w:val="0"/>
-          <w:sz w:val="24"/>
+          <w:i w:val="0"/>
+          <w:sz w:val="34"/>
+          <w:rFonts w:ascii="TH Sarabun PSK" w:hAnsi="TH Sarabun PSK" w:cs="TH Sarabun PSK"/>
         </w:rPr>
         <w:t>ตามอ้างถึง ป.พัน.๔ ร้อย.๒ ขอส่งใบติดตามใบเบิก ตามห้วงระยะเวลาการเบิกเกิน ๙๐ วัน ซึ่งหน่วยได้ปฏิบัติตามระเบียบกองทัพบก ว่าด้วยการส่งกำลังสิ่งอุปกรณ์ ประเภท ๒ และ ๔ รายละเอียดตามสิ่งที่ส่งมาด้วย</w:t>
       </w:r>
     </w:p>
     <w:p>
       <w:pPr>
-        <w:spacing w:after="80" w:line="360" w:lineRule="auto"/>
+        <w:spacing w:after="80" w:line="300" w:lineRule="auto"/>
         <w:ind w:firstLine="1411"/>
         <w:jc w:val="both"/>
       </w:pPr>
       <w:r>
         <w:rPr>
-          <w:rFonts w:ascii="TH Sarabun PSK" w:hAnsi="TH Sarabun PSK" w:eastAsia="TH Sarabun PSK" w:cs="TH Sarabun PSK"/>
+          <w:rFonts w:ascii="TH Sarabun PSK" w:hAnsi="TH Sarabun PSK"/>
           <w:b w:val="0"/>
-          <w:sz w:val="24"/>
+          <w:i w:val="0"/>
+          <w:sz w:val="34"/>
+          <w:rFonts w:ascii="TH Sarabun PSK" w:hAnsi="TH Sarabun PSK" w:cs="TH Sarabun PSK"/>
         </w:rPr>
         <w:t>จึงเรียนมาเพื่อกรุณาพิจารณาดำเนินการต่อไป</w:t>
       </w:r>
@@ -241,13 +287,13 @@
         <w:tabs>
           <w:tab w:pos="5947" w:val="right"/>
         </w:tabs>
-        <w:spacing w:before="1100" w:after="440"/>
+        <w:spacing w:before="0" w:after="440"/>
       </w:pPr>
       <w:r>
         <w:rPr>
-          <w:rFonts w:ascii="TH Sarabun PSK" w:hAnsi="TH Sarabun PSK" w:eastAsia="TH Sarabun PSK" w:cs="TH Sarabun PSK"/>
+          <w:rFonts w:ascii="TH Sarabun PSK" w:hAnsi="TH Sarabun PSK"/>
           <w:b w:val="0"/>
-          <w:sz w:val="32"/>
+          <w:sz w:val="34"/>
         </w:rPr>
         <w:tab/>
         <w:t>ร.อ.</w:t>
@@ -262,9 +308,9 @@
       </w:pPr>
       <w:r>
         <w:rPr>
-          <w:rFonts w:ascii="TH Sarabun PSK" w:hAnsi="TH Sarabun PSK" w:eastAsia="TH Sarabun PSK" w:cs="TH Sarabun PSK"/>
+          <w:rFonts w:ascii="TH Sarabun PSK" w:hAnsi="TH Sarabun PSK"/>
           <w:b w:val="0"/>
-          <w:sz w:val="32"/>
+          <w:sz w:val="34"/>
         </w:rPr>
         <w:tab/>
         <w:t>(กฤติน  นราพงษ์)</w:t>
@@ -273,15 +319,15 @@
     <w:p>
       <w:pPr>
         <w:tabs>
-          <w:tab w:pos="7272" w:val="center"/>
+          <w:tab w:pos="7315" w:val="center"/>
         </w:tabs>
         <w:spacing w:before="0" w:after="0"/>
       </w:pPr>
       <w:r>
         <w:rPr>
-          <w:rFonts w:ascii="TH Sarabun PSK" w:hAnsi="TH Sarabun PSK" w:eastAsia="TH Sarabun PSK" w:cs="TH Sarabun PSK"/>
+          <w:rFonts w:ascii="TH Sarabun PSK" w:hAnsi="TH Sarabun PSK"/>
           <w:b w:val="0"/>
-          <w:sz w:val="32"/>
+          <w:sz w:val="34"/>
         </w:rPr>
         <w:tab/>
         <w:t>ผบ.ป.พัน.๔ ร้อย.๒</w:t>
@@ -289,9 +335,59 @@
     </w:p>
     <w:p>
       <w:pPr>
+        <w:tabs>
+          <w:tab w:pos="6480" w:val="left"/>
+          <w:tab w:pos="7920" w:val="left"/>
+          <w:tab w:pos="9216" w:val="left"/>
+        </w:tabs>
+        <w:spacing w:before="600" w:after="0"/>
+      </w:pPr>
+      <w:r>
+        <w:rPr>
+          <w:rFonts w:ascii="TH Sarabun PSK" w:hAnsi="TH Sarabun PSK"/>
+          <w:b w:val="0"/>
+          <w:i w:val="0"/>
+          <w:sz w:val="27"/>
+          <w:rFonts w:ascii="TH Sarabun PSK" w:hAnsi="TH Sarabun PSK" w:cs="TH Sarabun PSK"/>
+        </w:rPr>
+        <w:tab/>
+        <w:t>จ.ส.อ.</w:t>
+        <w:tab/>
+        <w:t>ร่าง/ตรวจ</w:t>
+        <w:tab/>
+        <w:t>มิ.ย. ๕๔</w:t>
+      </w:r>
+    </w:p>
+    <w:p>
+      <w:pPr>
+        <w:tabs>
+          <w:tab w:pos="6480" w:val="left"/>
+          <w:tab w:pos="7920" w:val="left"/>
+          <w:tab w:pos="9216" w:val="left"/>
+        </w:tabs>
+        <w:spacing w:before="0" w:after="0"/>
+      </w:pPr>
+      <w:r>
+        <w:rPr>
+          <w:rFonts w:ascii="TH Sarabun PSK" w:hAnsi="TH Sarabun PSK"/>
+          <w:b w:val="0"/>
+          <w:i w:val="0"/>
+          <w:sz w:val="27"/>
+          <w:rFonts w:ascii="TH Sarabun PSK" w:hAnsi="TH Sarabun PSK" w:cs="TH Sarabun PSK"/>
+        </w:rPr>
+        <w:tab/>
+        <w:t>ส.อ. เสน่ห์ ฯ</w:t>
+        <w:tab/>
+        <w:t>พิมพ์</w:t>
+        <w:tab/>
+        <w:t>มิ.ย. ๕๔</w:t>
+      </w:r>
+    </w:p>
+    <w:p>
+      <w:pPr>
         <w:sectPr>
           <w:pgSz w:w="11909" w:h="16834"/>
-          <w:pgMar w:top="1138" w:right="850" w:bottom="850" w:left="1411" w:header="720" w:footer="720" w:gutter="0"/>
+          <w:pgMar w:top="850" w:right="850" w:bottom="850" w:left="1411" w:header="720" w:footer="720" w:gutter="0"/>
           <w:cols w:space="720"/>
           <w:docGrid w:linePitch="360"/>
         </w:sectPr>
@@ -303,9 +399,11 @@
       </w:pPr>
       <w:r>
         <w:rPr>
-          <w:rFonts w:ascii="TH Sarabun PSK" w:hAnsi="TH Sarabun PSK" w:eastAsia="TH Sarabun PSK" w:cs="TH Sarabun PSK"/>
+          <w:rFonts w:ascii="TH Sarabun PSK" w:hAnsi="TH Sarabun PSK"/>
           <w:b/>
-          <w:sz w:val="24"/>
+          <w:i w:val="0"/>
+          <w:sz w:val="28"/>
+          <w:rFonts w:ascii="TH Sarabun PSK" w:hAnsi="TH Sarabun PSK" w:cs="TH Sarabun PSK"/>
         </w:rPr>
         <w:t>ทบ. ๔๐๐ - ๐๗๑</w:t>
         <w:br/>
@@ -319,9 +417,11 @@
       </w:pPr>
       <w:r>
         <w:rPr>
-          <w:rFonts w:ascii="TH Sarabun PSK" w:hAnsi="TH Sarabun PSK" w:eastAsia="TH Sarabun PSK" w:cs="TH Sarabun PSK"/>
+          <w:rFonts w:ascii="TH Sarabun PSK" w:hAnsi="TH Sarabun PSK"/>
           <w:b/>
-          <w:sz w:val="36"/>
+          <w:i w:val="0"/>
+          <w:sz w:val="40"/>
+          <w:rFonts w:ascii="TH Sarabun PSK" w:hAnsi="TH Sarabun PSK" w:cs="TH Sarabun PSK"/>
         </w:rPr>
         <w:t>ใบติดตามใบเบิก</w:t>
       </w:r>
@@ -332,9 +432,11 @@
       </w:pPr>
       <w:r>
         <w:rPr>
-          <w:rFonts w:ascii="TH Sarabun PSK" w:hAnsi="TH Sarabun PSK" w:eastAsia="TH Sarabun PSK" w:cs="TH Sarabun PSK"/>
+          <w:rFonts w:ascii="TH Sarabun PSK" w:hAnsi="TH Sarabun PSK"/>
           <w:b w:val="0"/>
-          <w:sz w:val="24"/>
+          <w:i w:val="0"/>
+          <w:sz w:val="34"/>
+          <w:rFonts w:ascii="TH Sarabun PSK" w:hAnsi="TH Sarabun PSK" w:cs="TH Sarabun PSK"/>
         </w:rPr>
         <w:t>ที่…………………………………………….</w:t>
       </w:r>
@@ -345,9 +447,11 @@
       </w:pPr>
       <w:r>
         <w:rPr>
-          <w:rFonts w:ascii="TH Sarabun PSK" w:hAnsi="TH Sarabun PSK" w:eastAsia="TH Sarabun PSK" w:cs="TH Sarabun PSK"/>
+          <w:rFonts w:ascii="TH Sarabun PSK" w:hAnsi="TH Sarabun PSK"/>
           <w:b w:val="0"/>
-          <w:sz w:val="24"/>
+          <w:i w:val="0"/>
+          <w:sz w:val="34"/>
+          <w:rFonts w:ascii="TH Sarabun PSK" w:hAnsi="TH Sarabun PSK" w:cs="TH Sarabun PSK"/>
         </w:rPr>
         <w:t>เรื่อง      ขอทราบผลการเบิก สป.</w:t>
       </w:r>
@@ -358,9 +462,11 @@
       </w:pPr>
       <w:r>
         <w:rPr>
-          <w:rFonts w:ascii="TH Sarabun PSK" w:hAnsi="TH Sarabun PSK" w:eastAsia="TH Sarabun PSK" w:cs="TH Sarabun PSK"/>
+          <w:rFonts w:ascii="TH Sarabun PSK" w:hAnsi="TH Sarabun PSK"/>
           <w:b w:val="0"/>
-          <w:sz w:val="24"/>
+          <w:i w:val="0"/>
+          <w:sz w:val="34"/>
+          <w:rFonts w:ascii="TH Sarabun PSK" w:hAnsi="TH Sarabun PSK" w:cs="TH Sarabun PSK"/>
         </w:rPr>
         <w:t>ถึง   ป.พัน.๔</w:t>
       </w:r>
@@ -371,9 +477,11 @@
       </w:pPr>
       <w:r>
         <w:rPr>
-          <w:rFonts w:ascii="TH Sarabun PSK" w:hAnsi="TH Sarabun PSK" w:eastAsia="TH Sarabun PSK" w:cs="TH Sarabun PSK"/>
+          <w:rFonts w:ascii="TH Sarabun PSK" w:hAnsi="TH Sarabun PSK"/>
           <w:b w:val="0"/>
-          <w:sz w:val="24"/>
+          <w:i w:val="0"/>
+          <w:sz w:val="34"/>
+          <w:rFonts w:ascii="TH Sarabun PSK" w:hAnsi="TH Sarabun PSK" w:cs="TH Sarabun PSK"/>
         </w:rPr>
         <w:t>จาก   ป.พัน.๔ ร้อย.๒</w:t>
       </w:r>
@@ -384,9 +492,11 @@
       </w:pPr>
       <w:r>
         <w:rPr>
-          <w:rFonts w:ascii="TH Sarabun PSK" w:hAnsi="TH Sarabun PSK" w:eastAsia="TH Sarabun PSK" w:cs="TH Sarabun PSK"/>
+          <w:rFonts w:ascii="TH Sarabun PSK" w:hAnsi="TH Sarabun PSK"/>
           <w:b w:val="0"/>
-          <w:sz w:val="24"/>
+          <w:i w:val="0"/>
+          <w:sz w:val="34"/>
+          <w:rFonts w:ascii="TH Sarabun PSK" w:hAnsi="TH Sarabun PSK" w:cs="TH Sarabun PSK"/>
         </w:rPr>
         <w:t xml:space="preserve">        กรุณาดำเนินการตรวจสอบใบเบิกข้างล่างนี้ ซึ่งหน่วยได้ส่งใบเบิก และได้ติดตาม ครั้งที่ ๑ ไว้เรียบร้อยแล้ว</w:t>
       </w:r>
@@ -409,12 +519,12 @@
       <w:tr>
         <w:tc>
           <w:tcPr>
-            <w:tcW w:type="dxa" w:w="864"/>
+            <w:tcW w:type="dxa" w:w="720"/>
             <w:tcBorders>
-              <w:top w:val="single" w:color="000000" w:sz="4"/>
-              <w:left w:val="single" w:color="000000" w:sz="4"/>
-              <w:bottom w:val="single" w:color="000000" w:sz="4"/>
-              <w:right w:val="single" w:color="000000" w:sz="4"/>
+              <w:top w:val="single" w:sz="4" w:color="000000"/>
+              <w:left w:val="single" w:sz="4" w:color="000000"/>
+              <w:bottom w:val="single" w:sz="4" w:color="000000"/>
+              <w:right w:val="single" w:sz="4" w:color="000000"/>
             </w:tcBorders>
           </w:tcPr>
           <w:p>
@@ -423,9 +533,11 @@
             </w:pPr>
             <w:r>
               <w:rPr>
-                <w:rFonts w:ascii="TH Sarabun PSK" w:hAnsi="TH Sarabun PSK" w:eastAsia="TH Sarabun PSK" w:cs="TH Sarabun PSK"/>
+                <w:rFonts w:ascii="TH Sarabun PSK" w:hAnsi="TH Sarabun PSK"/>
                 <w:b/>
-                <w:sz w:val="22"/>
+                <w:i w:val="0"/>
+                <w:sz w:val="27"/>
+                <w:rFonts w:ascii="TH Sarabun PSK" w:hAnsi="TH Sarabun PSK" w:cs="TH Sarabun PSK"/>
               </w:rPr>
               <w:t>ลำดับ</w:t>
             </w:r>
@@ -433,12 +545,12 @@
         </w:tc>
         <w:tc>
           <w:tcPr>
-            <w:tcW w:type="dxa" w:w="4032"/>
+            <w:tcW w:type="dxa" w:w="3312"/>
             <w:tcBorders>
-              <w:top w:val="single" w:color="000000" w:sz="4"/>
-              <w:left w:val="single" w:color="000000" w:sz="4"/>
-              <w:bottom w:val="single" w:color="000000" w:sz="4"/>
-              <w:right w:val="single" w:color="000000" w:sz="4"/>
+              <w:top w:val="single" w:sz="4" w:color="000000"/>
+              <w:left w:val="single" w:sz="4" w:color="000000"/>
+              <w:bottom w:val="single" w:sz="4" w:color="000000"/>
+              <w:right w:val="single" w:sz="4" w:color="000000"/>
             </w:tcBorders>
           </w:tcPr>
           <w:p>
@@ -447,9 +559,11 @@
             </w:pPr>
             <w:r>
               <w:rPr>
-                <w:rFonts w:ascii="TH Sarabun PSK" w:hAnsi="TH Sarabun PSK" w:eastAsia="TH Sarabun PSK" w:cs="TH Sarabun PSK"/>
+                <w:rFonts w:ascii="TH Sarabun PSK" w:hAnsi="TH Sarabun PSK"/>
                 <w:b/>
-                <w:sz w:val="22"/>
+                <w:i w:val="0"/>
+                <w:sz w:val="27"/>
+                <w:rFonts w:ascii="TH Sarabun PSK" w:hAnsi="TH Sarabun PSK" w:cs="TH Sarabun PSK"/>
               </w:rPr>
               <w:t>รายการ สป.</w:t>
             </w:r>
@@ -457,12 +571,12 @@
         </w:tc>
         <w:tc>
           <w:tcPr>
-            <w:tcW w:type="dxa" w:w="3456"/>
+            <w:tcW w:type="dxa" w:w="2880"/>
             <w:tcBorders>
-              <w:top w:val="single" w:color="000000" w:sz="4"/>
-              <w:left w:val="single" w:color="000000" w:sz="4"/>
-              <w:bottom w:val="single" w:color="000000" w:sz="4"/>
-              <w:right w:val="single" w:color="000000" w:sz="4"/>
+              <w:top w:val="single" w:sz="4" w:color="000000"/>
+              <w:left w:val="single" w:sz="4" w:color="000000"/>
+              <w:bottom w:val="single" w:sz="4" w:color="000000"/>
+              <w:right w:val="single" w:sz="4" w:color="000000"/>
             </w:tcBorders>
           </w:tcPr>
           <w:p>
@@ -471,9 +585,11 @@
             </w:pPr>
             <w:r>
               <w:rPr>
-                <w:rFonts w:ascii="TH Sarabun PSK" w:hAnsi="TH Sarabun PSK" w:eastAsia="TH Sarabun PSK" w:cs="TH Sarabun PSK"/>
+                <w:rFonts w:ascii="TH Sarabun PSK" w:hAnsi="TH Sarabun PSK"/>
                 <w:b/>
-                <w:sz w:val="22"/>
+                <w:i w:val="0"/>
+                <w:sz w:val="27"/>
+                <w:rFonts w:ascii="TH Sarabun PSK" w:hAnsi="TH Sarabun PSK" w:cs="TH Sarabun PSK"/>
               </w:rPr>
               <w:t>หมายเลข สป.</w:t>
             </w:r>
@@ -481,12 +597,12 @@
         </w:tc>
         <w:tc>
           <w:tcPr>
-            <w:tcW w:type="dxa" w:w="2592"/>
+            <w:tcW w:type="dxa" w:w="3600"/>
             <w:tcBorders>
-              <w:top w:val="single" w:color="000000" w:sz="4"/>
-              <w:left w:val="single" w:color="000000" w:sz="4"/>
-              <w:bottom w:val="single" w:color="000000" w:sz="4"/>
-              <w:right w:val="single" w:color="000000" w:sz="4"/>
+              <w:top w:val="single" w:sz="4" w:color="000000"/>
+              <w:left w:val="single" w:sz="4" w:color="000000"/>
+              <w:bottom w:val="single" w:sz="4" w:color="000000"/>
+              <w:right w:val="single" w:sz="4" w:color="000000"/>
             </w:tcBorders>
           </w:tcPr>
           <w:p>
@@ -495,24 +611,24 @@
             </w:pPr>
             <w:r>
               <w:rPr>
-                <w:rFonts w:ascii="TH Sarabun PSK" w:hAnsi="TH Sarabun PSK" w:eastAsia="TH Sarabun PSK" w:cs="TH Sarabun PSK"/>
+                <w:rFonts w:ascii="TH Sarabun PSK" w:hAnsi="TH Sarabun PSK"/>
                 <w:b/>
-                <w:sz w:val="22"/>
+                <w:i w:val="0"/>
+                <w:sz w:val="27"/>
+                <w:rFonts w:ascii="TH Sarabun PSK" w:hAnsi="TH Sarabun PSK" w:cs="TH Sarabun PSK"/>
               </w:rPr>
-              <w:t>ที่ใบเบิก ที่ทะเบียนหน่วย</w:t>
-              <w:br/>
-              <w:t>จ่าย</w:t>
+              <w:t>ที่ใบเบิก ที่ทะเบียนหน่วยจ่าย</w:t>
             </w:r>
           </w:p>
         </w:tc>
         <w:tc>
           <w:tcPr>
-            <w:tcW w:type="dxa" w:w="2160"/>
+            <w:tcW w:type="dxa" w:w="2592"/>
             <w:tcBorders>
-              <w:top w:val="single" w:color="000000" w:sz="4"/>
-              <w:left w:val="single" w:color="000000" w:sz="4"/>
-              <w:bottom w:val="single" w:color="000000" w:sz="4"/>
-              <w:right w:val="single" w:color="000000" w:sz="4"/>
+              <w:top w:val="single" w:sz="4" w:color="000000"/>
+              <w:left w:val="single" w:sz="4" w:color="000000"/>
+              <w:bottom w:val="single" w:sz="4" w:color="000000"/>
+              <w:right w:val="single" w:sz="4" w:color="000000"/>
             </w:tcBorders>
           </w:tcPr>
           <w:p>
@@ -521,9 +637,11 @@
             </w:pPr>
             <w:r>
               <w:rPr>
-                <w:rFonts w:ascii="TH Sarabun PSK" w:hAnsi="TH Sarabun PSK" w:eastAsia="TH Sarabun PSK" w:cs="TH Sarabun PSK"/>
+                <w:rFonts w:ascii="TH Sarabun PSK" w:hAnsi="TH Sarabun PSK"/>
                 <w:b/>
-                <w:sz w:val="22"/>
+                <w:i w:val="0"/>
+                <w:sz w:val="27"/>
+                <w:rFonts w:ascii="TH Sarabun PSK" w:hAnsi="TH Sarabun PSK" w:cs="TH Sarabun PSK"/>
               </w:rPr>
               <w:t>วันที่ส่งหรือวางใบเบิก</w:t>
             </w:r>
@@ -531,12 +649,12 @@
         </w:tc>
         <w:tc>
           <w:tcPr>
-            <w:tcW w:type="dxa" w:w="2304"/>
+            <w:tcW w:type="dxa" w:w="2592"/>
             <w:tcBorders>
-              <w:top w:val="single" w:color="000000" w:sz="4"/>
-              <w:left w:val="single" w:color="000000" w:sz="4"/>
-              <w:bottom w:val="single" w:color="000000" w:sz="4"/>
-              <w:right w:val="single" w:color="000000" w:sz="4"/>
+              <w:top w:val="single" w:sz="4" w:color="000000"/>
+              <w:left w:val="single" w:sz="4" w:color="000000"/>
+              <w:bottom w:val="single" w:sz="4" w:color="000000"/>
+              <w:right w:val="single" w:sz="4" w:color="000000"/>
             </w:tcBorders>
           </w:tcPr>
           <w:p>
@@ -545,9 +663,11 @@
             </w:pPr>
             <w:r>
               <w:rPr>
-                <w:rFonts w:ascii="TH Sarabun PSK" w:hAnsi="TH Sarabun PSK" w:eastAsia="TH Sarabun PSK" w:cs="TH Sarabun PSK"/>
+                <w:rFonts w:ascii="TH Sarabun PSK" w:hAnsi="TH Sarabun PSK"/>
                 <w:b/>
-                <w:sz w:val="22"/>
+                <w:i w:val="0"/>
+                <w:sz w:val="27"/>
+                <w:rFonts w:ascii="TH Sarabun PSK" w:hAnsi="TH Sarabun PSK" w:cs="TH Sarabun PSK"/>
               </w:rPr>
               <w:t>วันติดตามใบเบิกครั้งที่ ๒๐</w:t>
             </w:r>
@@ -555,12 +675,12 @@
         </w:tc>
         <w:tc>
           <w:tcPr>
-            <w:tcW w:type="dxa" w:w="2880"/>
+            <w:tcW w:type="dxa" w:w="2736"/>
             <w:tcBorders>
-              <w:top w:val="single" w:color="000000" w:sz="4"/>
-              <w:left w:val="single" w:color="000000" w:sz="4"/>
-              <w:bottom w:val="single" w:color="000000" w:sz="4"/>
-              <w:right w:val="single" w:color="000000" w:sz="4"/>
+              <w:top w:val="single" w:sz="4" w:color="000000"/>
+              <w:left w:val="single" w:sz="4" w:color="000000"/>
+              <w:bottom w:val="single" w:sz="4" w:color="000000"/>
+              <w:right w:val="single" w:sz="4" w:color="000000"/>
             </w:tcBorders>
           </w:tcPr>
           <w:p>
@@ -569,9 +689,11 @@
             </w:pPr>
             <w:r>
               <w:rPr>
-                <w:rFonts w:ascii="TH Sarabun PSK" w:hAnsi="TH Sarabun PSK" w:eastAsia="TH Sarabun PSK" w:cs="TH Sarabun PSK"/>
+                <w:rFonts w:ascii="TH Sarabun PSK" w:hAnsi="TH Sarabun PSK"/>
                 <w:b/>
-                <w:sz w:val="22"/>
+                <w:i w:val="0"/>
+                <w:sz w:val="27"/>
+                <w:rFonts w:ascii="TH Sarabun PSK" w:hAnsi="TH Sarabun PSK" w:cs="TH Sarabun PSK"/>
               </w:rPr>
               <w:t>หมายเหตุ (บันทึกโดยหน่วยจ่าย)</w:t>
             </w:r>
@@ -581,12 +703,12 @@
       <w:tr>
         <w:tc>
           <w:tcPr>
-            <w:tcW w:type="dxa" w:w="864"/>
+            <w:tcW w:type="dxa" w:w="720"/>
             <w:tcBorders>
-              <w:top w:val="single" w:color="000000" w:sz="4"/>
-              <w:left w:val="single" w:color="000000" w:sz="4"/>
-              <w:bottom w:val="single" w:color="000000" w:sz="4"/>
-              <w:right w:val="single" w:color="000000" w:sz="4"/>
+              <w:top w:val="single" w:sz="4" w:color="000000"/>
+              <w:left w:val="single" w:sz="4" w:color="000000"/>
+              <w:bottom w:val="single" w:sz="4" w:color="000000"/>
+              <w:right w:val="single" w:sz="4" w:color="000000"/>
             </w:tcBorders>
           </w:tcPr>
           <w:p>
@@ -595,9 +717,11 @@
             </w:pPr>
             <w:r>
               <w:rPr>
-                <w:rFonts w:ascii="TH Sarabun PSK" w:hAnsi="TH Sarabun PSK" w:eastAsia="TH Sarabun PSK" w:cs="TH Sarabun PSK"/>
+                <w:rFonts w:ascii="TH Sarabun PSK" w:hAnsi="TH Sarabun PSK"/>
                 <w:b w:val="0"/>
-                <w:sz w:val="22"/>
+                <w:i w:val="0"/>
+                <w:sz w:val="27"/>
+                <w:rFonts w:ascii="TH Sarabun PSK" w:hAnsi="TH Sarabun PSK" w:cs="TH Sarabun PSK"/>
               </w:rPr>
               <w:t>๑.</w:t>
             </w:r>
@@ -605,12 +729,12 @@
         </w:tc>
         <w:tc>
           <w:tcPr>
-            <w:tcW w:type="dxa" w:w="4032"/>
+            <w:tcW w:type="dxa" w:w="3312"/>
             <w:tcBorders>
-              <w:top w:val="single" w:color="000000" w:sz="4"/>
-              <w:left w:val="single" w:color="000000" w:sz="4"/>
-              <w:bottom w:val="single" w:color="000000" w:sz="4"/>
-              <w:right w:val="single" w:color="000000" w:sz="4"/>
+              <w:top w:val="single" w:sz="4" w:color="000000"/>
+              <w:left w:val="single" w:sz="4" w:color="000000"/>
+              <w:bottom w:val="single" w:sz="4" w:color="000000"/>
+              <w:right w:val="single" w:sz="4" w:color="000000"/>
             </w:tcBorders>
           </w:tcPr>
           <w:p>
@@ -619,9 +743,11 @@
             </w:pPr>
             <w:r>
               <w:rPr>
-                <w:rFonts w:ascii="TH Sarabun PSK" w:hAnsi="TH Sarabun PSK" w:eastAsia="TH Sarabun PSK" w:cs="TH Sarabun PSK"/>
+                <w:rFonts w:ascii="TH Sarabun PSK" w:hAnsi="TH Sarabun PSK"/>
                 <w:b w:val="0"/>
-                <w:sz w:val="22"/>
+                <w:i w:val="0"/>
+                <w:sz w:val="27"/>
+                <w:rFonts w:ascii="TH Sarabun PSK" w:hAnsi="TH Sarabun PSK" w:cs="TH Sarabun PSK"/>
               </w:rPr>
               <w:t>ด้ามแส้ท่อนกกและปลาย</w:t>
             </w:r>
@@ -629,12 +755,12 @@
         </w:tc>
         <w:tc>
           <w:tcPr>
-            <w:tcW w:type="dxa" w:w="3456"/>
+            <w:tcW w:type="dxa" w:w="2880"/>
             <w:tcBorders>
-              <w:top w:val="single" w:color="000000" w:sz="4"/>
-              <w:left w:val="single" w:color="000000" w:sz="4"/>
-              <w:bottom w:val="single" w:color="000000" w:sz="4"/>
-              <w:right w:val="single" w:color="000000" w:sz="4"/>
+              <w:top w:val="single" w:sz="4" w:color="000000"/>
+              <w:left w:val="single" w:sz="4" w:color="000000"/>
+              <w:bottom w:val="single" w:sz="4" w:color="000000"/>
+              <w:right w:val="single" w:sz="4" w:color="000000"/>
             </w:tcBorders>
           </w:tcPr>
           <w:p>
@@ -643,9 +769,11 @@
             </w:pPr>
             <w:r>
               <w:rPr>
-                <w:rFonts w:ascii="TH Sarabun PSK" w:hAnsi="TH Sarabun PSK" w:eastAsia="TH Sarabun PSK" w:cs="TH Sarabun PSK"/>
+                <w:rFonts w:ascii="TH Sarabun PSK" w:hAnsi="TH Sarabun PSK"/>
                 <w:b w:val="0"/>
-                <w:sz w:val="22"/>
+                <w:i w:val="0"/>
+                <w:sz w:val="27"/>
+                <w:rFonts w:ascii="TH Sarabun PSK" w:hAnsi="TH Sarabun PSK" w:cs="TH Sarabun PSK"/>
               </w:rPr>
               <w:t>B ๙๗๒๔๒ - B ๑๙๗๒๔๒</w:t>
             </w:r>
@@ -653,12 +781,12 @@
         </w:tc>
         <w:tc>
           <w:tcPr>
-            <w:tcW w:type="dxa" w:w="2592"/>
+            <w:tcW w:type="dxa" w:w="3600"/>
             <w:tcBorders>
-              <w:top w:val="single" w:color="000000" w:sz="4"/>
-              <w:left w:val="single" w:color="000000" w:sz="4"/>
-              <w:bottom w:val="single" w:color="000000" w:sz="4"/>
-              <w:right w:val="single" w:color="000000" w:sz="4"/>
+              <w:top w:val="single" w:sz="4" w:color="000000"/>
+              <w:left w:val="single" w:sz="4" w:color="000000"/>
+              <w:bottom w:val="single" w:sz="4" w:color="000000"/>
+              <w:right w:val="single" w:sz="4" w:color="000000"/>
             </w:tcBorders>
           </w:tcPr>
           <w:p>
@@ -667,9 +795,11 @@
             </w:pPr>
             <w:r>
               <w:rPr>
-                <w:rFonts w:ascii="TH Sarabun PSK" w:hAnsi="TH Sarabun PSK" w:eastAsia="TH Sarabun PSK" w:cs="TH Sarabun PSK"/>
+                <w:rFonts w:ascii="TH Sarabun PSK" w:hAnsi="TH Sarabun PSK"/>
                 <w:b w:val="0"/>
-                <w:sz w:val="22"/>
+                <w:i w:val="0"/>
+                <w:sz w:val="27"/>
+                <w:rFonts w:ascii="TH Sarabun PSK" w:hAnsi="TH Sarabun PSK" w:cs="TH Sarabun PSK"/>
               </w:rPr>
               <w:t>๕๐ / ๔๗</w:t>
             </w:r>
@@ -677,12 +807,12 @@
         </w:tc>
         <w:tc>
           <w:tcPr>
-            <w:tcW w:type="dxa" w:w="2160"/>
+            <w:tcW w:type="dxa" w:w="2592"/>
             <w:tcBorders>
-              <w:top w:val="single" w:color="000000" w:sz="4"/>
-              <w:left w:val="single" w:color="000000" w:sz="4"/>
-              <w:bottom w:val="single" w:color="000000" w:sz="4"/>
-              <w:right w:val="single" w:color="000000" w:sz="4"/>
+              <w:top w:val="single" w:sz="4" w:color="000000"/>
+              <w:left w:val="single" w:sz="4" w:color="000000"/>
+              <w:bottom w:val="single" w:sz="4" w:color="000000"/>
+              <w:right w:val="single" w:sz="4" w:color="000000"/>
             </w:tcBorders>
           </w:tcPr>
           <w:p>
@@ -691,9 +821,11 @@
             </w:pPr>
             <w:r>
               <w:rPr>
-                <w:rFonts w:ascii="TH Sarabun PSK" w:hAnsi="TH Sarabun PSK" w:eastAsia="TH Sarabun PSK" w:cs="TH Sarabun PSK"/>
+                <w:rFonts w:ascii="TH Sarabun PSK" w:hAnsi="TH Sarabun PSK"/>
                 <w:b w:val="0"/>
-                <w:sz w:val="22"/>
+                <w:i w:val="0"/>
+                <w:sz w:val="27"/>
+                <w:rFonts w:ascii="TH Sarabun PSK" w:hAnsi="TH Sarabun PSK" w:cs="TH Sarabun PSK"/>
               </w:rPr>
               <w:t>๒๐ ก.พ. ๔๗</w:t>
             </w:r>
@@ -701,12 +833,12 @@
         </w:tc>
         <w:tc>
           <w:tcPr>
-            <w:tcW w:type="dxa" w:w="2304"/>
+            <w:tcW w:type="dxa" w:w="2592"/>
             <w:tcBorders>
-              <w:top w:val="single" w:color="000000" w:sz="4"/>
-              <w:left w:val="single" w:color="000000" w:sz="4"/>
-              <w:bottom w:val="single" w:color="000000" w:sz="4"/>
-              <w:right w:val="single" w:color="000000" w:sz="4"/>
+              <w:top w:val="single" w:sz="4" w:color="000000"/>
+              <w:left w:val="single" w:sz="4" w:color="000000"/>
+              <w:bottom w:val="single" w:sz="4" w:color="000000"/>
+              <w:right w:val="single" w:sz="4" w:color="000000"/>
             </w:tcBorders>
           </w:tcPr>
           <w:p>
@@ -715,9 +847,11 @@
             </w:pPr>
             <w:r>
               <w:rPr>
-                <w:rFonts w:ascii="TH Sarabun PSK" w:hAnsi="TH Sarabun PSK" w:eastAsia="TH Sarabun PSK" w:cs="TH Sarabun PSK"/>
+                <w:rFonts w:ascii="TH Sarabun PSK" w:hAnsi="TH Sarabun PSK"/>
                 <w:b w:val="0"/>
-                <w:sz w:val="22"/>
+                <w:i w:val="0"/>
+                <w:sz w:val="27"/>
+                <w:rFonts w:ascii="TH Sarabun PSK" w:hAnsi="TH Sarabun PSK" w:cs="TH Sarabun PSK"/>
               </w:rPr>
               <w:t>๑ มิ.ย. ๕๔</w:t>
             </w:r>
@@ -725,12 +859,12 @@
         </w:tc>
         <w:tc>
           <w:tcPr>
-            <w:tcW w:type="dxa" w:w="2880"/>
+            <w:tcW w:type="dxa" w:w="2736"/>
             <w:tcBorders>
-              <w:top w:val="single" w:color="000000" w:sz="4"/>
-              <w:left w:val="single" w:color="000000" w:sz="4"/>
-              <w:bottom w:val="single" w:color="000000" w:sz="4"/>
-              <w:right w:val="single" w:color="000000" w:sz="4"/>
+              <w:top w:val="single" w:sz="4" w:color="000000"/>
+              <w:left w:val="single" w:sz="4" w:color="000000"/>
+              <w:bottom w:val="single" w:sz="4" w:color="000000"/>
+              <w:right w:val="single" w:sz="4" w:color="000000"/>
             </w:tcBorders>
           </w:tcPr>
           <w:p>
@@ -739,9 +873,11 @@
             </w:pPr>
             <w:r>
               <w:rPr>
-                <w:rFonts w:ascii="TH Sarabun PSK" w:hAnsi="TH Sarabun PSK" w:eastAsia="TH Sarabun PSK" w:cs="TH Sarabun PSK"/>
+                <w:rFonts w:ascii="TH Sarabun PSK" w:hAnsi="TH Sarabun PSK"/>
                 <w:b w:val="0"/>
-                <w:sz w:val="22"/>
+                <w:i w:val="0"/>
+                <w:sz w:val="27"/>
+                <w:rFonts w:ascii="TH Sarabun PSK" w:hAnsi="TH Sarabun PSK" w:cs="TH Sarabun PSK"/>
               </w:rPr>
             </w:r>
           </w:p>
@@ -750,12 +886,12 @@
       <w:tr>
         <w:tc>
           <w:tcPr>
-            <w:tcW w:type="dxa" w:w="864"/>
+            <w:tcW w:type="dxa" w:w="720"/>
             <w:tcBorders>
-              <w:top w:val="single" w:color="000000" w:sz="4"/>
-              <w:left w:val="single" w:color="000000" w:sz="4"/>
-              <w:bottom w:val="single" w:color="000000" w:sz="4"/>
-              <w:right w:val="single" w:color="000000" w:sz="4"/>
+              <w:top w:val="single" w:sz="4" w:color="000000"/>
+              <w:left w:val="single" w:sz="4" w:color="000000"/>
+              <w:bottom w:val="single" w:sz="4" w:color="000000"/>
+              <w:right w:val="single" w:sz="4" w:color="000000"/>
             </w:tcBorders>
           </w:tcPr>
           <w:p>
@@ -764,9 +900,11 @@
             </w:pPr>
             <w:r>
               <w:rPr>
-                <w:rFonts w:ascii="TH Sarabun PSK" w:hAnsi="TH Sarabun PSK" w:eastAsia="TH Sarabun PSK" w:cs="TH Sarabun PSK"/>
+                <w:rFonts w:ascii="TH Sarabun PSK" w:hAnsi="TH Sarabun PSK"/>
                 <w:b w:val="0"/>
-                <w:sz w:val="22"/>
+                <w:i w:val="0"/>
+                <w:sz w:val="27"/>
+                <w:rFonts w:ascii="TH Sarabun PSK" w:hAnsi="TH Sarabun PSK" w:cs="TH Sarabun PSK"/>
               </w:rPr>
               <w:t>๒.</w:t>
             </w:r>
@@ -774,12 +912,12 @@
         </w:tc>
         <w:tc>
           <w:tcPr>
-            <w:tcW w:type="dxa" w:w="4032"/>
+            <w:tcW w:type="dxa" w:w="3312"/>
             <w:tcBorders>
-              <w:top w:val="single" w:color="000000" w:sz="4"/>
-              <w:left w:val="single" w:color="000000" w:sz="4"/>
-              <w:bottom w:val="single" w:color="000000" w:sz="4"/>
-              <w:right w:val="single" w:color="000000" w:sz="4"/>
+              <w:top w:val="single" w:sz="4" w:color="000000"/>
+              <w:left w:val="single" w:sz="4" w:color="000000"/>
+              <w:bottom w:val="single" w:sz="4" w:color="000000"/>
+              <w:right w:val="single" w:sz="4" w:color="000000"/>
             </w:tcBorders>
           </w:tcPr>
           <w:p>
@@ -788,9 +926,11 @@
             </w:pPr>
             <w:r>
               <w:rPr>
-                <w:rFonts w:ascii="TH Sarabun PSK" w:hAnsi="TH Sarabun PSK" w:eastAsia="TH Sarabun PSK" w:cs="TH Sarabun PSK"/>
+                <w:rFonts w:ascii="TH Sarabun PSK" w:hAnsi="TH Sarabun PSK"/>
                 <w:b w:val="0"/>
-                <w:sz w:val="22"/>
+                <w:i w:val="0"/>
+                <w:sz w:val="27"/>
+                <w:rFonts w:ascii="TH Sarabun PSK" w:hAnsi="TH Sarabun PSK" w:cs="TH Sarabun PSK"/>
               </w:rPr>
               <w:t>ไฟหลักเล็ง อันใกล้อันไกล</w:t>
             </w:r>
@@ -798,12 +938,12 @@
         </w:tc>
         <w:tc>
           <w:tcPr>
-            <w:tcW w:type="dxa" w:w="3456"/>
+            <w:tcW w:type="dxa" w:w="2880"/>
             <w:tcBorders>
-              <w:top w:val="single" w:color="000000" w:sz="4"/>
-              <w:left w:val="single" w:color="000000" w:sz="4"/>
-              <w:bottom w:val="single" w:color="000000" w:sz="4"/>
-              <w:right w:val="single" w:color="000000" w:sz="4"/>
+              <w:top w:val="single" w:sz="4" w:color="000000"/>
+              <w:left w:val="single" w:sz="4" w:color="000000"/>
+              <w:bottom w:val="single" w:sz="4" w:color="000000"/>
+              <w:right w:val="single" w:sz="4" w:color="000000"/>
             </w:tcBorders>
           </w:tcPr>
           <w:p>
@@ -812,9 +952,11 @@
             </w:pPr>
             <w:r>
               <w:rPr>
-                <w:rFonts w:ascii="TH Sarabun PSK" w:hAnsi="TH Sarabun PSK" w:eastAsia="TH Sarabun PSK" w:cs="TH Sarabun PSK"/>
+                <w:rFonts w:ascii="TH Sarabun PSK" w:hAnsi="TH Sarabun PSK"/>
                 <w:b w:val="0"/>
-                <w:sz w:val="22"/>
+                <w:i w:val="0"/>
+                <w:sz w:val="27"/>
+                <w:rFonts w:ascii="TH Sarabun PSK" w:hAnsi="TH Sarabun PSK" w:cs="TH Sarabun PSK"/>
               </w:rPr>
               <w:t>๑๒๙๐ – ๕๓๕ – ๗๖๒๙</w:t>
             </w:r>
@@ -822,12 +964,12 @@
         </w:tc>
         <w:tc>
           <w:tcPr>
-            <w:tcW w:type="dxa" w:w="2592"/>
+            <w:tcW w:type="dxa" w:w="3600"/>
             <w:tcBorders>
-              <w:top w:val="single" w:color="000000" w:sz="4"/>
-              <w:left w:val="single" w:color="000000" w:sz="4"/>
-              <w:bottom w:val="single" w:color="000000" w:sz="4"/>
-              <w:right w:val="single" w:color="000000" w:sz="4"/>
+              <w:top w:val="single" w:sz="4" w:color="000000"/>
+              <w:left w:val="single" w:sz="4" w:color="000000"/>
+              <w:bottom w:val="single" w:sz="4" w:color="000000"/>
+              <w:right w:val="single" w:sz="4" w:color="000000"/>
             </w:tcBorders>
           </w:tcPr>
           <w:p>
@@ -836,9 +978,11 @@
             </w:pPr>
             <w:r>
               <w:rPr>
-                <w:rFonts w:ascii="TH Sarabun PSK" w:hAnsi="TH Sarabun PSK" w:eastAsia="TH Sarabun PSK" w:cs="TH Sarabun PSK"/>
+                <w:rFonts w:ascii="TH Sarabun PSK" w:hAnsi="TH Sarabun PSK"/>
                 <w:b w:val="0"/>
-                <w:sz w:val="22"/>
+                <w:i w:val="0"/>
+                <w:sz w:val="27"/>
+                <w:rFonts w:ascii="TH Sarabun PSK" w:hAnsi="TH Sarabun PSK" w:cs="TH Sarabun PSK"/>
               </w:rPr>
               <w:t>๕๑ / ๔๗</w:t>
             </w:r>
@@ -846,12 +990,12 @@
         </w:tc>
         <w:tc>
           <w:tcPr>
-            <w:tcW w:type="dxa" w:w="2160"/>
+            <w:tcW w:type="dxa" w:w="2592"/>
             <w:tcBorders>
-              <w:top w:val="single" w:color="000000" w:sz="4"/>
-              <w:left w:val="single" w:color="000000" w:sz="4"/>
-              <w:bottom w:val="single" w:color="000000" w:sz="4"/>
-              <w:right w:val="single" w:color="000000" w:sz="4"/>
+              <w:top w:val="single" w:sz="4" w:color="000000"/>
+              <w:left w:val="single" w:sz="4" w:color="000000"/>
+              <w:bottom w:val="single" w:sz="4" w:color="000000"/>
+              <w:right w:val="single" w:sz="4" w:color="000000"/>
             </w:tcBorders>
           </w:tcPr>
           <w:p>
@@ -860,9 +1004,11 @@
             </w:pPr>
             <w:r>
               <w:rPr>
-                <w:rFonts w:ascii="TH Sarabun PSK" w:hAnsi="TH Sarabun PSK" w:eastAsia="TH Sarabun PSK" w:cs="TH Sarabun PSK"/>
+                <w:rFonts w:ascii="TH Sarabun PSK" w:hAnsi="TH Sarabun PSK"/>
                 <w:b w:val="0"/>
-                <w:sz w:val="22"/>
+                <w:i w:val="0"/>
+                <w:sz w:val="27"/>
+                <w:rFonts w:ascii="TH Sarabun PSK" w:hAnsi="TH Sarabun PSK" w:cs="TH Sarabun PSK"/>
               </w:rPr>
               <w:t>๒๐ ก.พ. ๔๗</w:t>
             </w:r>
@@ -870,12 +1016,12 @@
         </w:tc>
         <w:tc>
           <w:tcPr>
-            <w:tcW w:type="dxa" w:w="2304"/>
+            <w:tcW w:type="dxa" w:w="2592"/>
             <w:tcBorders>
-              <w:top w:val="single" w:color="000000" w:sz="4"/>
-              <w:left w:val="single" w:color="000000" w:sz="4"/>
-              <w:bottom w:val="single" w:color="000000" w:sz="4"/>
-              <w:right w:val="single" w:color="000000" w:sz="4"/>
+              <w:top w:val="single" w:sz="4" w:color="000000"/>
+              <w:left w:val="single" w:sz="4" w:color="000000"/>
+              <w:bottom w:val="single" w:sz="4" w:color="000000"/>
+              <w:right w:val="single" w:sz="4" w:color="000000"/>
             </w:tcBorders>
           </w:tcPr>
           <w:p>
@@ -884,9 +1030,11 @@
             </w:pPr>
             <w:r>
               <w:rPr>
-                <w:rFonts w:ascii="TH Sarabun PSK" w:hAnsi="TH Sarabun PSK" w:eastAsia="TH Sarabun PSK" w:cs="TH Sarabun PSK"/>
+                <w:rFonts w:ascii="TH Sarabun PSK" w:hAnsi="TH Sarabun PSK"/>
                 <w:b w:val="0"/>
-                <w:sz w:val="22"/>
+                <w:i w:val="0"/>
+                <w:sz w:val="27"/>
+                <w:rFonts w:ascii="TH Sarabun PSK" w:hAnsi="TH Sarabun PSK" w:cs="TH Sarabun PSK"/>
               </w:rPr>
               <w:t>๑ มิ.ย. ๕๔</w:t>
             </w:r>
@@ -894,12 +1042,12 @@
         </w:tc>
         <w:tc>
           <w:tcPr>
-            <w:tcW w:type="dxa" w:w="2880"/>
+            <w:tcW w:type="dxa" w:w="2736"/>
             <w:tcBorders>
-              <w:top w:val="single" w:color="000000" w:sz="4"/>
-              <w:left w:val="single" w:color="000000" w:sz="4"/>
-              <w:bottom w:val="single" w:color="000000" w:sz="4"/>
-              <w:right w:val="single" w:color="000000" w:sz="4"/>
+              <w:top w:val="single" w:sz="4" w:color="000000"/>
+              <w:left w:val="single" w:sz="4" w:color="000000"/>
+              <w:bottom w:val="single" w:sz="4" w:color="000000"/>
+              <w:right w:val="single" w:sz="4" w:color="000000"/>
             </w:tcBorders>
           </w:tcPr>
           <w:p>
@@ -908,9 +1056,11 @@
             </w:pPr>
             <w:r>
               <w:rPr>
-                <w:rFonts w:ascii="TH Sarabun PSK" w:hAnsi="TH Sarabun PSK" w:eastAsia="TH Sarabun PSK" w:cs="TH Sarabun PSK"/>
+                <w:rFonts w:ascii="TH Sarabun PSK" w:hAnsi="TH Sarabun PSK"/>
                 <w:b w:val="0"/>
-                <w:sz w:val="22"/>
+                <w:i w:val="0"/>
+                <w:sz w:val="27"/>
+                <w:rFonts w:ascii="TH Sarabun PSK" w:hAnsi="TH Sarabun PSK" w:cs="TH Sarabun PSK"/>
               </w:rPr>
             </w:r>
           </w:p>
@@ -919,12 +1069,12 @@
       <w:tr>
         <w:tc>
           <w:tcPr>
-            <w:tcW w:type="dxa" w:w="864"/>
+            <w:tcW w:type="dxa" w:w="720"/>
             <w:tcBorders>
-              <w:top w:val="single" w:color="000000" w:sz="4"/>
-              <w:left w:val="single" w:color="000000" w:sz="4"/>
-              <w:bottom w:val="single" w:color="000000" w:sz="4"/>
-              <w:right w:val="single" w:color="000000" w:sz="4"/>
+              <w:top w:val="single" w:sz="4" w:color="000000"/>
+              <w:left w:val="single" w:sz="4" w:color="000000"/>
+              <w:bottom w:val="single" w:sz="4" w:color="000000"/>
+              <w:right w:val="single" w:sz="4" w:color="000000"/>
             </w:tcBorders>
           </w:tcPr>
           <w:p>
@@ -933,9 +1083,11 @@
             </w:pPr>
             <w:r>
               <w:rPr>
-                <w:rFonts w:ascii="TH Sarabun PSK" w:hAnsi="TH Sarabun PSK" w:eastAsia="TH Sarabun PSK" w:cs="TH Sarabun PSK"/>
+                <w:rFonts w:ascii="TH Sarabun PSK" w:hAnsi="TH Sarabun PSK"/>
                 <w:b w:val="0"/>
-                <w:sz w:val="22"/>
+                <w:i w:val="0"/>
+                <w:sz w:val="27"/>
+                <w:rFonts w:ascii="TH Sarabun PSK" w:hAnsi="TH Sarabun PSK" w:cs="TH Sarabun PSK"/>
               </w:rPr>
               <w:t>๓.</w:t>
             </w:r>
@@ -943,12 +1095,12 @@
         </w:tc>
         <w:tc>
           <w:tcPr>
-            <w:tcW w:type="dxa" w:w="4032"/>
+            <w:tcW w:type="dxa" w:w="3312"/>
             <w:tcBorders>
-              <w:top w:val="single" w:color="000000" w:sz="4"/>
-              <w:left w:val="single" w:color="000000" w:sz="4"/>
-              <w:bottom w:val="single" w:color="000000" w:sz="4"/>
-              <w:right w:val="single" w:color="000000" w:sz="4"/>
+              <w:top w:val="single" w:sz="4" w:color="000000"/>
+              <w:left w:val="single" w:sz="4" w:color="000000"/>
+              <w:bottom w:val="single" w:sz="4" w:color="000000"/>
+              <w:right w:val="single" w:sz="4" w:color="000000"/>
             </w:tcBorders>
           </w:tcPr>
           <w:p>
@@ -957,9 +1109,11 @@
             </w:pPr>
             <w:r>
               <w:rPr>
-                <w:rFonts w:ascii="TH Sarabun PSK" w:hAnsi="TH Sarabun PSK" w:eastAsia="TH Sarabun PSK" w:cs="TH Sarabun PSK"/>
+                <w:rFonts w:ascii="TH Sarabun PSK" w:hAnsi="TH Sarabun PSK"/>
                 <w:b w:val="0"/>
-                <w:sz w:val="22"/>
+                <w:i w:val="0"/>
+                <w:sz w:val="27"/>
+                <w:rFonts w:ascii="TH Sarabun PSK" w:hAnsi="TH Sarabun PSK" w:cs="TH Sarabun PSK"/>
               </w:rPr>
               <w:t>ซองหนังเครื่องตั้งมุมยิงประณีต</w:t>
             </w:r>
@@ -967,12 +1121,12 @@
         </w:tc>
         <w:tc>
           <w:tcPr>
-            <w:tcW w:type="dxa" w:w="3456"/>
+            <w:tcW w:type="dxa" w:w="2880"/>
             <w:tcBorders>
-              <w:top w:val="single" w:color="000000" w:sz="4"/>
-              <w:left w:val="single" w:color="000000" w:sz="4"/>
-              <w:bottom w:val="single" w:color="000000" w:sz="4"/>
-              <w:right w:val="single" w:color="000000" w:sz="4"/>
+              <w:top w:val="single" w:sz="4" w:color="000000"/>
+              <w:left w:val="single" w:sz="4" w:color="000000"/>
+              <w:bottom w:val="single" w:sz="4" w:color="000000"/>
+              <w:right w:val="single" w:sz="4" w:color="000000"/>
             </w:tcBorders>
           </w:tcPr>
           <w:p>
@@ -981,9 +1135,11 @@
             </w:pPr>
             <w:r>
               <w:rPr>
-                <w:rFonts w:ascii="TH Sarabun PSK" w:hAnsi="TH Sarabun PSK" w:eastAsia="TH Sarabun PSK" w:cs="TH Sarabun PSK"/>
+                <w:rFonts w:ascii="TH Sarabun PSK" w:hAnsi="TH Sarabun PSK"/>
                 <w:b w:val="0"/>
-                <w:sz w:val="22"/>
+                <w:i w:val="0"/>
+                <w:sz w:val="27"/>
+                <w:rFonts w:ascii="TH Sarabun PSK" w:hAnsi="TH Sarabun PSK" w:cs="TH Sarabun PSK"/>
               </w:rPr>
               <w:t>๑๒๙๐ – ๘๙๑ – ๙๙๙๙</w:t>
             </w:r>
@@ -991,12 +1147,12 @@
         </w:tc>
         <w:tc>
           <w:tcPr>
-            <w:tcW w:type="dxa" w:w="2592"/>
+            <w:tcW w:type="dxa" w:w="3600"/>
             <w:tcBorders>
-              <w:top w:val="single" w:color="000000" w:sz="4"/>
-              <w:left w:val="single" w:color="000000" w:sz="4"/>
-              <w:bottom w:val="single" w:color="000000" w:sz="4"/>
-              <w:right w:val="single" w:color="000000" w:sz="4"/>
+              <w:top w:val="single" w:sz="4" w:color="000000"/>
+              <w:left w:val="single" w:sz="4" w:color="000000"/>
+              <w:bottom w:val="single" w:sz="4" w:color="000000"/>
+              <w:right w:val="single" w:sz="4" w:color="000000"/>
             </w:tcBorders>
           </w:tcPr>
           <w:p>
@@ -1005,9 +1161,11 @@
             </w:pPr>
             <w:r>
               <w:rPr>
-                <w:rFonts w:ascii="TH Sarabun PSK" w:hAnsi="TH Sarabun PSK" w:eastAsia="TH Sarabun PSK" w:cs="TH Sarabun PSK"/>
+                <w:rFonts w:ascii="TH Sarabun PSK" w:hAnsi="TH Sarabun PSK"/>
                 <w:b w:val="0"/>
-                <w:sz w:val="22"/>
+                <w:i w:val="0"/>
+                <w:sz w:val="27"/>
+                <w:rFonts w:ascii="TH Sarabun PSK" w:hAnsi="TH Sarabun PSK" w:cs="TH Sarabun PSK"/>
               </w:rPr>
               <w:t>๕๓ / ๔๗</w:t>
             </w:r>
@@ -1015,12 +1173,12 @@
         </w:tc>
         <w:tc>
           <w:tcPr>
-            <w:tcW w:type="dxa" w:w="2160"/>
+            <w:tcW w:type="dxa" w:w="2592"/>
             <w:tcBorders>
-              <w:top w:val="single" w:color="000000" w:sz="4"/>
-              <w:left w:val="single" w:color="000000" w:sz="4"/>
-              <w:bottom w:val="single" w:color="000000" w:sz="4"/>
-              <w:right w:val="single" w:color="000000" w:sz="4"/>
+              <w:top w:val="single" w:sz="4" w:color="000000"/>
+              <w:left w:val="single" w:sz="4" w:color="000000"/>
+              <w:bottom w:val="single" w:sz="4" w:color="000000"/>
+              <w:right w:val="single" w:sz="4" w:color="000000"/>
             </w:tcBorders>
           </w:tcPr>
           <w:p>
@@ -1029,9 +1187,11 @@
             </w:pPr>
             <w:r>
               <w:rPr>
-                <w:rFonts w:ascii="TH Sarabun PSK" w:hAnsi="TH Sarabun PSK" w:eastAsia="TH Sarabun PSK" w:cs="TH Sarabun PSK"/>
+                <w:rFonts w:ascii="TH Sarabun PSK" w:hAnsi="TH Sarabun PSK"/>
                 <w:b w:val="0"/>
-                <w:sz w:val="22"/>
+                <w:i w:val="0"/>
+                <w:sz w:val="27"/>
+                <w:rFonts w:ascii="TH Sarabun PSK" w:hAnsi="TH Sarabun PSK" w:cs="TH Sarabun PSK"/>
               </w:rPr>
               <w:t>๒๐ ก.พ. ๔๗</w:t>
             </w:r>
@@ -1039,12 +1199,12 @@
         </w:tc>
         <w:tc>
           <w:tcPr>
-            <w:tcW w:type="dxa" w:w="2304"/>
+            <w:tcW w:type="dxa" w:w="2592"/>
             <w:tcBorders>
-              <w:top w:val="single" w:color="000000" w:sz="4"/>
-              <w:left w:val="single" w:color="000000" w:sz="4"/>
-              <w:bottom w:val="single" w:color="000000" w:sz="4"/>
-              <w:right w:val="single" w:color="000000" w:sz="4"/>
+              <w:top w:val="single" w:sz="4" w:color="000000"/>
+              <w:left w:val="single" w:sz="4" w:color="000000"/>
+              <w:bottom w:val="single" w:sz="4" w:color="000000"/>
+              <w:right w:val="single" w:sz="4" w:color="000000"/>
             </w:tcBorders>
           </w:tcPr>
           <w:p>
@@ -1053,9 +1213,11 @@
             </w:pPr>
             <w:r>
               <w:rPr>
-                <w:rFonts w:ascii="TH Sarabun PSK" w:hAnsi="TH Sarabun PSK" w:eastAsia="TH Sarabun PSK" w:cs="TH Sarabun PSK"/>
+                <w:rFonts w:ascii="TH Sarabun PSK" w:hAnsi="TH Sarabun PSK"/>
                 <w:b w:val="0"/>
-                <w:sz w:val="22"/>
+                <w:i w:val="0"/>
+                <w:sz w:val="27"/>
+                <w:rFonts w:ascii="TH Sarabun PSK" w:hAnsi="TH Sarabun PSK" w:cs="TH Sarabun PSK"/>
               </w:rPr>
               <w:t>๑ มิ.ย. ๕๔</w:t>
             </w:r>
@@ -1063,12 +1225,12 @@
         </w:tc>
         <w:tc>
           <w:tcPr>
-            <w:tcW w:type="dxa" w:w="2880"/>
+            <w:tcW w:type="dxa" w:w="2736"/>
             <w:tcBorders>
-              <w:top w:val="single" w:color="000000" w:sz="4"/>
-              <w:left w:val="single" w:color="000000" w:sz="4"/>
-              <w:bottom w:val="single" w:color="000000" w:sz="4"/>
-              <w:right w:val="single" w:color="000000" w:sz="4"/>
+              <w:top w:val="single" w:sz="4" w:color="000000"/>
+              <w:left w:val="single" w:sz="4" w:color="000000"/>
+              <w:bottom w:val="single" w:sz="4" w:color="000000"/>
+              <w:right w:val="single" w:sz="4" w:color="000000"/>
             </w:tcBorders>
           </w:tcPr>
           <w:p>
@@ -1077,9 +1239,11 @@
             </w:pPr>
             <w:r>
               <w:rPr>
-                <w:rFonts w:ascii="TH Sarabun PSK" w:hAnsi="TH Sarabun PSK" w:eastAsia="TH Sarabun PSK" w:cs="TH Sarabun PSK"/>
+                <w:rFonts w:ascii="TH Sarabun PSK" w:hAnsi="TH Sarabun PSK"/>
                 <w:b w:val="0"/>
-                <w:sz w:val="22"/>
+                <w:i w:val="0"/>
+                <w:sz w:val="27"/>
+                <w:rFonts w:ascii="TH Sarabun PSK" w:hAnsi="TH Sarabun PSK" w:cs="TH Sarabun PSK"/>
               </w:rPr>
             </w:r>
           </w:p>
@@ -1088,12 +1252,12 @@
       <w:tr>
         <w:tc>
           <w:tcPr>
-            <w:tcW w:type="dxa" w:w="864"/>
+            <w:tcW w:type="dxa" w:w="720"/>
             <w:tcBorders>
-              <w:top w:val="single" w:color="000000" w:sz="4"/>
-              <w:left w:val="single" w:color="000000" w:sz="4"/>
-              <w:bottom w:val="single" w:color="000000" w:sz="4"/>
-              <w:right w:val="single" w:color="000000" w:sz="4"/>
+              <w:top w:val="single" w:sz="4" w:color="000000"/>
+              <w:left w:val="single" w:sz="4" w:color="000000"/>
+              <w:bottom w:val="single" w:sz="4" w:color="000000"/>
+              <w:right w:val="single" w:sz="4" w:color="000000"/>
             </w:tcBorders>
           </w:tcPr>
           <w:p>
@@ -1102,9 +1266,11 @@
             </w:pPr>
             <w:r>
               <w:rPr>
-                <w:rFonts w:ascii="TH Sarabun PSK" w:hAnsi="TH Sarabun PSK" w:eastAsia="TH Sarabun PSK" w:cs="TH Sarabun PSK"/>
+                <w:rFonts w:ascii="TH Sarabun PSK" w:hAnsi="TH Sarabun PSK"/>
                 <w:b w:val="0"/>
-                <w:sz w:val="22"/>
+                <w:i w:val="0"/>
+                <w:sz w:val="27"/>
+                <w:rFonts w:ascii="TH Sarabun PSK" w:hAnsi="TH Sarabun PSK" w:cs="TH Sarabun PSK"/>
               </w:rPr>
               <w:t>๔.</w:t>
             </w:r>
@@ -1112,12 +1278,12 @@
         </w:tc>
         <w:tc>
           <w:tcPr>
-            <w:tcW w:type="dxa" w:w="4032"/>
+            <w:tcW w:type="dxa" w:w="3312"/>
             <w:tcBorders>
-              <w:top w:val="single" w:color="000000" w:sz="4"/>
-              <w:left w:val="single" w:color="000000" w:sz="4"/>
-              <w:bottom w:val="single" w:color="000000" w:sz="4"/>
-              <w:right w:val="single" w:color="000000" w:sz="4"/>
+              <w:top w:val="single" w:sz="4" w:color="000000"/>
+              <w:left w:val="single" w:sz="4" w:color="000000"/>
+              <w:bottom w:val="single" w:sz="4" w:color="000000"/>
+              <w:right w:val="single" w:sz="4" w:color="000000"/>
             </w:tcBorders>
           </w:tcPr>
           <w:p>
@@ -1126,9 +1292,11 @@
             </w:pPr>
             <w:r>
               <w:rPr>
-                <w:rFonts w:ascii="TH Sarabun PSK" w:hAnsi="TH Sarabun PSK" w:eastAsia="TH Sarabun PSK" w:cs="TH Sarabun PSK"/>
+                <w:rFonts w:ascii="TH Sarabun PSK" w:hAnsi="TH Sarabun PSK"/>
                 <w:b w:val="0"/>
-                <w:sz w:val="22"/>
+                <w:i w:val="0"/>
+                <w:sz w:val="27"/>
+                <w:rFonts w:ascii="TH Sarabun PSK" w:hAnsi="TH Sarabun PSK" w:cs="TH Sarabun PSK"/>
               </w:rPr>
               <w:t>ยางนอก</w:t>
             </w:r>
@@ -1136,12 +1304,12 @@
         </w:tc>
         <w:tc>
           <w:tcPr>
-            <w:tcW w:type="dxa" w:w="3456"/>
+            <w:tcW w:type="dxa" w:w="2880"/>
             <w:tcBorders>
-              <w:top w:val="single" w:color="000000" w:sz="4"/>
-              <w:left w:val="single" w:color="000000" w:sz="4"/>
-              <w:bottom w:val="single" w:color="000000" w:sz="4"/>
-              <w:right w:val="single" w:color="000000" w:sz="4"/>
+              <w:top w:val="single" w:sz="4" w:color="000000"/>
+              <w:left w:val="single" w:sz="4" w:color="000000"/>
+              <w:bottom w:val="single" w:sz="4" w:color="000000"/>
+              <w:right w:val="single" w:sz="4" w:color="000000"/>
             </w:tcBorders>
           </w:tcPr>
           <w:p>
@@ -1150,9 +1318,11 @@
             </w:pPr>
             <w:r>
               <w:rPr>
-                <w:rFonts w:ascii="TH Sarabun PSK" w:hAnsi="TH Sarabun PSK" w:eastAsia="TH Sarabun PSK" w:cs="TH Sarabun PSK"/>
+                <w:rFonts w:ascii="TH Sarabun PSK" w:hAnsi="TH Sarabun PSK"/>
                 <w:b w:val="0"/>
-                <w:sz w:val="22"/>
+                <w:i w:val="0"/>
+                <w:sz w:val="27"/>
+                <w:rFonts w:ascii="TH Sarabun PSK" w:hAnsi="TH Sarabun PSK" w:cs="TH Sarabun PSK"/>
               </w:rPr>
               <w:t>๒๖๑๐ – ๒๖๒ – ๘๘๑๖</w:t>
             </w:r>
@@ -1160,12 +1330,12 @@
         </w:tc>
         <w:tc>
           <w:tcPr>
-            <w:tcW w:type="dxa" w:w="2592"/>
+            <w:tcW w:type="dxa" w:w="3600"/>
             <w:tcBorders>
-              <w:top w:val="single" w:color="000000" w:sz="4"/>
-              <w:left w:val="single" w:color="000000" w:sz="4"/>
-              <w:bottom w:val="single" w:color="000000" w:sz="4"/>
-              <w:right w:val="single" w:color="000000" w:sz="4"/>
+              <w:top w:val="single" w:sz="4" w:color="000000"/>
+              <w:left w:val="single" w:sz="4" w:color="000000"/>
+              <w:bottom w:val="single" w:sz="4" w:color="000000"/>
+              <w:right w:val="single" w:sz="4" w:color="000000"/>
             </w:tcBorders>
           </w:tcPr>
           <w:p>
@@ -1174,9 +1344,11 @@
             </w:pPr>
             <w:r>
               <w:rPr>
-                <w:rFonts w:ascii="TH Sarabun PSK" w:hAnsi="TH Sarabun PSK" w:eastAsia="TH Sarabun PSK" w:cs="TH Sarabun PSK"/>
+                <w:rFonts w:ascii="TH Sarabun PSK" w:hAnsi="TH Sarabun PSK"/>
                 <w:b w:val="0"/>
-                <w:sz w:val="22"/>
+                <w:i w:val="0"/>
+                <w:sz w:val="27"/>
+                <w:rFonts w:ascii="TH Sarabun PSK" w:hAnsi="TH Sarabun PSK" w:cs="TH Sarabun PSK"/>
               </w:rPr>
               <w:t>๕๔ / ๔๗</w:t>
             </w:r>
@@ -1184,12 +1356,12 @@
         </w:tc>
         <w:tc>
           <w:tcPr>
-            <w:tcW w:type="dxa" w:w="2160"/>
+            <w:tcW w:type="dxa" w:w="2592"/>
             <w:tcBorders>
-              <w:top w:val="single" w:color="000000" w:sz="4"/>
-              <w:left w:val="single" w:color="000000" w:sz="4"/>
-              <w:bottom w:val="single" w:color="000000" w:sz="4"/>
-              <w:right w:val="single" w:color="000000" w:sz="4"/>
+              <w:top w:val="single" w:sz="4" w:color="000000"/>
+              <w:left w:val="single" w:sz="4" w:color="000000"/>
+              <w:bottom w:val="single" w:sz="4" w:color="000000"/>
+              <w:right w:val="single" w:sz="4" w:color="000000"/>
             </w:tcBorders>
           </w:tcPr>
           <w:p>
@@ -1198,9 +1370,11 @@
             </w:pPr>
             <w:r>
               <w:rPr>
-                <w:rFonts w:ascii="TH Sarabun PSK" w:hAnsi="TH Sarabun PSK" w:eastAsia="TH Sarabun PSK" w:cs="TH Sarabun PSK"/>
+                <w:rFonts w:ascii="TH Sarabun PSK" w:hAnsi="TH Sarabun PSK"/>
                 <w:b w:val="0"/>
-                <w:sz w:val="22"/>
+                <w:i w:val="0"/>
+                <w:sz w:val="27"/>
+                <w:rFonts w:ascii="TH Sarabun PSK" w:hAnsi="TH Sarabun PSK" w:cs="TH Sarabun PSK"/>
               </w:rPr>
               <w:t>๒๐ ก.พ. ๔๗</w:t>
             </w:r>
@@ -1208,12 +1382,12 @@
         </w:tc>
         <w:tc>
           <w:tcPr>
-            <w:tcW w:type="dxa" w:w="2304"/>
+            <w:tcW w:type="dxa" w:w="2592"/>
             <w:tcBorders>
-              <w:top w:val="single" w:color="000000" w:sz="4"/>
-              <w:left w:val="single" w:color="000000" w:sz="4"/>
-              <w:bottom w:val="single" w:color="000000" w:sz="4"/>
-              <w:right w:val="single" w:color="000000" w:sz="4"/>
+              <w:top w:val="single" w:sz="4" w:color="000000"/>
+              <w:left w:val="single" w:sz="4" w:color="000000"/>
+              <w:bottom w:val="single" w:sz="4" w:color="000000"/>
+              <w:right w:val="single" w:sz="4" w:color="000000"/>
             </w:tcBorders>
           </w:tcPr>
           <w:p>
@@ -1222,9 +1396,11 @@
             </w:pPr>
             <w:r>
               <w:rPr>
-                <w:rFonts w:ascii="TH Sarabun PSK" w:hAnsi="TH Sarabun PSK" w:eastAsia="TH Sarabun PSK" w:cs="TH Sarabun PSK"/>
+                <w:rFonts w:ascii="TH Sarabun PSK" w:hAnsi="TH Sarabun PSK"/>
                 <w:b w:val="0"/>
-                <w:sz w:val="22"/>
+                <w:i w:val="0"/>
+                <w:sz w:val="27"/>
+                <w:rFonts w:ascii="TH Sarabun PSK" w:hAnsi="TH Sarabun PSK" w:cs="TH Sarabun PSK"/>
               </w:rPr>
               <w:t>๑ มิ.ย. ๕๔</w:t>
             </w:r>
@@ -1232,12 +1408,12 @@
         </w:tc>
         <w:tc>
           <w:tcPr>
-            <w:tcW w:type="dxa" w:w="2880"/>
+            <w:tcW w:type="dxa" w:w="2736"/>
             <w:tcBorders>
-              <w:top w:val="single" w:color="000000" w:sz="4"/>
-              <w:left w:val="single" w:color="000000" w:sz="4"/>
-              <w:bottom w:val="single" w:color="000000" w:sz="4"/>
-              <w:right w:val="single" w:color="000000" w:sz="4"/>
+              <w:top w:val="single" w:sz="4" w:color="000000"/>
+              <w:left w:val="single" w:sz="4" w:color="000000"/>
+              <w:bottom w:val="single" w:sz="4" w:color="000000"/>
+              <w:right w:val="single" w:sz="4" w:color="000000"/>
             </w:tcBorders>
           </w:tcPr>
           <w:p>
@@ -1246,9 +1422,11 @@
             </w:pPr>
             <w:r>
               <w:rPr>
-                <w:rFonts w:ascii="TH Sarabun PSK" w:hAnsi="TH Sarabun PSK" w:eastAsia="TH Sarabun PSK" w:cs="TH Sarabun PSK"/>
+                <w:rFonts w:ascii="TH Sarabun PSK" w:hAnsi="TH Sarabun PSK"/>
                 <w:b w:val="0"/>
-                <w:sz w:val="22"/>
+                <w:i w:val="0"/>
+                <w:sz w:val="27"/>
+                <w:rFonts w:ascii="TH Sarabun PSK" w:hAnsi="TH Sarabun PSK" w:cs="TH Sarabun PSK"/>
               </w:rPr>
             </w:r>
           </w:p>
@@ -1257,12 +1435,12 @@
       <w:tr>
         <w:tc>
           <w:tcPr>
-            <w:tcW w:type="dxa" w:w="864"/>
+            <w:tcW w:type="dxa" w:w="720"/>
             <w:tcBorders>
-              <w:top w:val="single" w:color="000000" w:sz="4"/>
-              <w:left w:val="single" w:color="000000" w:sz="4"/>
-              <w:bottom w:val="single" w:color="000000" w:sz="4"/>
-              <w:right w:val="single" w:color="000000" w:sz="4"/>
+              <w:top w:val="single" w:sz="4" w:color="000000"/>
+              <w:left w:val="single" w:sz="4" w:color="000000"/>
+              <w:bottom w:val="single" w:sz="4" w:color="000000"/>
+              <w:right w:val="single" w:sz="4" w:color="000000"/>
             </w:tcBorders>
           </w:tcPr>
           <w:p>
@@ -1271,9 +1449,11 @@
             </w:pPr>
             <w:r>
               <w:rPr>
-                <w:rFonts w:ascii="TH Sarabun PSK" w:hAnsi="TH Sarabun PSK" w:eastAsia="TH Sarabun PSK" w:cs="TH Sarabun PSK"/>
+                <w:rFonts w:ascii="TH Sarabun PSK" w:hAnsi="TH Sarabun PSK"/>
                 <w:b w:val="0"/>
-                <w:sz w:val="22"/>
+                <w:i w:val="0"/>
+                <w:sz w:val="27"/>
+                <w:rFonts w:ascii="TH Sarabun PSK" w:hAnsi="TH Sarabun PSK" w:cs="TH Sarabun PSK"/>
               </w:rPr>
               <w:t>๕.</w:t>
             </w:r>
@@ -1281,12 +1461,12 @@
         </w:tc>
         <w:tc>
           <w:tcPr>
-            <w:tcW w:type="dxa" w:w="4032"/>
+            <w:tcW w:type="dxa" w:w="3312"/>
             <w:tcBorders>
-              <w:top w:val="single" w:color="000000" w:sz="4"/>
-              <w:left w:val="single" w:color="000000" w:sz="4"/>
-              <w:bottom w:val="single" w:color="000000" w:sz="4"/>
-              <w:right w:val="single" w:color="000000" w:sz="4"/>
+              <w:top w:val="single" w:sz="4" w:color="000000"/>
+              <w:left w:val="single" w:sz="4" w:color="000000"/>
+              <w:bottom w:val="single" w:sz="4" w:color="000000"/>
+              <w:right w:val="single" w:sz="4" w:color="000000"/>
             </w:tcBorders>
           </w:tcPr>
           <w:p>
@@ -1295,9 +1475,11 @@
             </w:pPr>
             <w:r>
               <w:rPr>
-                <w:rFonts w:ascii="TH Sarabun PSK" w:hAnsi="TH Sarabun PSK" w:eastAsia="TH Sarabun PSK" w:cs="TH Sarabun PSK"/>
+                <w:rFonts w:ascii="TH Sarabun PSK" w:hAnsi="TH Sarabun PSK"/>
                 <w:b w:val="0"/>
-                <w:sz w:val="22"/>
+                <w:i w:val="0"/>
+                <w:sz w:val="27"/>
+                <w:rFonts w:ascii="TH Sarabun PSK" w:hAnsi="TH Sarabun PSK" w:cs="TH Sarabun PSK"/>
               </w:rPr>
               <w:t>แผ่นเป้าทดสอบ</w:t>
             </w:r>
@@ -1305,12 +1487,12 @@
         </w:tc>
         <w:tc>
           <w:tcPr>
-            <w:tcW w:type="dxa" w:w="3456"/>
+            <w:tcW w:type="dxa" w:w="2880"/>
             <w:tcBorders>
-              <w:top w:val="single" w:color="000000" w:sz="4"/>
-              <w:left w:val="single" w:color="000000" w:sz="4"/>
-              <w:bottom w:val="single" w:color="000000" w:sz="4"/>
-              <w:right w:val="single" w:color="000000" w:sz="4"/>
+              <w:top w:val="single" w:sz="4" w:color="000000"/>
+              <w:left w:val="single" w:sz="4" w:color="000000"/>
+              <w:bottom w:val="single" w:sz="4" w:color="000000"/>
+              <w:right w:val="single" w:sz="4" w:color="000000"/>
             </w:tcBorders>
           </w:tcPr>
           <w:p>
@@ -1319,9 +1501,11 @@
             </w:pPr>
             <w:r>
               <w:rPr>
-                <w:rFonts w:ascii="TH Sarabun PSK" w:hAnsi="TH Sarabun PSK" w:eastAsia="TH Sarabun PSK" w:cs="TH Sarabun PSK"/>
+                <w:rFonts w:ascii="TH Sarabun PSK" w:hAnsi="TH Sarabun PSK"/>
                 <w:b w:val="0"/>
-                <w:sz w:val="22"/>
+                <w:i w:val="0"/>
+                <w:sz w:val="27"/>
+                <w:rFonts w:ascii="TH Sarabun PSK" w:hAnsi="TH Sarabun PSK" w:cs="TH Sarabun PSK"/>
               </w:rPr>
               <w:t>๖๙๒๐ – ๗๑๔ – ๘๙๐๗</w:t>
             </w:r>
@@ -1329,12 +1513,12 @@
         </w:tc>
         <w:tc>
           <w:tcPr>
-            <w:tcW w:type="dxa" w:w="2592"/>
+            <w:tcW w:type="dxa" w:w="3600"/>
             <w:tcBorders>
-              <w:top w:val="single" w:color="000000" w:sz="4"/>
-              <w:left w:val="single" w:color="000000" w:sz="4"/>
-              <w:bottom w:val="single" w:color="000000" w:sz="4"/>
-              <w:right w:val="single" w:color="000000" w:sz="4"/>
+              <w:top w:val="single" w:sz="4" w:color="000000"/>
+              <w:left w:val="single" w:sz="4" w:color="000000"/>
+              <w:bottom w:val="single" w:sz="4" w:color="000000"/>
+              <w:right w:val="single" w:sz="4" w:color="000000"/>
             </w:tcBorders>
           </w:tcPr>
           <w:p>
@@ -1343,9 +1527,11 @@
             </w:pPr>
             <w:r>
               <w:rPr>
-                <w:rFonts w:ascii="TH Sarabun PSK" w:hAnsi="TH Sarabun PSK" w:eastAsia="TH Sarabun PSK" w:cs="TH Sarabun PSK"/>
+                <w:rFonts w:ascii="TH Sarabun PSK" w:hAnsi="TH Sarabun PSK"/>
                 <w:b w:val="0"/>
-                <w:sz w:val="22"/>
+                <w:i w:val="0"/>
+                <w:sz w:val="27"/>
+                <w:rFonts w:ascii="TH Sarabun PSK" w:hAnsi="TH Sarabun PSK" w:cs="TH Sarabun PSK"/>
               </w:rPr>
               <w:t>๗๐ / ๔๗</w:t>
             </w:r>
@@ -1353,12 +1539,12 @@
         </w:tc>
         <w:tc>
           <w:tcPr>
-            <w:tcW w:type="dxa" w:w="2160"/>
+            <w:tcW w:type="dxa" w:w="2592"/>
             <w:tcBorders>
-              <w:top w:val="single" w:color="000000" w:sz="4"/>
-              <w:left w:val="single" w:color="000000" w:sz="4"/>
-              <w:bottom w:val="single" w:color="000000" w:sz="4"/>
-              <w:right w:val="single" w:color="000000" w:sz="4"/>
+              <w:top w:val="single" w:sz="4" w:color="000000"/>
+              <w:left w:val="single" w:sz="4" w:color="000000"/>
+              <w:bottom w:val="single" w:sz="4" w:color="000000"/>
+              <w:right w:val="single" w:sz="4" w:color="000000"/>
             </w:tcBorders>
           </w:tcPr>
           <w:p>
@@ -1367,9 +1553,11 @@
             </w:pPr>
             <w:r>
               <w:rPr>
-                <w:rFonts w:ascii="TH Sarabun PSK" w:hAnsi="TH Sarabun PSK" w:eastAsia="TH Sarabun PSK" w:cs="TH Sarabun PSK"/>
+                <w:rFonts w:ascii="TH Sarabun PSK" w:hAnsi="TH Sarabun PSK"/>
                 <w:b w:val="0"/>
-                <w:sz w:val="22"/>
+                <w:i w:val="0"/>
+                <w:sz w:val="27"/>
+                <w:rFonts w:ascii="TH Sarabun PSK" w:hAnsi="TH Sarabun PSK" w:cs="TH Sarabun PSK"/>
               </w:rPr>
               <w:t>๑๗ มิ.ย. ๔๗</w:t>
             </w:r>
@@ -1377,12 +1565,12 @@
         </w:tc>
         <w:tc>
           <w:tcPr>
-            <w:tcW w:type="dxa" w:w="2304"/>
+            <w:tcW w:type="dxa" w:w="2592"/>
             <w:tcBorders>
-              <w:top w:val="single" w:color="000000" w:sz="4"/>
-              <w:left w:val="single" w:color="000000" w:sz="4"/>
-              <w:bottom w:val="single" w:color="000000" w:sz="4"/>
-              <w:right w:val="single" w:color="000000" w:sz="4"/>
+              <w:top w:val="single" w:sz="4" w:color="000000"/>
+              <w:left w:val="single" w:sz="4" w:color="000000"/>
+              <w:bottom w:val="single" w:sz="4" w:color="000000"/>
+              <w:right w:val="single" w:sz="4" w:color="000000"/>
             </w:tcBorders>
           </w:tcPr>
           <w:p>
@@ -1391,9 +1579,11 @@
             </w:pPr>
             <w:r>
               <w:rPr>
-                <w:rFonts w:ascii="TH Sarabun PSK" w:hAnsi="TH Sarabun PSK" w:eastAsia="TH Sarabun PSK" w:cs="TH Sarabun PSK"/>
+                <w:rFonts w:ascii="TH Sarabun PSK" w:hAnsi="TH Sarabun PSK"/>
                 <w:b w:val="0"/>
-                <w:sz w:val="22"/>
+                <w:i w:val="0"/>
+                <w:sz w:val="27"/>
+                <w:rFonts w:ascii="TH Sarabun PSK" w:hAnsi="TH Sarabun PSK" w:cs="TH Sarabun PSK"/>
               </w:rPr>
               <w:t>๑ มิ.ย. ๕๔</w:t>
             </w:r>
@@ -1401,12 +1591,12 @@
         </w:tc>
         <w:tc>
           <w:tcPr>
-            <w:tcW w:type="dxa" w:w="2880"/>
+            <w:tcW w:type="dxa" w:w="2736"/>
             <w:tcBorders>
-              <w:top w:val="single" w:color="000000" w:sz="4"/>
-              <w:left w:val="single" w:color="000000" w:sz="4"/>
-              <w:bottom w:val="single" w:color="000000" w:sz="4"/>
-              <w:right w:val="single" w:color="000000" w:sz="4"/>
+              <w:top w:val="single" w:sz="4" w:color="000000"/>
+              <w:left w:val="single" w:sz="4" w:color="000000"/>
+              <w:bottom w:val="single" w:sz="4" w:color="000000"/>
+              <w:right w:val="single" w:sz="4" w:color="000000"/>
             </w:tcBorders>
           </w:tcPr>
           <w:p>
@@ -1415,9 +1605,11 @@
             </w:pPr>
             <w:r>
               <w:rPr>
-                <w:rFonts w:ascii="TH Sarabun PSK" w:hAnsi="TH Sarabun PSK" w:eastAsia="TH Sarabun PSK" w:cs="TH Sarabun PSK"/>
+                <w:rFonts w:ascii="TH Sarabun PSK" w:hAnsi="TH Sarabun PSK"/>
                 <w:b w:val="0"/>
-                <w:sz w:val="22"/>
+                <w:i w:val="0"/>
+                <w:sz w:val="27"/>
+                <w:rFonts w:ascii="TH Sarabun PSK" w:hAnsi="TH Sarabun PSK" w:cs="TH Sarabun PSK"/>
               </w:rPr>
             </w:r>
           </w:p>
@@ -1426,12 +1618,12 @@
       <w:tr>
         <w:tc>
           <w:tcPr>
-            <w:tcW w:type="dxa" w:w="864"/>
+            <w:tcW w:type="dxa" w:w="720"/>
             <w:tcBorders>
-              <w:top w:val="single" w:color="000000" w:sz="4"/>
-              <w:left w:val="single" w:color="000000" w:sz="4"/>
-              <w:bottom w:val="single" w:color="000000" w:sz="4"/>
-              <w:right w:val="single" w:color="000000" w:sz="4"/>
+              <w:top w:val="single" w:sz="4" w:color="000000"/>
+              <w:left w:val="single" w:sz="4" w:color="000000"/>
+              <w:bottom w:val="single" w:sz="4" w:color="000000"/>
+              <w:right w:val="single" w:sz="4" w:color="000000"/>
             </w:tcBorders>
           </w:tcPr>
           <w:p>
@@ -1440,9 +1632,11 @@
             </w:pPr>
             <w:r>
               <w:rPr>
-                <w:rFonts w:ascii="TH Sarabun PSK" w:hAnsi="TH Sarabun PSK" w:eastAsia="TH Sarabun PSK" w:cs="TH Sarabun PSK"/>
+                <w:rFonts w:ascii="TH Sarabun PSK" w:hAnsi="TH Sarabun PSK"/>
                 <w:b w:val="0"/>
-                <w:sz w:val="22"/>
+                <w:i w:val="0"/>
+                <w:sz w:val="27"/>
+                <w:rFonts w:ascii="TH Sarabun PSK" w:hAnsi="TH Sarabun PSK" w:cs="TH Sarabun PSK"/>
               </w:rPr>
               <w:t>๖.</w:t>
             </w:r>
@@ -1450,12 +1644,12 @@
         </w:tc>
         <w:tc>
           <w:tcPr>
-            <w:tcW w:type="dxa" w:w="4032"/>
+            <w:tcW w:type="dxa" w:w="3312"/>
             <w:tcBorders>
-              <w:top w:val="single" w:color="000000" w:sz="4"/>
-              <w:left w:val="single" w:color="000000" w:sz="4"/>
-              <w:bottom w:val="single" w:color="000000" w:sz="4"/>
-              <w:right w:val="single" w:color="000000" w:sz="4"/>
+              <w:top w:val="single" w:sz="4" w:color="000000"/>
+              <w:left w:val="single" w:sz="4" w:color="000000"/>
+              <w:bottom w:val="single" w:sz="4" w:color="000000"/>
+              <w:right w:val="single" w:sz="4" w:color="000000"/>
             </w:tcBorders>
           </w:tcPr>
           <w:p>
@@ -1464,9 +1658,11 @@
             </w:pPr>
             <w:r>
               <w:rPr>
-                <w:rFonts w:ascii="TH Sarabun PSK" w:hAnsi="TH Sarabun PSK" w:eastAsia="TH Sarabun PSK" w:cs="TH Sarabun PSK"/>
+                <w:rFonts w:ascii="TH Sarabun PSK" w:hAnsi="TH Sarabun PSK"/>
                 <w:b w:val="0"/>
-                <w:sz w:val="22"/>
+                <w:i w:val="0"/>
+                <w:sz w:val="27"/>
+                <w:rFonts w:ascii="TH Sarabun PSK" w:hAnsi="TH Sarabun PSK" w:cs="TH Sarabun PSK"/>
               </w:rPr>
               <w:t>น๊อตน้ำมันรับแรง</w:t>
             </w:r>
@@ -1474,12 +1670,12 @@
         </w:tc>
         <w:tc>
           <w:tcPr>
-            <w:tcW w:type="dxa" w:w="3456"/>
+            <w:tcW w:type="dxa" w:w="2880"/>
             <w:tcBorders>
-              <w:top w:val="single" w:color="000000" w:sz="4"/>
-              <w:left w:val="single" w:color="000000" w:sz="4"/>
-              <w:bottom w:val="single" w:color="000000" w:sz="4"/>
-              <w:right w:val="single" w:color="000000" w:sz="4"/>
+              <w:top w:val="single" w:sz="4" w:color="000000"/>
+              <w:left w:val="single" w:sz="4" w:color="000000"/>
+              <w:bottom w:val="single" w:sz="4" w:color="000000"/>
+              <w:right w:val="single" w:sz="4" w:color="000000"/>
             </w:tcBorders>
           </w:tcPr>
           <w:p>
@@ -1488,9 +1684,11 @@
             </w:pPr>
             <w:r>
               <w:rPr>
-                <w:rFonts w:ascii="TH Sarabun PSK" w:hAnsi="TH Sarabun PSK" w:eastAsia="TH Sarabun PSK" w:cs="TH Sarabun PSK"/>
+                <w:rFonts w:ascii="TH Sarabun PSK" w:hAnsi="TH Sarabun PSK"/>
                 <w:b w:val="0"/>
-                <w:sz w:val="22"/>
+                <w:i w:val="0"/>
+                <w:sz w:val="27"/>
+                <w:rFonts w:ascii="TH Sarabun PSK" w:hAnsi="TH Sarabun PSK" w:cs="TH Sarabun PSK"/>
               </w:rPr>
               <w:t>๔๗๓๐ – ๕๐๑ - ๘๔๙๕</w:t>
             </w:r>
@@ -1498,12 +1696,12 @@
         </w:tc>
         <w:tc>
           <w:tcPr>
-            <w:tcW w:type="dxa" w:w="2592"/>
+            <w:tcW w:type="dxa" w:w="3600"/>
             <w:tcBorders>
-              <w:top w:val="single" w:color="000000" w:sz="4"/>
-              <w:left w:val="single" w:color="000000" w:sz="4"/>
-              <w:bottom w:val="single" w:color="000000" w:sz="4"/>
-              <w:right w:val="single" w:color="000000" w:sz="4"/>
+              <w:top w:val="single" w:sz="4" w:color="000000"/>
+              <w:left w:val="single" w:sz="4" w:color="000000"/>
+              <w:bottom w:val="single" w:sz="4" w:color="000000"/>
+              <w:right w:val="single" w:sz="4" w:color="000000"/>
             </w:tcBorders>
           </w:tcPr>
           <w:p>
@@ -1512,9 +1710,11 @@
             </w:pPr>
             <w:r>
               <w:rPr>
-                <w:rFonts w:ascii="TH Sarabun PSK" w:hAnsi="TH Sarabun PSK" w:eastAsia="TH Sarabun PSK" w:cs="TH Sarabun PSK"/>
+                <w:rFonts w:ascii="TH Sarabun PSK" w:hAnsi="TH Sarabun PSK"/>
                 <w:b w:val="0"/>
-                <w:sz w:val="22"/>
+                <w:i w:val="0"/>
+                <w:sz w:val="27"/>
+                <w:rFonts w:ascii="TH Sarabun PSK" w:hAnsi="TH Sarabun PSK" w:cs="TH Sarabun PSK"/>
               </w:rPr>
               <w:t>๖๙ / ๔๗</w:t>
             </w:r>
@@ -1522,12 +1722,12 @@
         </w:tc>
         <w:tc>
           <w:tcPr>
-            <w:tcW w:type="dxa" w:w="2160"/>
+            <w:tcW w:type="dxa" w:w="2592"/>
             <w:tcBorders>
-              <w:top w:val="single" w:color="000000" w:sz="4"/>
-              <w:left w:val="single" w:color="000000" w:sz="4"/>
-              <w:bottom w:val="single" w:color="000000" w:sz="4"/>
-              <w:right w:val="single" w:color="000000" w:sz="4"/>
+              <w:top w:val="single" w:sz="4" w:color="000000"/>
+              <w:left w:val="single" w:sz="4" w:color="000000"/>
+              <w:bottom w:val="single" w:sz="4" w:color="000000"/>
+              <w:right w:val="single" w:sz="4" w:color="000000"/>
             </w:tcBorders>
           </w:tcPr>
           <w:p>
@@ -1536,9 +1736,11 @@
             </w:pPr>
             <w:r>
               <w:rPr>
-                <w:rFonts w:ascii="TH Sarabun PSK" w:hAnsi="TH Sarabun PSK" w:eastAsia="TH Sarabun PSK" w:cs="TH Sarabun PSK"/>
+                <w:rFonts w:ascii="TH Sarabun PSK" w:hAnsi="TH Sarabun PSK"/>
                 <w:b w:val="0"/>
-                <w:sz w:val="22"/>
+                <w:i w:val="0"/>
+                <w:sz w:val="27"/>
+                <w:rFonts w:ascii="TH Sarabun PSK" w:hAnsi="TH Sarabun PSK" w:cs="TH Sarabun PSK"/>
               </w:rPr>
               <w:t>๑๐ มิ.ย. ๔๗</w:t>
             </w:r>
@@ -1546,12 +1748,12 @@
         </w:tc>
         <w:tc>
           <w:tcPr>
-            <w:tcW w:type="dxa" w:w="2304"/>
+            <w:tcW w:type="dxa" w:w="2592"/>
             <w:tcBorders>
-              <w:top w:val="single" w:color="000000" w:sz="4"/>
-              <w:left w:val="single" w:color="000000" w:sz="4"/>
-              <w:bottom w:val="single" w:color="000000" w:sz="4"/>
-              <w:right w:val="single" w:color="000000" w:sz="4"/>
+              <w:top w:val="single" w:sz="4" w:color="000000"/>
+              <w:left w:val="single" w:sz="4" w:color="000000"/>
+              <w:bottom w:val="single" w:sz="4" w:color="000000"/>
+              <w:right w:val="single" w:sz="4" w:color="000000"/>
             </w:tcBorders>
           </w:tcPr>
           <w:p>
@@ -1560,9 +1762,11 @@
             </w:pPr>
             <w:r>
               <w:rPr>
-                <w:rFonts w:ascii="TH Sarabun PSK" w:hAnsi="TH Sarabun PSK" w:eastAsia="TH Sarabun PSK" w:cs="TH Sarabun PSK"/>
+                <w:rFonts w:ascii="TH Sarabun PSK" w:hAnsi="TH Sarabun PSK"/>
                 <w:b w:val="0"/>
-                <w:sz w:val="22"/>
+                <w:i w:val="0"/>
+                <w:sz w:val="27"/>
+                <w:rFonts w:ascii="TH Sarabun PSK" w:hAnsi="TH Sarabun PSK" w:cs="TH Sarabun PSK"/>
               </w:rPr>
               <w:t>๒ มิ.ย. ๕๒</w:t>
             </w:r>
@@ -1570,12 +1774,12 @@
         </w:tc>
         <w:tc>
           <w:tcPr>
-            <w:tcW w:type="dxa" w:w="2880"/>
+            <w:tcW w:type="dxa" w:w="2736"/>
             <w:tcBorders>
-              <w:top w:val="single" w:color="000000" w:sz="4"/>
-              <w:left w:val="single" w:color="000000" w:sz="4"/>
-              <w:bottom w:val="single" w:color="000000" w:sz="4"/>
-              <w:right w:val="single" w:color="000000" w:sz="4"/>
+              <w:top w:val="single" w:sz="4" w:color="000000"/>
+              <w:left w:val="single" w:sz="4" w:color="000000"/>
+              <w:bottom w:val="single" w:sz="4" w:color="000000"/>
+              <w:right w:val="single" w:sz="4" w:color="000000"/>
             </w:tcBorders>
           </w:tcPr>
           <w:p>
@@ -1584,9 +1788,11 @@
             </w:pPr>
             <w:r>
               <w:rPr>
-                <w:rFonts w:ascii="TH Sarabun PSK" w:hAnsi="TH Sarabun PSK" w:eastAsia="TH Sarabun PSK" w:cs="TH Sarabun PSK"/>
+                <w:rFonts w:ascii="TH Sarabun PSK" w:hAnsi="TH Sarabun PSK"/>
                 <w:b w:val="0"/>
-                <w:sz w:val="22"/>
+                <w:i w:val="0"/>
+                <w:sz w:val="27"/>
+                <w:rFonts w:ascii="TH Sarabun PSK" w:hAnsi="TH Sarabun PSK" w:cs="TH Sarabun PSK"/>
               </w:rPr>
             </w:r>
           </w:p>
@@ -1595,36 +1801,48 @@
       <w:tr>
         <w:tc>
           <w:tcPr>
-            <w:tcW w:type="dxa" w:w="864"/>
+            <w:tcW w:type="dxa" w:w="720"/>
             <w:tcBorders>
-              <w:top w:val="single" w:color="000000" w:sz="4"/>
-              <w:left w:val="single" w:color="000000" w:sz="4"/>
-              <w:bottom w:val="single" w:color="000000" w:sz="4"/>
-              <w:right w:val="single" w:color="000000" w:sz="4"/>
+              <w:top w:val="single" w:sz="4" w:color="000000"/>
+              <w:left w:val="single" w:sz="4" w:color="000000"/>
+              <w:bottom w:val="single" w:sz="4" w:color="000000"/>
+              <w:right w:val="single" w:sz="4" w:color="000000"/>
             </w:tcBorders>
           </w:tcPr>
           <w:p/>
         </w:tc>
         <w:tc>
           <w:tcPr>
-            <w:tcW w:type="dxa" w:w="4032"/>
+            <w:tcW w:type="dxa" w:w="3312"/>
             <w:tcBorders>
-              <w:top w:val="single" w:color="000000" w:sz="4"/>
-              <w:left w:val="single" w:color="000000" w:sz="4"/>
-              <w:bottom w:val="single" w:color="000000" w:sz="4"/>
-              <w:right w:val="single" w:color="000000" w:sz="4"/>
+              <w:top w:val="single" w:sz="4" w:color="000000"/>
+              <w:left w:val="single" w:sz="4" w:color="000000"/>
+              <w:bottom w:val="single" w:sz="4" w:color="000000"/>
+              <w:right w:val="single" w:sz="4" w:color="000000"/>
             </w:tcBorders>
           </w:tcPr>
           <w:p/>
         </w:tc>
         <w:tc>
           <w:tcPr>
-            <w:tcW w:type="dxa" w:w="3456"/>
+            <w:tcW w:type="dxa" w:w="2880"/>
             <w:tcBorders>
-              <w:top w:val="single" w:color="000000" w:sz="4"/>
-              <w:left w:val="single" w:color="000000" w:sz="4"/>
-              <w:bottom w:val="single" w:color="000000" w:sz="4"/>
-              <w:right w:val="single" w:color="000000" w:sz="4"/>
+              <w:top w:val="single" w:sz="4" w:color="000000"/>
+              <w:left w:val="single" w:sz="4" w:color="000000"/>
+              <w:bottom w:val="single" w:sz="4" w:color="000000"/>
+              <w:right w:val="single" w:sz="4" w:color="000000"/>
+            </w:tcBorders>
+          </w:tcPr>
+          <w:p/>
+        </w:tc>
+        <w:tc>
+          <w:tcPr>
+            <w:tcW w:type="dxa" w:w="3600"/>
+            <w:tcBorders>
+              <w:top w:val="single" w:sz="4" w:color="000000"/>
+              <w:left w:val="single" w:sz="4" w:color="000000"/>
+              <w:bottom w:val="single" w:sz="4" w:color="000000"/>
+              <w:right w:val="single" w:sz="4" w:color="000000"/>
             </w:tcBorders>
           </w:tcPr>
           <w:p/>
@@ -1633,84 +1851,10 @@
           <w:tcPr>
             <w:tcW w:type="dxa" w:w="2592"/>
             <w:tcBorders>
-              <w:top w:val="single" w:color="000000" w:sz="4"/>
-              <w:left w:val="single" w:color="000000" w:sz="4"/>
-              <w:bottom w:val="single" w:color="000000" w:sz="4"/>
-              <w:right w:val="single" w:color="000000" w:sz="4"/>
-            </w:tcBorders>
-          </w:tcPr>
-          <w:p/>
-        </w:tc>
-        <w:tc>
-          <w:tcPr>
-            <w:tcW w:type="dxa" w:w="2160"/>
-            <w:tcBorders>
-              <w:top w:val="single" w:color="000000" w:sz="4"/>
-              <w:left w:val="single" w:color="000000" w:sz="4"/>
-              <w:bottom w:val="single" w:color="000000" w:sz="4"/>
-              <w:right w:val="single" w:color="000000" w:sz="4"/>
-            </w:tcBorders>
-          </w:tcPr>
-          <w:p/>
-        </w:tc>
-        <w:tc>
-          <w:tcPr>
-            <w:tcW w:type="dxa" w:w="2304"/>
-            <w:tcBorders>
-              <w:top w:val="single" w:color="000000" w:sz="4"/>
-              <w:left w:val="single" w:color="000000" w:sz="4"/>
-              <w:bottom w:val="single" w:color="000000" w:sz="4"/>
-              <w:right w:val="single" w:color="000000" w:sz="4"/>
-            </w:tcBorders>
-          </w:tcPr>
-          <w:p/>
-        </w:tc>
-        <w:tc>
-          <w:tcPr>
-            <w:tcW w:type="dxa" w:w="2880"/>
-            <w:tcBorders>
-              <w:top w:val="single" w:color="000000" w:sz="4"/>
-              <w:left w:val="single" w:color="000000" w:sz="4"/>
-              <w:bottom w:val="single" w:color="000000" w:sz="4"/>
-              <w:right w:val="single" w:color="000000" w:sz="4"/>
-            </w:tcBorders>
-          </w:tcPr>
-          <w:p/>
-        </w:tc>
-      </w:tr>
-      <w:tr>
-        <w:tc>
-          <w:tcPr>
-            <w:tcW w:type="dxa" w:w="864"/>
-            <w:tcBorders>
-              <w:top w:val="single" w:color="000000" w:sz="4"/>
-              <w:left w:val="single" w:color="000000" w:sz="4"/>
-              <w:bottom w:val="single" w:color="000000" w:sz="4"/>
-              <w:right w:val="single" w:color="000000" w:sz="4"/>
-            </w:tcBorders>
-          </w:tcPr>
-          <w:p/>
-        </w:tc>
-        <w:tc>
-          <w:tcPr>
-            <w:tcW w:type="dxa" w:w="4032"/>
-            <w:tcBorders>
-              <w:top w:val="single" w:color="000000" w:sz="4"/>
-              <w:left w:val="single" w:color="000000" w:sz="4"/>
-              <w:bottom w:val="single" w:color="000000" w:sz="4"/>
-              <w:right w:val="single" w:color="000000" w:sz="4"/>
-            </w:tcBorders>
-          </w:tcPr>
-          <w:p/>
-        </w:tc>
-        <w:tc>
-          <w:tcPr>
-            <w:tcW w:type="dxa" w:w="3456"/>
-            <w:tcBorders>
-              <w:top w:val="single" w:color="000000" w:sz="4"/>
-              <w:left w:val="single" w:color="000000" w:sz="4"/>
-              <w:bottom w:val="single" w:color="000000" w:sz="4"/>
-              <w:right w:val="single" w:color="000000" w:sz="4"/>
+              <w:top w:val="single" w:sz="4" w:color="000000"/>
+              <w:left w:val="single" w:sz="4" w:color="000000"/>
+              <w:bottom w:val="single" w:sz="4" w:color="000000"/>
+              <w:right w:val="single" w:sz="4" w:color="000000"/>
             </w:tcBorders>
           </w:tcPr>
           <w:p/>
@@ -1719,218 +1863,22 @@
           <w:tcPr>
             <w:tcW w:type="dxa" w:w="2592"/>
             <w:tcBorders>
-              <w:top w:val="single" w:color="000000" w:sz="4"/>
-              <w:left w:val="single" w:color="000000" w:sz="4"/>
-              <w:bottom w:val="single" w:color="000000" w:sz="4"/>
-              <w:right w:val="single" w:color="000000" w:sz="4"/>
+              <w:top w:val="single" w:sz="4" w:color="000000"/>
+              <w:left w:val="single" w:sz="4" w:color="000000"/>
+              <w:bottom w:val="single" w:sz="4" w:color="000000"/>
+              <w:right w:val="single" w:sz="4" w:color="000000"/>
             </w:tcBorders>
           </w:tcPr>
           <w:p/>
         </w:tc>
         <w:tc>
           <w:tcPr>
-            <w:tcW w:type="dxa" w:w="2160"/>
+            <w:tcW w:type="dxa" w:w="2736"/>
             <w:tcBorders>
-              <w:top w:val="single" w:color="000000" w:sz="4"/>
-              <w:left w:val="single" w:color="000000" w:sz="4"/>
-              <w:bottom w:val="single" w:color="000000" w:sz="4"/>
-              <w:right w:val="single" w:color="000000" w:sz="4"/>
-            </w:tcBorders>
-          </w:tcPr>
-          <w:p/>
-        </w:tc>
-        <w:tc>
-          <w:tcPr>
-            <w:tcW w:type="dxa" w:w="2304"/>
-            <w:tcBorders>
-              <w:top w:val="single" w:color="000000" w:sz="4"/>
-              <w:left w:val="single" w:color="000000" w:sz="4"/>
-              <w:bottom w:val="single" w:color="000000" w:sz="4"/>
-              <w:right w:val="single" w:color="000000" w:sz="4"/>
-            </w:tcBorders>
-          </w:tcPr>
-          <w:p/>
-        </w:tc>
-        <w:tc>
-          <w:tcPr>
-            <w:tcW w:type="dxa" w:w="2880"/>
-            <w:tcBorders>
-              <w:top w:val="single" w:color="000000" w:sz="4"/>
-              <w:left w:val="single" w:color="000000" w:sz="4"/>
-              <w:bottom w:val="single" w:color="000000" w:sz="4"/>
-              <w:right w:val="single" w:color="000000" w:sz="4"/>
-            </w:tcBorders>
-          </w:tcPr>
-          <w:p/>
-        </w:tc>
-      </w:tr>
-      <w:tr>
-        <w:tc>
-          <w:tcPr>
-            <w:tcW w:type="dxa" w:w="864"/>
-            <w:tcBorders>
-              <w:top w:val="single" w:color="000000" w:sz="4"/>
-              <w:left w:val="single" w:color="000000" w:sz="4"/>
-              <w:bottom w:val="single" w:color="000000" w:sz="4"/>
-              <w:right w:val="single" w:color="000000" w:sz="4"/>
-            </w:tcBorders>
-          </w:tcPr>
-          <w:p/>
-        </w:tc>
-        <w:tc>
-          <w:tcPr>
-            <w:tcW w:type="dxa" w:w="4032"/>
-            <w:tcBorders>
-              <w:top w:val="single" w:color="000000" w:sz="4"/>
-              <w:left w:val="single" w:color="000000" w:sz="4"/>
-              <w:bottom w:val="single" w:color="000000" w:sz="4"/>
-              <w:right w:val="single" w:color="000000" w:sz="4"/>
-            </w:tcBorders>
-          </w:tcPr>
-          <w:p/>
-        </w:tc>
-        <w:tc>
-          <w:tcPr>
-            <w:tcW w:type="dxa" w:w="3456"/>
-            <w:tcBorders>
-              <w:top w:val="single" w:color="000000" w:sz="4"/>
-              <w:left w:val="single" w:color="000000" w:sz="4"/>
-              <w:bottom w:val="single" w:color="000000" w:sz="4"/>
-              <w:right w:val="single" w:color="000000" w:sz="4"/>
-            </w:tcBorders>
-          </w:tcPr>
-          <w:p/>
-        </w:tc>
-        <w:tc>
-          <w:tcPr>
-            <w:tcW w:type="dxa" w:w="2592"/>
-            <w:tcBorders>
-              <w:top w:val="single" w:color="000000" w:sz="4"/>
-              <w:left w:val="single" w:color="000000" w:sz="4"/>
-              <w:bottom w:val="single" w:color="000000" w:sz="4"/>
-              <w:right w:val="single" w:color="000000" w:sz="4"/>
-            </w:tcBorders>
-          </w:tcPr>
-          <w:p/>
-        </w:tc>
-        <w:tc>
-          <w:tcPr>
-            <w:tcW w:type="dxa" w:w="2160"/>
-            <w:tcBorders>
-              <w:top w:val="single" w:color="000000" w:sz="4"/>
-              <w:left w:val="single" w:color="000000" w:sz="4"/>
-              <w:bottom w:val="single" w:color="000000" w:sz="4"/>
-              <w:right w:val="single" w:color="000000" w:sz="4"/>
-            </w:tcBorders>
-          </w:tcPr>
-          <w:p/>
-        </w:tc>
-        <w:tc>
-          <w:tcPr>
-            <w:tcW w:type="dxa" w:w="2304"/>
-            <w:tcBorders>
-              <w:top w:val="single" w:color="000000" w:sz="4"/>
-              <w:left w:val="single" w:color="000000" w:sz="4"/>
-              <w:bottom w:val="single" w:color="000000" w:sz="4"/>
-              <w:right w:val="single" w:color="000000" w:sz="4"/>
-            </w:tcBorders>
-          </w:tcPr>
-          <w:p/>
-        </w:tc>
-        <w:tc>
-          <w:tcPr>
-            <w:tcW w:type="dxa" w:w="2880"/>
-            <w:tcBorders>
-              <w:top w:val="single" w:color="000000" w:sz="4"/>
-              <w:left w:val="single" w:color="000000" w:sz="4"/>
-              <w:bottom w:val="single" w:color="000000" w:sz="4"/>
-              <w:right w:val="single" w:color="000000" w:sz="4"/>
-            </w:tcBorders>
-          </w:tcPr>
-          <w:p/>
-        </w:tc>
-      </w:tr>
-      <w:tr>
-        <w:tc>
-          <w:tcPr>
-            <w:tcW w:type="dxa" w:w="864"/>
-            <w:tcBorders>
-              <w:top w:val="single" w:color="000000" w:sz="4"/>
-              <w:left w:val="single" w:color="000000" w:sz="4"/>
-              <w:bottom w:val="single" w:color="000000" w:sz="4"/>
-              <w:right w:val="single" w:color="000000" w:sz="4"/>
-            </w:tcBorders>
-          </w:tcPr>
-          <w:p/>
-        </w:tc>
-        <w:tc>
-          <w:tcPr>
-            <w:tcW w:type="dxa" w:w="4032"/>
-            <w:tcBorders>
-              <w:top w:val="single" w:color="000000" w:sz="4"/>
-              <w:left w:val="single" w:color="000000" w:sz="4"/>
-              <w:bottom w:val="single" w:color="000000" w:sz="4"/>
-              <w:right w:val="single" w:color="000000" w:sz="4"/>
-            </w:tcBorders>
-          </w:tcPr>
-          <w:p/>
-        </w:tc>
-        <w:tc>
-          <w:tcPr>
-            <w:tcW w:type="dxa" w:w="3456"/>
-            <w:tcBorders>
-              <w:top w:val="single" w:color="000000" w:sz="4"/>
-              <w:left w:val="single" w:color="000000" w:sz="4"/>
-              <w:bottom w:val="single" w:color="000000" w:sz="4"/>
-              <w:right w:val="single" w:color="000000" w:sz="4"/>
-            </w:tcBorders>
-          </w:tcPr>
-          <w:p/>
-        </w:tc>
-        <w:tc>
-          <w:tcPr>
-            <w:tcW w:type="dxa" w:w="2592"/>
-            <w:tcBorders>
-              <w:top w:val="single" w:color="000000" w:sz="4"/>
-              <w:left w:val="single" w:color="000000" w:sz="4"/>
-              <w:bottom w:val="single" w:color="000000" w:sz="4"/>
-              <w:right w:val="single" w:color="000000" w:sz="4"/>
-            </w:tcBorders>
-          </w:tcPr>
-          <w:p/>
-        </w:tc>
-        <w:tc>
-          <w:tcPr>
-            <w:tcW w:type="dxa" w:w="2160"/>
-            <w:tcBorders>
-              <w:top w:val="single" w:color="000000" w:sz="4"/>
-              <w:left w:val="single" w:color="000000" w:sz="4"/>
-              <w:bottom w:val="single" w:color="000000" w:sz="4"/>
-              <w:right w:val="single" w:color="000000" w:sz="4"/>
-            </w:tcBorders>
-          </w:tcPr>
-          <w:p/>
-        </w:tc>
-        <w:tc>
-          <w:tcPr>
-            <w:tcW w:type="dxa" w:w="2304"/>
-            <w:tcBorders>
-              <w:top w:val="single" w:color="000000" w:sz="4"/>
-              <w:left w:val="single" w:color="000000" w:sz="4"/>
-              <w:bottom w:val="single" w:color="000000" w:sz="4"/>
-              <w:right w:val="single" w:color="000000" w:sz="4"/>
-            </w:tcBorders>
-          </w:tcPr>
-          <w:p/>
-        </w:tc>
-        <w:tc>
-          <w:tcPr>
-            <w:tcW w:type="dxa" w:w="2880"/>
-            <w:tcBorders>
-              <w:top w:val="single" w:color="000000" w:sz="4"/>
-              <w:left w:val="single" w:color="000000" w:sz="4"/>
-              <w:bottom w:val="single" w:color="000000" w:sz="4"/>
-              <w:right w:val="single" w:color="000000" w:sz="4"/>
+              <w:top w:val="single" w:sz="4" w:color="000000"/>
+              <w:left w:val="single" w:sz="4" w:color="000000"/>
+              <w:bottom w:val="single" w:sz="4" w:color="000000"/>
+              <w:right w:val="single" w:sz="4" w:color="000000"/>
             </w:tcBorders>
           </w:tcPr>
           <w:p/>
@@ -1939,7 +1887,7 @@
     </w:tbl>
     <w:p>
       <w:pPr>
-        <w:spacing w:before="280"/>
+        <w:spacing w:before="200"/>
       </w:pPr>
     </w:p>
     <w:tbl>
@@ -1956,26 +1904,37 @@
         <w:tc>
           <w:tcPr>
             <w:tcW w:type="dxa" w:w="8640"/>
-            <w:tcBorders/>
           </w:tcPr>
+          <w:p/>
           <w:p>
             <w:pPr>
-              <w:spacing w:after="320"/>
+              <w:tabs>
+                <w:tab w:pos="4320" w:val="right"/>
+              </w:tabs>
+              <w:spacing w:before="0" w:after="40"/>
             </w:pPr>
-            <w:r/>
+            <w:r>
+              <w:rPr>
+                <w:rFonts w:ascii="TH Sarabun PSK" w:hAnsi="TH Sarabun PSK"/>
+                <w:b/>
+                <w:sz w:val="32"/>
+              </w:rPr>
+              <w:tab/>
+              <w:t>ผู้บังคับกองร้อย</w:t>
+            </w:r>
           </w:p>
           <w:p>
             <w:pPr>
               <w:tabs>
                 <w:tab w:pos="4320" w:val="right"/>
               </w:tabs>
-              <w:spacing w:before="0" w:after="440"/>
+              <w:spacing w:before="0" w:after="360"/>
             </w:pPr>
             <w:r>
               <w:rPr>
-                <w:rFonts w:ascii="TH Sarabun PSK" w:hAnsi="TH Sarabun PSK" w:eastAsia="TH Sarabun PSK" w:cs="TH Sarabun PSK"/>
+                <w:rFonts w:ascii="TH Sarabun PSK" w:hAnsi="TH Sarabun PSK"/>
                 <w:b w:val="0"/>
-                <w:sz w:val="24"/>
+                <w:sz w:val="32"/>
               </w:rPr>
               <w:tab/>
               <w:t>ร.อ.</w:t>
@@ -1990,9 +1949,9 @@
             </w:pPr>
             <w:r>
               <w:rPr>
-                <w:rFonts w:ascii="TH Sarabun PSK" w:hAnsi="TH Sarabun PSK" w:eastAsia="TH Sarabun PSK" w:cs="TH Sarabun PSK"/>
+                <w:rFonts w:ascii="TH Sarabun PSK" w:hAnsi="TH Sarabun PSK"/>
                 <w:b w:val="0"/>
-                <w:sz w:val="24"/>
+                <w:sz w:val="32"/>
               </w:rPr>
               <w:tab/>
               <w:t>(กฤติน  นราพงษ์)</w:t>
@@ -2001,15 +1960,15 @@
           <w:p>
             <w:pPr>
               <w:tabs>
-                <w:tab w:pos="5328" w:val="center"/>
+                <w:tab w:pos="5688" w:val="center"/>
               </w:tabs>
               <w:spacing w:before="0" w:after="0"/>
             </w:pPr>
             <w:r>
               <w:rPr>
-                <w:rFonts w:ascii="TH Sarabun PSK" w:hAnsi="TH Sarabun PSK" w:eastAsia="TH Sarabun PSK" w:cs="TH Sarabun PSK"/>
+                <w:rFonts w:ascii="TH Sarabun PSK" w:hAnsi="TH Sarabun PSK"/>
                 <w:b w:val="0"/>
-                <w:sz w:val="24"/>
+                <w:sz w:val="32"/>
               </w:rPr>
               <w:tab/>
               <w:t>ผบ.ป.พัน.๔ ร้อย.๒</w:t>
@@ -2018,38 +1977,38 @@
           <w:p>
             <w:pPr>
               <w:tabs>
-                <w:tab w:pos="5328" w:val="center"/>
+                <w:tab w:pos="5688" w:val="center"/>
               </w:tabs>
               <w:spacing w:before="0" w:after="0"/>
             </w:pPr>
             <w:r>
               <w:rPr>
-                <w:rFonts w:ascii="TH Sarabun PSK" w:hAnsi="TH Sarabun PSK" w:eastAsia="TH Sarabun PSK" w:cs="TH Sarabun PSK"/>
+                <w:rFonts w:ascii="TH Sarabun PSK" w:hAnsi="TH Sarabun PSK"/>
                 <w:b w:val="0"/>
-                <w:sz w:val="24"/>
+                <w:sz w:val="32"/>
               </w:rPr>
               <w:tab/>
-              <w:t>มิ.ย. ๕๔</w:t>
+              <w:t xml:space="preserve">          มิ.ย. ๕๔</w:t>
             </w:r>
           </w:p>
         </w:tc>
         <w:tc>
           <w:tcPr>
             <w:tcW w:type="dxa" w:w="8640"/>
-            <w:tcBorders/>
           </w:tcPr>
+          <w:p/>
           <w:p>
             <w:pPr>
               <w:tabs>
-                <w:tab w:pos="3168" w:val="left"/>
+                <w:tab w:pos="4320" w:val="right"/>
               </w:tabs>
-              <w:spacing w:after="320"/>
+              <w:spacing w:before="0" w:after="40"/>
             </w:pPr>
             <w:r>
               <w:rPr>
-                <w:rFonts w:ascii="TH Sarabun PSK" w:hAnsi="TH Sarabun PSK" w:eastAsia="TH Sarabun PSK" w:cs="TH Sarabun PSK"/>
+                <w:rFonts w:ascii="TH Sarabun PSK" w:hAnsi="TH Sarabun PSK"/>
                 <w:b/>
-                <w:sz w:val="24"/>
+                <w:sz w:val="32"/>
               </w:rPr>
               <w:tab/>
               <w:t>ผู้ตรวจสอบ</w:t>
@@ -2060,13 +2019,13 @@
               <w:tabs>
                 <w:tab w:pos="4320" w:val="right"/>
               </w:tabs>
-              <w:spacing w:before="0" w:after="440"/>
+              <w:spacing w:before="0" w:after="360"/>
             </w:pPr>
             <w:r>
               <w:rPr>
-                <w:rFonts w:ascii="TH Sarabun PSK" w:hAnsi="TH Sarabun PSK" w:eastAsia="TH Sarabun PSK" w:cs="TH Sarabun PSK"/>
+                <w:rFonts w:ascii="TH Sarabun PSK" w:hAnsi="TH Sarabun PSK"/>
                 <w:b w:val="0"/>
-                <w:sz w:val="24"/>
+                <w:sz w:val="32"/>
               </w:rPr>
               <w:tab/>
               <w:t>จ.ส.อ.</w:t>
@@ -2081,9 +2040,9 @@
             </w:pPr>
             <w:r>
               <w:rPr>
-                <w:rFonts w:ascii="TH Sarabun PSK" w:hAnsi="TH Sarabun PSK" w:eastAsia="TH Sarabun PSK" w:cs="TH Sarabun PSK"/>
+                <w:rFonts w:ascii="TH Sarabun PSK" w:hAnsi="TH Sarabun PSK"/>
                 <w:b w:val="0"/>
-                <w:sz w:val="24"/>
+                <w:sz w:val="32"/>
               </w:rPr>
               <w:tab/>
               <w:t>(ณัฐชัย  รักษาวงษ์)</w:t>
@@ -2092,15 +2051,15 @@
           <w:p>
             <w:pPr>
               <w:tabs>
-                <w:tab w:pos="5285" w:val="center"/>
+                <w:tab w:pos="5688" w:val="center"/>
               </w:tabs>
               <w:spacing w:before="0" w:after="0"/>
             </w:pPr>
             <w:r>
               <w:rPr>
-                <w:rFonts w:ascii="TH Sarabun PSK" w:hAnsi="TH Sarabun PSK" w:eastAsia="TH Sarabun PSK" w:cs="TH Sarabun PSK"/>
+                <w:rFonts w:ascii="TH Sarabun PSK" w:hAnsi="TH Sarabun PSK"/>
                 <w:b w:val="0"/>
-                <w:sz w:val="24"/>
+                <w:sz w:val="32"/>
               </w:rPr>
               <w:tab/>
               <w:t>ส.หน.สย. ป.๔ พัน.๔ ร้อย.๒</w:t>
@@ -2109,18 +2068,18 @@
           <w:p>
             <w:pPr>
               <w:tabs>
-                <w:tab w:pos="5285" w:val="center"/>
+                <w:tab w:pos="5688" w:val="center"/>
               </w:tabs>
               <w:spacing w:before="0" w:after="0"/>
             </w:pPr>
             <w:r>
               <w:rPr>
-                <w:rFonts w:ascii="TH Sarabun PSK" w:hAnsi="TH Sarabun PSK" w:eastAsia="TH Sarabun PSK" w:cs="TH Sarabun PSK"/>
+                <w:rFonts w:ascii="TH Sarabun PSK" w:hAnsi="TH Sarabun PSK"/>
                 <w:b w:val="0"/>
-                <w:sz w:val="24"/>
+                <w:sz w:val="32"/>
               </w:rPr>
               <w:tab/>
-              <w:t>มิ.ย. ๕๔</w:t>
+              <w:t xml:space="preserve">          มิ.ย. ๕๔</w:t>
             </w:r>
           </w:p>
         </w:tc>
@@ -2128,14 +2087,16 @@
     </w:tbl>
     <w:p>
       <w:pPr>
-        <w:spacing w:before="360"/>
+        <w:spacing w:before="160"/>
         <w:jc w:val="center"/>
       </w:pPr>
       <w:r>
         <w:rPr>
-          <w:rFonts w:ascii="TH Sarabun PSK" w:hAnsi="TH Sarabun PSK" w:eastAsia="TH Sarabun PSK" w:cs="TH Sarabun PSK"/>
+          <w:rFonts w:ascii="TH Sarabun PSK" w:hAnsi="TH Sarabun PSK"/>
           <w:b w:val="0"/>
-          <w:sz w:val="21"/>
+          <w:i w:val="0"/>
+          <w:sz w:val="24"/>
+          <w:rFonts w:ascii="TH Sarabun PSK" w:hAnsi="TH Sarabun PSK" w:cs="TH Sarabun PSK"/>
         </w:rPr>
         <w:t>( พิมพ์ตามระเบียบกองทัพบกว่าด้วยการส่งกำลังสิ่งอุปกรณ์ ประเภท ๒ และ ๔ พ.ศ. ๒๕๓๔ )</w:t>
       </w:r>
@@ -2144,7 +2105,7 @@
       <w:pPr>
         <w:sectPr>
           <w:pgSz w:w="20160" w:h="12240" w:orient="landscape"/>
-          <w:pgMar w:top="850" w:right="850" w:bottom="720" w:left="850" w:header="720" w:footer="720" w:gutter="0"/>
+          <w:pgMar w:top="562" w:right="850" w:bottom="562" w:left="850" w:header="720" w:footer="720" w:gutter="0"/>
           <w:cols w:space="720"/>
           <w:docGrid w:linePitch="360"/>
         </w:sectPr>
@@ -2156,9 +2117,11 @@
       </w:pPr>
       <w:r>
         <w:rPr>
-          <w:rFonts w:ascii="TH Sarabun PSK" w:hAnsi="TH Sarabun PSK" w:eastAsia="TH Sarabun PSK" w:cs="TH Sarabun PSK"/>
+          <w:rFonts w:ascii="TH Sarabun PSK" w:hAnsi="TH Sarabun PSK"/>
           <w:b/>
-          <w:sz w:val="24"/>
+          <w:i w:val="0"/>
+          <w:sz w:val="28"/>
+          <w:rFonts w:ascii="TH Sarabun PSK" w:hAnsi="TH Sarabun PSK" w:cs="TH Sarabun PSK"/>
         </w:rPr>
         <w:t>ทบ. ๔๐๐ - ๐๗๑</w:t>
         <w:br/>
@@ -2172,9 +2135,11 @@
       </w:pPr>
       <w:r>
         <w:rPr>
-          <w:rFonts w:ascii="TH Sarabun PSK" w:hAnsi="TH Sarabun PSK" w:eastAsia="TH Sarabun PSK" w:cs="TH Sarabun PSK"/>
+          <w:rFonts w:ascii="TH Sarabun PSK" w:hAnsi="TH Sarabun PSK"/>
           <w:b/>
-          <w:sz w:val="36"/>
+          <w:i w:val="0"/>
+          <w:sz w:val="40"/>
+          <w:rFonts w:ascii="TH Sarabun PSK" w:hAnsi="TH Sarabun PSK" w:cs="TH Sarabun PSK"/>
         </w:rPr>
         <w:t>ใบติดตามใบเบิก</w:t>
       </w:r>
@@ -2185,9 +2150,11 @@
       </w:pPr>
       <w:r>
         <w:rPr>
-          <w:rFonts w:ascii="TH Sarabun PSK" w:hAnsi="TH Sarabun PSK" w:eastAsia="TH Sarabun PSK" w:cs="TH Sarabun PSK"/>
+          <w:rFonts w:ascii="TH Sarabun PSK" w:hAnsi="TH Sarabun PSK"/>
           <w:b w:val="0"/>
-          <w:sz w:val="24"/>
+          <w:i w:val="0"/>
+          <w:sz w:val="34"/>
+          <w:rFonts w:ascii="TH Sarabun PSK" w:hAnsi="TH Sarabun PSK" w:cs="TH Sarabun PSK"/>
         </w:rPr>
         <w:t>ที่…………………………………………….</w:t>
       </w:r>
@@ -2198,9 +2165,11 @@
       </w:pPr>
       <w:r>
         <w:rPr>
-          <w:rFonts w:ascii="TH Sarabun PSK" w:hAnsi="TH Sarabun PSK" w:eastAsia="TH Sarabun PSK" w:cs="TH Sarabun PSK"/>
+          <w:rFonts w:ascii="TH Sarabun PSK" w:hAnsi="TH Sarabun PSK"/>
           <w:b w:val="0"/>
-          <w:sz w:val="24"/>
+          <w:i w:val="0"/>
+          <w:sz w:val="34"/>
+          <w:rFonts w:ascii="TH Sarabun PSK" w:hAnsi="TH Sarabun PSK" w:cs="TH Sarabun PSK"/>
         </w:rPr>
         <w:t>เรื่อง      ขอทราบผลการเบิก สป.</w:t>
       </w:r>
@@ -2211,9 +2180,11 @@
       </w:pPr>
       <w:r>
         <w:rPr>
-          <w:rFonts w:ascii="TH Sarabun PSK" w:hAnsi="TH Sarabun PSK" w:eastAsia="TH Sarabun PSK" w:cs="TH Sarabun PSK"/>
+          <w:rFonts w:ascii="TH Sarabun PSK" w:hAnsi="TH Sarabun PSK"/>
           <w:b w:val="0"/>
-          <w:sz w:val="24"/>
+          <w:i w:val="0"/>
+          <w:sz w:val="34"/>
+          <w:rFonts w:ascii="TH Sarabun PSK" w:hAnsi="TH Sarabun PSK" w:cs="TH Sarabun PSK"/>
         </w:rPr>
         <w:t>ถึง   ป.พัน.๔</w:t>
       </w:r>
@@ -2224,9 +2195,11 @@
       </w:pPr>
       <w:r>
         <w:rPr>
-          <w:rFonts w:ascii="TH Sarabun PSK" w:hAnsi="TH Sarabun PSK" w:eastAsia="TH Sarabun PSK" w:cs="TH Sarabun PSK"/>
+          <w:rFonts w:ascii="TH Sarabun PSK" w:hAnsi="TH Sarabun PSK"/>
           <w:b w:val="0"/>
-          <w:sz w:val="24"/>
+          <w:i w:val="0"/>
+          <w:sz w:val="34"/>
+          <w:rFonts w:ascii="TH Sarabun PSK" w:hAnsi="TH Sarabun PSK" w:cs="TH Sarabun PSK"/>
         </w:rPr>
         <w:t>จาก   ป.พัน.๔ ร้อย.๒</w:t>
       </w:r>
@@ -2237,9 +2210,11 @@
       </w:pPr>
       <w:r>
         <w:rPr>
-          <w:rFonts w:ascii="TH Sarabun PSK" w:hAnsi="TH Sarabun PSK" w:eastAsia="TH Sarabun PSK" w:cs="TH Sarabun PSK"/>
+          <w:rFonts w:ascii="TH Sarabun PSK" w:hAnsi="TH Sarabun PSK"/>
           <w:b w:val="0"/>
-          <w:sz w:val="24"/>
+          <w:i w:val="0"/>
+          <w:sz w:val="34"/>
+          <w:rFonts w:ascii="TH Sarabun PSK" w:hAnsi="TH Sarabun PSK" w:cs="TH Sarabun PSK"/>
         </w:rPr>
         <w:t xml:space="preserve">        กรุณาดำเนินการตรวจสอบใบเบิกข้างล่างนี้ ซึ่งหน่วยได้ส่งใบเบิก และได้ติดตาม ครั้งที่ ๑ ไว้เรียบร้อยแล้ว</w:t>
       </w:r>
@@ -2262,12 +2237,12 @@
       <w:tr>
         <w:tc>
           <w:tcPr>
-            <w:tcW w:type="dxa" w:w="864"/>
+            <w:tcW w:type="dxa" w:w="720"/>
             <w:tcBorders>
-              <w:top w:val="single" w:color="000000" w:sz="4"/>
-              <w:left w:val="single" w:color="000000" w:sz="4"/>
-              <w:bottom w:val="single" w:color="000000" w:sz="4"/>
-              <w:right w:val="single" w:color="000000" w:sz="4"/>
+              <w:top w:val="single" w:sz="4" w:color="000000"/>
+              <w:left w:val="single" w:sz="4" w:color="000000"/>
+              <w:bottom w:val="single" w:sz="4" w:color="000000"/>
+              <w:right w:val="single" w:sz="4" w:color="000000"/>
             </w:tcBorders>
           </w:tcPr>
           <w:p>
@@ -2276,9 +2251,11 @@
             </w:pPr>
             <w:r>
               <w:rPr>
-                <w:rFonts w:ascii="TH Sarabun PSK" w:hAnsi="TH Sarabun PSK" w:eastAsia="TH Sarabun PSK" w:cs="TH Sarabun PSK"/>
+                <w:rFonts w:ascii="TH Sarabun PSK" w:hAnsi="TH Sarabun PSK"/>
                 <w:b/>
-                <w:sz w:val="22"/>
+                <w:i w:val="0"/>
+                <w:sz w:val="27"/>
+                <w:rFonts w:ascii="TH Sarabun PSK" w:hAnsi="TH Sarabun PSK" w:cs="TH Sarabun PSK"/>
               </w:rPr>
               <w:t>ลำดับ</w:t>
             </w:r>
@@ -2286,12 +2263,12 @@
         </w:tc>
         <w:tc>
           <w:tcPr>
-            <w:tcW w:type="dxa" w:w="4032"/>
+            <w:tcW w:type="dxa" w:w="3312"/>
             <w:tcBorders>
-              <w:top w:val="single" w:color="000000" w:sz="4"/>
-              <w:left w:val="single" w:color="000000" w:sz="4"/>
-              <w:bottom w:val="single" w:color="000000" w:sz="4"/>
-              <w:right w:val="single" w:color="000000" w:sz="4"/>
+              <w:top w:val="single" w:sz="4" w:color="000000"/>
+              <w:left w:val="single" w:sz="4" w:color="000000"/>
+              <w:bottom w:val="single" w:sz="4" w:color="000000"/>
+              <w:right w:val="single" w:sz="4" w:color="000000"/>
             </w:tcBorders>
           </w:tcPr>
           <w:p>
@@ -2300,9 +2277,11 @@
             </w:pPr>
             <w:r>
               <w:rPr>
-                <w:rFonts w:ascii="TH Sarabun PSK" w:hAnsi="TH Sarabun PSK" w:eastAsia="TH Sarabun PSK" w:cs="TH Sarabun PSK"/>
+                <w:rFonts w:ascii="TH Sarabun PSK" w:hAnsi="TH Sarabun PSK"/>
                 <w:b/>
-                <w:sz w:val="22"/>
+                <w:i w:val="0"/>
+                <w:sz w:val="27"/>
+                <w:rFonts w:ascii="TH Sarabun PSK" w:hAnsi="TH Sarabun PSK" w:cs="TH Sarabun PSK"/>
               </w:rPr>
               <w:t>รายการ สป.</w:t>
             </w:r>
@@ -2310,12 +2289,12 @@
         </w:tc>
         <w:tc>
           <w:tcPr>
-            <w:tcW w:type="dxa" w:w="3456"/>
+            <w:tcW w:type="dxa" w:w="2880"/>
             <w:tcBorders>
-              <w:top w:val="single" w:color="000000" w:sz="4"/>
-              <w:left w:val="single" w:color="000000" w:sz="4"/>
-              <w:bottom w:val="single" w:color="000000" w:sz="4"/>
-              <w:right w:val="single" w:color="000000" w:sz="4"/>
+              <w:top w:val="single" w:sz="4" w:color="000000"/>
+              <w:left w:val="single" w:sz="4" w:color="000000"/>
+              <w:bottom w:val="single" w:sz="4" w:color="000000"/>
+              <w:right w:val="single" w:sz="4" w:color="000000"/>
             </w:tcBorders>
           </w:tcPr>
           <w:p>
@@ -2324,9 +2303,11 @@
             </w:pPr>
             <w:r>
               <w:rPr>
-                <w:rFonts w:ascii="TH Sarabun PSK" w:hAnsi="TH Sarabun PSK" w:eastAsia="TH Sarabun PSK" w:cs="TH Sarabun PSK"/>
+                <w:rFonts w:ascii="TH Sarabun PSK" w:hAnsi="TH Sarabun PSK"/>
                 <w:b/>
-                <w:sz w:val="22"/>
+                <w:i w:val="0"/>
+                <w:sz w:val="27"/>
+                <w:rFonts w:ascii="TH Sarabun PSK" w:hAnsi="TH Sarabun PSK" w:cs="TH Sarabun PSK"/>
               </w:rPr>
               <w:t>หมายเลข สป.</w:t>
             </w:r>
@@ -2334,12 +2315,12 @@
         </w:tc>
         <w:tc>
           <w:tcPr>
-            <w:tcW w:type="dxa" w:w="2592"/>
+            <w:tcW w:type="dxa" w:w="3600"/>
             <w:tcBorders>
-              <w:top w:val="single" w:color="000000" w:sz="4"/>
-              <w:left w:val="single" w:color="000000" w:sz="4"/>
-              <w:bottom w:val="single" w:color="000000" w:sz="4"/>
-              <w:right w:val="single" w:color="000000" w:sz="4"/>
+              <w:top w:val="single" w:sz="4" w:color="000000"/>
+              <w:left w:val="single" w:sz="4" w:color="000000"/>
+              <w:bottom w:val="single" w:sz="4" w:color="000000"/>
+              <w:right w:val="single" w:sz="4" w:color="000000"/>
             </w:tcBorders>
           </w:tcPr>
           <w:p>
@@ -2348,24 +2329,24 @@
             </w:pPr>
             <w:r>
               <w:rPr>
-                <w:rFonts w:ascii="TH Sarabun PSK" w:hAnsi="TH Sarabun PSK" w:eastAsia="TH Sarabun PSK" w:cs="TH Sarabun PSK"/>
+                <w:rFonts w:ascii="TH Sarabun PSK" w:hAnsi="TH Sarabun PSK"/>
                 <w:b/>
-                <w:sz w:val="22"/>
+                <w:i w:val="0"/>
+                <w:sz w:val="27"/>
+                <w:rFonts w:ascii="TH Sarabun PSK" w:hAnsi="TH Sarabun PSK" w:cs="TH Sarabun PSK"/>
               </w:rPr>
-              <w:t>ที่ใบเบิก ที่ทะเบียนหน่วย</w:t>
-              <w:br/>
-              <w:t>จ่าย</w:t>
+              <w:t>ที่ใบเบิก ที่ทะเบียนหน่วยจ่าย</w:t>
             </w:r>
           </w:p>
         </w:tc>
         <w:tc>
           <w:tcPr>
-            <w:tcW w:type="dxa" w:w="2160"/>
+            <w:tcW w:type="dxa" w:w="2592"/>
             <w:tcBorders>
-              <w:top w:val="single" w:color="000000" w:sz="4"/>
-              <w:left w:val="single" w:color="000000" w:sz="4"/>
-              <w:bottom w:val="single" w:color="000000" w:sz="4"/>
-              <w:right w:val="single" w:color="000000" w:sz="4"/>
+              <w:top w:val="single" w:sz="4" w:color="000000"/>
+              <w:left w:val="single" w:sz="4" w:color="000000"/>
+              <w:bottom w:val="single" w:sz="4" w:color="000000"/>
+              <w:right w:val="single" w:sz="4" w:color="000000"/>
             </w:tcBorders>
           </w:tcPr>
           <w:p>
@@ -2374,9 +2355,11 @@
             </w:pPr>
             <w:r>
               <w:rPr>
-                <w:rFonts w:ascii="TH Sarabun PSK" w:hAnsi="TH Sarabun PSK" w:eastAsia="TH Sarabun PSK" w:cs="TH Sarabun PSK"/>
+                <w:rFonts w:ascii="TH Sarabun PSK" w:hAnsi="TH Sarabun PSK"/>
                 <w:b/>
-                <w:sz w:val="22"/>
+                <w:i w:val="0"/>
+                <w:sz w:val="27"/>
+                <w:rFonts w:ascii="TH Sarabun PSK" w:hAnsi="TH Sarabun PSK" w:cs="TH Sarabun PSK"/>
               </w:rPr>
               <w:t>วันที่ส่งหรือวางใบเบิก</w:t>
             </w:r>
@@ -2384,12 +2367,12 @@
         </w:tc>
         <w:tc>
           <w:tcPr>
-            <w:tcW w:type="dxa" w:w="2304"/>
+            <w:tcW w:type="dxa" w:w="2592"/>
             <w:tcBorders>
-              <w:top w:val="single" w:color="000000" w:sz="4"/>
-              <w:left w:val="single" w:color="000000" w:sz="4"/>
-              <w:bottom w:val="single" w:color="000000" w:sz="4"/>
-              <w:right w:val="single" w:color="000000" w:sz="4"/>
+              <w:top w:val="single" w:sz="4" w:color="000000"/>
+              <w:left w:val="single" w:sz="4" w:color="000000"/>
+              <w:bottom w:val="single" w:sz="4" w:color="000000"/>
+              <w:right w:val="single" w:sz="4" w:color="000000"/>
             </w:tcBorders>
           </w:tcPr>
           <w:p>
@@ -2398,9 +2381,11 @@
             </w:pPr>
             <w:r>
               <w:rPr>
-                <w:rFonts w:ascii="TH Sarabun PSK" w:hAnsi="TH Sarabun PSK" w:eastAsia="TH Sarabun PSK" w:cs="TH Sarabun PSK"/>
+                <w:rFonts w:ascii="TH Sarabun PSK" w:hAnsi="TH Sarabun PSK"/>
                 <w:b/>
-                <w:sz w:val="22"/>
+                <w:i w:val="0"/>
+                <w:sz w:val="27"/>
+                <w:rFonts w:ascii="TH Sarabun PSK" w:hAnsi="TH Sarabun PSK" w:cs="TH Sarabun PSK"/>
               </w:rPr>
               <w:t>วันติดตามใบเบิกครั้งที่ ๘</w:t>
             </w:r>
@@ -2408,12 +2393,12 @@
         </w:tc>
         <w:tc>
           <w:tcPr>
-            <w:tcW w:type="dxa" w:w="2880"/>
+            <w:tcW w:type="dxa" w:w="2736"/>
             <w:tcBorders>
-              <w:top w:val="single" w:color="000000" w:sz="4"/>
-              <w:left w:val="single" w:color="000000" w:sz="4"/>
-              <w:bottom w:val="single" w:color="000000" w:sz="4"/>
-              <w:right w:val="single" w:color="000000" w:sz="4"/>
+              <w:top w:val="single" w:sz="4" w:color="000000"/>
+              <w:left w:val="single" w:sz="4" w:color="000000"/>
+              <w:bottom w:val="single" w:sz="4" w:color="000000"/>
+              <w:right w:val="single" w:sz="4" w:color="000000"/>
             </w:tcBorders>
           </w:tcPr>
           <w:p>
@@ -2422,9 +2407,11 @@
             </w:pPr>
             <w:r>
               <w:rPr>
-                <w:rFonts w:ascii="TH Sarabun PSK" w:hAnsi="TH Sarabun PSK" w:eastAsia="TH Sarabun PSK" w:cs="TH Sarabun PSK"/>
+                <w:rFonts w:ascii="TH Sarabun PSK" w:hAnsi="TH Sarabun PSK"/>
                 <w:b/>
-                <w:sz w:val="22"/>
+                <w:i w:val="0"/>
+                <w:sz w:val="27"/>
+                <w:rFonts w:ascii="TH Sarabun PSK" w:hAnsi="TH Sarabun PSK" w:cs="TH Sarabun PSK"/>
               </w:rPr>
               <w:t>หมายเหตุ (บันทึกโดยหน่วยจ่าย)</w:t>
             </w:r>
@@ -2434,12 +2421,12 @@
       <w:tr>
         <w:tc>
           <w:tcPr>
-            <w:tcW w:type="dxa" w:w="864"/>
+            <w:tcW w:type="dxa" w:w="720"/>
             <w:tcBorders>
-              <w:top w:val="single" w:color="000000" w:sz="4"/>
-              <w:left w:val="single" w:color="000000" w:sz="4"/>
-              <w:bottom w:val="single" w:color="000000" w:sz="4"/>
-              <w:right w:val="single" w:color="000000" w:sz="4"/>
+              <w:top w:val="single" w:sz="4" w:color="000000"/>
+              <w:left w:val="single" w:sz="4" w:color="000000"/>
+              <w:bottom w:val="single" w:sz="4" w:color="000000"/>
+              <w:right w:val="single" w:sz="4" w:color="000000"/>
             </w:tcBorders>
           </w:tcPr>
           <w:p>
@@ -2448,9 +2435,11 @@
             </w:pPr>
             <w:r>
               <w:rPr>
-                <w:rFonts w:ascii="TH Sarabun PSK" w:hAnsi="TH Sarabun PSK" w:eastAsia="TH Sarabun PSK" w:cs="TH Sarabun PSK"/>
+                <w:rFonts w:ascii="TH Sarabun PSK" w:hAnsi="TH Sarabun PSK"/>
                 <w:b w:val="0"/>
-                <w:sz w:val="22"/>
+                <w:i w:val="0"/>
+                <w:sz w:val="27"/>
+                <w:rFonts w:ascii="TH Sarabun PSK" w:hAnsi="TH Sarabun PSK" w:cs="TH Sarabun PSK"/>
               </w:rPr>
               <w:t>๑.</w:t>
             </w:r>
@@ -2458,12 +2447,12 @@
         </w:tc>
         <w:tc>
           <w:tcPr>
-            <w:tcW w:type="dxa" w:w="4032"/>
+            <w:tcW w:type="dxa" w:w="3312"/>
             <w:tcBorders>
-              <w:top w:val="single" w:color="000000" w:sz="4"/>
-              <w:left w:val="single" w:color="000000" w:sz="4"/>
-              <w:bottom w:val="single" w:color="000000" w:sz="4"/>
-              <w:right w:val="single" w:color="000000" w:sz="4"/>
+              <w:top w:val="single" w:sz="4" w:color="000000"/>
+              <w:left w:val="single" w:sz="4" w:color="000000"/>
+              <w:bottom w:val="single" w:sz="4" w:color="000000"/>
+              <w:right w:val="single" w:sz="4" w:color="000000"/>
             </w:tcBorders>
           </w:tcPr>
           <w:p>
@@ -2472,9 +2461,11 @@
             </w:pPr>
             <w:r>
               <w:rPr>
-                <w:rFonts w:ascii="TH Sarabun PSK" w:hAnsi="TH Sarabun PSK" w:eastAsia="TH Sarabun PSK" w:cs="TH Sarabun PSK"/>
+                <w:rFonts w:ascii="TH Sarabun PSK" w:hAnsi="TH Sarabun PSK"/>
                 <w:b w:val="0"/>
-                <w:sz w:val="22"/>
+                <w:i w:val="0"/>
+                <w:sz w:val="27"/>
+                <w:rFonts w:ascii="TH Sarabun PSK" w:hAnsi="TH Sarabun PSK" w:cs="TH Sarabun PSK"/>
               </w:rPr>
               <w:t>ยางใน</w:t>
             </w:r>
@@ -2482,12 +2473,12 @@
         </w:tc>
         <w:tc>
           <w:tcPr>
-            <w:tcW w:type="dxa" w:w="3456"/>
+            <w:tcW w:type="dxa" w:w="2880"/>
             <w:tcBorders>
-              <w:top w:val="single" w:color="000000" w:sz="4"/>
-              <w:left w:val="single" w:color="000000" w:sz="4"/>
-              <w:bottom w:val="single" w:color="000000" w:sz="4"/>
-              <w:right w:val="single" w:color="000000" w:sz="4"/>
+              <w:top w:val="single" w:sz="4" w:color="000000"/>
+              <w:left w:val="single" w:sz="4" w:color="000000"/>
+              <w:bottom w:val="single" w:sz="4" w:color="000000"/>
+              <w:right w:val="single" w:sz="4" w:color="000000"/>
             </w:tcBorders>
           </w:tcPr>
           <w:p>
@@ -2496,9 +2487,11 @@
             </w:pPr>
             <w:r>
               <w:rPr>
-                <w:rFonts w:ascii="TH Sarabun PSK" w:hAnsi="TH Sarabun PSK" w:eastAsia="TH Sarabun PSK" w:cs="TH Sarabun PSK"/>
+                <w:rFonts w:ascii="TH Sarabun PSK" w:hAnsi="TH Sarabun PSK"/>
                 <w:b w:val="0"/>
-                <w:sz w:val="22"/>
+                <w:i w:val="0"/>
+                <w:sz w:val="27"/>
+                <w:rFonts w:ascii="TH Sarabun PSK" w:hAnsi="TH Sarabun PSK" w:cs="TH Sarabun PSK"/>
               </w:rPr>
               <w:t>-</w:t>
             </w:r>
@@ -2506,12 +2499,12 @@
         </w:tc>
         <w:tc>
           <w:tcPr>
-            <w:tcW w:type="dxa" w:w="2592"/>
+            <w:tcW w:type="dxa" w:w="3600"/>
             <w:tcBorders>
-              <w:top w:val="single" w:color="000000" w:sz="4"/>
-              <w:left w:val="single" w:color="000000" w:sz="4"/>
-              <w:bottom w:val="single" w:color="000000" w:sz="4"/>
-              <w:right w:val="single" w:color="000000" w:sz="4"/>
+              <w:top w:val="single" w:sz="4" w:color="000000"/>
+              <w:left w:val="single" w:sz="4" w:color="000000"/>
+              <w:bottom w:val="single" w:sz="4" w:color="000000"/>
+              <w:right w:val="single" w:sz="4" w:color="000000"/>
             </w:tcBorders>
           </w:tcPr>
           <w:p>
@@ -2520,9 +2513,11 @@
             </w:pPr>
             <w:r>
               <w:rPr>
-                <w:rFonts w:ascii="TH Sarabun PSK" w:hAnsi="TH Sarabun PSK" w:eastAsia="TH Sarabun PSK" w:cs="TH Sarabun PSK"/>
+                <w:rFonts w:ascii="TH Sarabun PSK" w:hAnsi="TH Sarabun PSK"/>
                 <w:b w:val="0"/>
-                <w:sz w:val="22"/>
+                <w:i w:val="0"/>
+                <w:sz w:val="27"/>
+                <w:rFonts w:ascii="TH Sarabun PSK" w:hAnsi="TH Sarabun PSK" w:cs="TH Sarabun PSK"/>
               </w:rPr>
               <w:t>๒๓ / ๕๑</w:t>
             </w:r>
@@ -2530,12 +2525,12 @@
         </w:tc>
         <w:tc>
           <w:tcPr>
-            <w:tcW w:type="dxa" w:w="2160"/>
+            <w:tcW w:type="dxa" w:w="2592"/>
             <w:tcBorders>
-              <w:top w:val="single" w:color="000000" w:sz="4"/>
-              <w:left w:val="single" w:color="000000" w:sz="4"/>
-              <w:bottom w:val="single" w:color="000000" w:sz="4"/>
-              <w:right w:val="single" w:color="000000" w:sz="4"/>
+              <w:top w:val="single" w:sz="4" w:color="000000"/>
+              <w:left w:val="single" w:sz="4" w:color="000000"/>
+              <w:bottom w:val="single" w:sz="4" w:color="000000"/>
+              <w:right w:val="single" w:sz="4" w:color="000000"/>
             </w:tcBorders>
           </w:tcPr>
           <w:p>
@@ -2544,9 +2539,11 @@
             </w:pPr>
             <w:r>
               <w:rPr>
-                <w:rFonts w:ascii="TH Sarabun PSK" w:hAnsi="TH Sarabun PSK" w:eastAsia="TH Sarabun PSK" w:cs="TH Sarabun PSK"/>
+                <w:rFonts w:ascii="TH Sarabun PSK" w:hAnsi="TH Sarabun PSK"/>
                 <w:b w:val="0"/>
-                <w:sz w:val="22"/>
+                <w:i w:val="0"/>
+                <w:sz w:val="27"/>
+                <w:rFonts w:ascii="TH Sarabun PSK" w:hAnsi="TH Sarabun PSK" w:cs="TH Sarabun PSK"/>
               </w:rPr>
               <w:t>๑๓ มี.ค. ๕๑</w:t>
             </w:r>
@@ -2554,12 +2551,12 @@
         </w:tc>
         <w:tc>
           <w:tcPr>
-            <w:tcW w:type="dxa" w:w="2304"/>
+            <w:tcW w:type="dxa" w:w="2592"/>
             <w:tcBorders>
-              <w:top w:val="single" w:color="000000" w:sz="4"/>
-              <w:left w:val="single" w:color="000000" w:sz="4"/>
-              <w:bottom w:val="single" w:color="000000" w:sz="4"/>
-              <w:right w:val="single" w:color="000000" w:sz="4"/>
+              <w:top w:val="single" w:sz="4" w:color="000000"/>
+              <w:left w:val="single" w:sz="4" w:color="000000"/>
+              <w:bottom w:val="single" w:sz="4" w:color="000000"/>
+              <w:right w:val="single" w:sz="4" w:color="000000"/>
             </w:tcBorders>
           </w:tcPr>
           <w:p>
@@ -2568,9 +2565,11 @@
             </w:pPr>
             <w:r>
               <w:rPr>
-                <w:rFonts w:ascii="TH Sarabun PSK" w:hAnsi="TH Sarabun PSK" w:eastAsia="TH Sarabun PSK" w:cs="TH Sarabun PSK"/>
+                <w:rFonts w:ascii="TH Sarabun PSK" w:hAnsi="TH Sarabun PSK"/>
                 <w:b w:val="0"/>
-                <w:sz w:val="22"/>
+                <w:i w:val="0"/>
+                <w:sz w:val="27"/>
+                <w:rFonts w:ascii="TH Sarabun PSK" w:hAnsi="TH Sarabun PSK" w:cs="TH Sarabun PSK"/>
               </w:rPr>
               <w:t>๑ มิ.ย. ๕๔</w:t>
             </w:r>
@@ -2578,12 +2577,12 @@
         </w:tc>
         <w:tc>
           <w:tcPr>
-            <w:tcW w:type="dxa" w:w="2880"/>
+            <w:tcW w:type="dxa" w:w="2736"/>
             <w:tcBorders>
-              <w:top w:val="single" w:color="000000" w:sz="4"/>
-              <w:left w:val="single" w:color="000000" w:sz="4"/>
-              <w:bottom w:val="single" w:color="000000" w:sz="4"/>
-              <w:right w:val="single" w:color="000000" w:sz="4"/>
+              <w:top w:val="single" w:sz="4" w:color="000000"/>
+              <w:left w:val="single" w:sz="4" w:color="000000"/>
+              <w:bottom w:val="single" w:sz="4" w:color="000000"/>
+              <w:right w:val="single" w:sz="4" w:color="000000"/>
             </w:tcBorders>
           </w:tcPr>
           <w:p>
@@ -2592,9 +2591,11 @@
             </w:pPr>
             <w:r>
               <w:rPr>
-                <w:rFonts w:ascii="TH Sarabun PSK" w:hAnsi="TH Sarabun PSK" w:eastAsia="TH Sarabun PSK" w:cs="TH Sarabun PSK"/>
+                <w:rFonts w:ascii="TH Sarabun PSK" w:hAnsi="TH Sarabun PSK"/>
                 <w:b w:val="0"/>
-                <w:sz w:val="22"/>
+                <w:i w:val="0"/>
+                <w:sz w:val="27"/>
+                <w:rFonts w:ascii="TH Sarabun PSK" w:hAnsi="TH Sarabun PSK" w:cs="TH Sarabun PSK"/>
               </w:rPr>
             </w:r>
           </w:p>
@@ -2603,12 +2604,12 @@
       <w:tr>
         <w:tc>
           <w:tcPr>
-            <w:tcW w:type="dxa" w:w="864"/>
+            <w:tcW w:type="dxa" w:w="720"/>
             <w:tcBorders>
-              <w:top w:val="single" w:color="000000" w:sz="4"/>
-              <w:left w:val="single" w:color="000000" w:sz="4"/>
-              <w:bottom w:val="single" w:color="000000" w:sz="4"/>
-              <w:right w:val="single" w:color="000000" w:sz="4"/>
+              <w:top w:val="single" w:sz="4" w:color="000000"/>
+              <w:left w:val="single" w:sz="4" w:color="000000"/>
+              <w:bottom w:val="single" w:sz="4" w:color="000000"/>
+              <w:right w:val="single" w:sz="4" w:color="000000"/>
             </w:tcBorders>
           </w:tcPr>
           <w:p>
@@ -2617,9 +2618,11 @@
             </w:pPr>
             <w:r>
               <w:rPr>
-                <w:rFonts w:ascii="TH Sarabun PSK" w:hAnsi="TH Sarabun PSK" w:eastAsia="TH Sarabun PSK" w:cs="TH Sarabun PSK"/>
+                <w:rFonts w:ascii="TH Sarabun PSK" w:hAnsi="TH Sarabun PSK"/>
                 <w:b w:val="0"/>
-                <w:sz w:val="22"/>
+                <w:i w:val="0"/>
+                <w:sz w:val="27"/>
+                <w:rFonts w:ascii="TH Sarabun PSK" w:hAnsi="TH Sarabun PSK" w:cs="TH Sarabun PSK"/>
               </w:rPr>
               <w:t>๒.</w:t>
             </w:r>
@@ -2627,12 +2630,12 @@
         </w:tc>
         <w:tc>
           <w:tcPr>
-            <w:tcW w:type="dxa" w:w="4032"/>
+            <w:tcW w:type="dxa" w:w="3312"/>
             <w:tcBorders>
-              <w:top w:val="single" w:color="000000" w:sz="4"/>
-              <w:left w:val="single" w:color="000000" w:sz="4"/>
-              <w:bottom w:val="single" w:color="000000" w:sz="4"/>
-              <w:right w:val="single" w:color="000000" w:sz="4"/>
+              <w:top w:val="single" w:sz="4" w:color="000000"/>
+              <w:left w:val="single" w:sz="4" w:color="000000"/>
+              <w:bottom w:val="single" w:sz="4" w:color="000000"/>
+              <w:right w:val="single" w:sz="4" w:color="000000"/>
             </w:tcBorders>
           </w:tcPr>
           <w:p>
@@ -2641,9 +2644,11 @@
             </w:pPr>
             <w:r>
               <w:rPr>
-                <w:rFonts w:ascii="TH Sarabun PSK" w:hAnsi="TH Sarabun PSK" w:eastAsia="TH Sarabun PSK" w:cs="TH Sarabun PSK"/>
+                <w:rFonts w:ascii="TH Sarabun PSK" w:hAnsi="TH Sarabun PSK"/>
                 <w:b w:val="0"/>
-                <w:sz w:val="22"/>
+                <w:i w:val="0"/>
+                <w:sz w:val="27"/>
+                <w:rFonts w:ascii="TH Sarabun PSK" w:hAnsi="TH Sarabun PSK" w:cs="TH Sarabun PSK"/>
               </w:rPr>
               <w:t>ผ้าคลุมฐานกล้องเล็ง</w:t>
             </w:r>
@@ -2651,12 +2656,12 @@
         </w:tc>
         <w:tc>
           <w:tcPr>
-            <w:tcW w:type="dxa" w:w="3456"/>
+            <w:tcW w:type="dxa" w:w="2880"/>
             <w:tcBorders>
-              <w:top w:val="single" w:color="000000" w:sz="4"/>
-              <w:left w:val="single" w:color="000000" w:sz="4"/>
-              <w:bottom w:val="single" w:color="000000" w:sz="4"/>
-              <w:right w:val="single" w:color="000000" w:sz="4"/>
+              <w:top w:val="single" w:sz="4" w:color="000000"/>
+              <w:left w:val="single" w:sz="4" w:color="000000"/>
+              <w:bottom w:val="single" w:sz="4" w:color="000000"/>
+              <w:right w:val="single" w:sz="4" w:color="000000"/>
             </w:tcBorders>
           </w:tcPr>
           <w:p>
@@ -2665,9 +2670,11 @@
             </w:pPr>
             <w:r>
               <w:rPr>
-                <w:rFonts w:ascii="TH Sarabun PSK" w:hAnsi="TH Sarabun PSK" w:eastAsia="TH Sarabun PSK" w:cs="TH Sarabun PSK"/>
+                <w:rFonts w:ascii="TH Sarabun PSK" w:hAnsi="TH Sarabun PSK"/>
                 <w:b w:val="0"/>
-                <w:sz w:val="22"/>
+                <w:i w:val="0"/>
+                <w:sz w:val="27"/>
+                <w:rFonts w:ascii="TH Sarabun PSK" w:hAnsi="TH Sarabun PSK" w:cs="TH Sarabun PSK"/>
               </w:rPr>
               <w:t>๓๒๔๐ – ๐๐ – ๖๕๘ - ๒๘๒๒</w:t>
             </w:r>
@@ -2675,12 +2682,12 @@
         </w:tc>
         <w:tc>
           <w:tcPr>
-            <w:tcW w:type="dxa" w:w="2592"/>
+            <w:tcW w:type="dxa" w:w="3600"/>
             <w:tcBorders>
-              <w:top w:val="single" w:color="000000" w:sz="4"/>
-              <w:left w:val="single" w:color="000000" w:sz="4"/>
-              <w:bottom w:val="single" w:color="000000" w:sz="4"/>
-              <w:right w:val="single" w:color="000000" w:sz="4"/>
+              <w:top w:val="single" w:sz="4" w:color="000000"/>
+              <w:left w:val="single" w:sz="4" w:color="000000"/>
+              <w:bottom w:val="single" w:sz="4" w:color="000000"/>
+              <w:right w:val="single" w:sz="4" w:color="000000"/>
             </w:tcBorders>
           </w:tcPr>
           <w:p>
@@ -2689,9 +2696,11 @@
             </w:pPr>
             <w:r>
               <w:rPr>
-                <w:rFonts w:ascii="TH Sarabun PSK" w:hAnsi="TH Sarabun PSK" w:eastAsia="TH Sarabun PSK" w:cs="TH Sarabun PSK"/>
+                <w:rFonts w:ascii="TH Sarabun PSK" w:hAnsi="TH Sarabun PSK"/>
                 <w:b w:val="0"/>
-                <w:sz w:val="22"/>
+                <w:i w:val="0"/>
+                <w:sz w:val="27"/>
+                <w:rFonts w:ascii="TH Sarabun PSK" w:hAnsi="TH Sarabun PSK" w:cs="TH Sarabun PSK"/>
               </w:rPr>
               <w:t>๒๔ / ๕๑</w:t>
             </w:r>
@@ -2699,12 +2708,12 @@
         </w:tc>
         <w:tc>
           <w:tcPr>
-            <w:tcW w:type="dxa" w:w="2160"/>
+            <w:tcW w:type="dxa" w:w="2592"/>
             <w:tcBorders>
-              <w:top w:val="single" w:color="000000" w:sz="4"/>
-              <w:left w:val="single" w:color="000000" w:sz="4"/>
-              <w:bottom w:val="single" w:color="000000" w:sz="4"/>
-              <w:right w:val="single" w:color="000000" w:sz="4"/>
+              <w:top w:val="single" w:sz="4" w:color="000000"/>
+              <w:left w:val="single" w:sz="4" w:color="000000"/>
+              <w:bottom w:val="single" w:sz="4" w:color="000000"/>
+              <w:right w:val="single" w:sz="4" w:color="000000"/>
             </w:tcBorders>
           </w:tcPr>
           <w:p>
@@ -2713,9 +2722,11 @@
             </w:pPr>
             <w:r>
               <w:rPr>
-                <w:rFonts w:ascii="TH Sarabun PSK" w:hAnsi="TH Sarabun PSK" w:eastAsia="TH Sarabun PSK" w:cs="TH Sarabun PSK"/>
+                <w:rFonts w:ascii="TH Sarabun PSK" w:hAnsi="TH Sarabun PSK"/>
                 <w:b w:val="0"/>
-                <w:sz w:val="22"/>
+                <w:i w:val="0"/>
+                <w:sz w:val="27"/>
+                <w:rFonts w:ascii="TH Sarabun PSK" w:hAnsi="TH Sarabun PSK" w:cs="TH Sarabun PSK"/>
               </w:rPr>
               <w:t>๑๓ มี.ค. ๕๑</w:t>
             </w:r>
@@ -2723,12 +2734,12 @@
         </w:tc>
         <w:tc>
           <w:tcPr>
-            <w:tcW w:type="dxa" w:w="2304"/>
+            <w:tcW w:type="dxa" w:w="2592"/>
             <w:tcBorders>
-              <w:top w:val="single" w:color="000000" w:sz="4"/>
-              <w:left w:val="single" w:color="000000" w:sz="4"/>
-              <w:bottom w:val="single" w:color="000000" w:sz="4"/>
-              <w:right w:val="single" w:color="000000" w:sz="4"/>
+              <w:top w:val="single" w:sz="4" w:color="000000"/>
+              <w:left w:val="single" w:sz="4" w:color="000000"/>
+              <w:bottom w:val="single" w:sz="4" w:color="000000"/>
+              <w:right w:val="single" w:sz="4" w:color="000000"/>
             </w:tcBorders>
           </w:tcPr>
           <w:p>
@@ -2737,9 +2748,11 @@
             </w:pPr>
             <w:r>
               <w:rPr>
-                <w:rFonts w:ascii="TH Sarabun PSK" w:hAnsi="TH Sarabun PSK" w:eastAsia="TH Sarabun PSK" w:cs="TH Sarabun PSK"/>
+                <w:rFonts w:ascii="TH Sarabun PSK" w:hAnsi="TH Sarabun PSK"/>
                 <w:b w:val="0"/>
-                <w:sz w:val="22"/>
+                <w:i w:val="0"/>
+                <w:sz w:val="27"/>
+                <w:rFonts w:ascii="TH Sarabun PSK" w:hAnsi="TH Sarabun PSK" w:cs="TH Sarabun PSK"/>
               </w:rPr>
               <w:t>๑ มิ.ย. ๕๔</w:t>
             </w:r>
@@ -2747,12 +2760,12 @@
         </w:tc>
         <w:tc>
           <w:tcPr>
-            <w:tcW w:type="dxa" w:w="2880"/>
+            <w:tcW w:type="dxa" w:w="2736"/>
             <w:tcBorders>
-              <w:top w:val="single" w:color="000000" w:sz="4"/>
-              <w:left w:val="single" w:color="000000" w:sz="4"/>
-              <w:bottom w:val="single" w:color="000000" w:sz="4"/>
-              <w:right w:val="single" w:color="000000" w:sz="4"/>
+              <w:top w:val="single" w:sz="4" w:color="000000"/>
+              <w:left w:val="single" w:sz="4" w:color="000000"/>
+              <w:bottom w:val="single" w:sz="4" w:color="000000"/>
+              <w:right w:val="single" w:sz="4" w:color="000000"/>
             </w:tcBorders>
           </w:tcPr>
           <w:p>
@@ -2761,9 +2774,11 @@
             </w:pPr>
             <w:r>
               <w:rPr>
-                <w:rFonts w:ascii="TH Sarabun PSK" w:hAnsi="TH Sarabun PSK" w:eastAsia="TH Sarabun PSK" w:cs="TH Sarabun PSK"/>
+                <w:rFonts w:ascii="TH Sarabun PSK" w:hAnsi="TH Sarabun PSK"/>
                 <w:b w:val="0"/>
-                <w:sz w:val="22"/>
+                <w:i w:val="0"/>
+                <w:sz w:val="27"/>
+                <w:rFonts w:ascii="TH Sarabun PSK" w:hAnsi="TH Sarabun PSK" w:cs="TH Sarabun PSK"/>
               </w:rPr>
             </w:r>
           </w:p>
@@ -2772,12 +2787,12 @@
       <w:tr>
         <w:tc>
           <w:tcPr>
-            <w:tcW w:type="dxa" w:w="864"/>
+            <w:tcW w:type="dxa" w:w="720"/>
             <w:tcBorders>
-              <w:top w:val="single" w:color="000000" w:sz="4"/>
-              <w:left w:val="single" w:color="000000" w:sz="4"/>
-              <w:bottom w:val="single" w:color="000000" w:sz="4"/>
-              <w:right w:val="single" w:color="000000" w:sz="4"/>
+              <w:top w:val="single" w:sz="4" w:color="000000"/>
+              <w:left w:val="single" w:sz="4" w:color="000000"/>
+              <w:bottom w:val="single" w:sz="4" w:color="000000"/>
+              <w:right w:val="single" w:sz="4" w:color="000000"/>
             </w:tcBorders>
           </w:tcPr>
           <w:p>
@@ -2786,9 +2801,11 @@
             </w:pPr>
             <w:r>
               <w:rPr>
-                <w:rFonts w:ascii="TH Sarabun PSK" w:hAnsi="TH Sarabun PSK" w:eastAsia="TH Sarabun PSK" w:cs="TH Sarabun PSK"/>
+                <w:rFonts w:ascii="TH Sarabun PSK" w:hAnsi="TH Sarabun PSK"/>
                 <w:b w:val="0"/>
-                <w:sz w:val="22"/>
+                <w:i w:val="0"/>
+                <w:sz w:val="27"/>
+                <w:rFonts w:ascii="TH Sarabun PSK" w:hAnsi="TH Sarabun PSK" w:cs="TH Sarabun PSK"/>
               </w:rPr>
               <w:t>๓.</w:t>
             </w:r>
@@ -2796,12 +2813,12 @@
         </w:tc>
         <w:tc>
           <w:tcPr>
-            <w:tcW w:type="dxa" w:w="4032"/>
+            <w:tcW w:type="dxa" w:w="3312"/>
             <w:tcBorders>
-              <w:top w:val="single" w:color="000000" w:sz="4"/>
-              <w:left w:val="single" w:color="000000" w:sz="4"/>
-              <w:bottom w:val="single" w:color="000000" w:sz="4"/>
-              <w:right w:val="single" w:color="000000" w:sz="4"/>
+              <w:top w:val="single" w:sz="4" w:color="000000"/>
+              <w:left w:val="single" w:sz="4" w:color="000000"/>
+              <w:bottom w:val="single" w:sz="4" w:color="000000"/>
+              <w:right w:val="single" w:sz="4" w:color="000000"/>
             </w:tcBorders>
           </w:tcPr>
           <w:p>
@@ -2810,9 +2827,11 @@
             </w:pPr>
             <w:r>
               <w:rPr>
-                <w:rFonts w:ascii="TH Sarabun PSK" w:hAnsi="TH Sarabun PSK" w:eastAsia="TH Sarabun PSK" w:cs="TH Sarabun PSK"/>
+                <w:rFonts w:ascii="TH Sarabun PSK" w:hAnsi="TH Sarabun PSK"/>
                 <w:b w:val="0"/>
-                <w:sz w:val="22"/>
+                <w:i w:val="0"/>
+                <w:sz w:val="27"/>
+                <w:rFonts w:ascii="TH Sarabun PSK" w:hAnsi="TH Sarabun PSK" w:cs="TH Sarabun PSK"/>
               </w:rPr>
               <w:t>ผ้าคลุมฐานกล้องข้อศอก</w:t>
             </w:r>
@@ -2820,12 +2839,12 @@
         </w:tc>
         <w:tc>
           <w:tcPr>
-            <w:tcW w:type="dxa" w:w="3456"/>
+            <w:tcW w:type="dxa" w:w="2880"/>
             <w:tcBorders>
-              <w:top w:val="single" w:color="000000" w:sz="4"/>
-              <w:left w:val="single" w:color="000000" w:sz="4"/>
-              <w:bottom w:val="single" w:color="000000" w:sz="4"/>
-              <w:right w:val="single" w:color="000000" w:sz="4"/>
+              <w:top w:val="single" w:sz="4" w:color="000000"/>
+              <w:left w:val="single" w:sz="4" w:color="000000"/>
+              <w:bottom w:val="single" w:sz="4" w:color="000000"/>
+              <w:right w:val="single" w:sz="4" w:color="000000"/>
             </w:tcBorders>
           </w:tcPr>
           <w:p>
@@ -2834,9 +2853,11 @@
             </w:pPr>
             <w:r>
               <w:rPr>
-                <w:rFonts w:ascii="TH Sarabun PSK" w:hAnsi="TH Sarabun PSK" w:eastAsia="TH Sarabun PSK" w:cs="TH Sarabun PSK"/>
+                <w:rFonts w:ascii="TH Sarabun PSK" w:hAnsi="TH Sarabun PSK"/>
                 <w:b w:val="0"/>
-                <w:sz w:val="22"/>
+                <w:i w:val="0"/>
+                <w:sz w:val="27"/>
+                <w:rFonts w:ascii="TH Sarabun PSK" w:hAnsi="TH Sarabun PSK" w:cs="TH Sarabun PSK"/>
               </w:rPr>
               <w:t>๑๒๔๐ – ๐๐ – ๖๕๘ - ๒๘๒๓</w:t>
             </w:r>
@@ -2844,12 +2865,12 @@
         </w:tc>
         <w:tc>
           <w:tcPr>
-            <w:tcW w:type="dxa" w:w="2592"/>
+            <w:tcW w:type="dxa" w:w="3600"/>
             <w:tcBorders>
-              <w:top w:val="single" w:color="000000" w:sz="4"/>
-              <w:left w:val="single" w:color="000000" w:sz="4"/>
-              <w:bottom w:val="single" w:color="000000" w:sz="4"/>
-              <w:right w:val="single" w:color="000000" w:sz="4"/>
+              <w:top w:val="single" w:sz="4" w:color="000000"/>
+              <w:left w:val="single" w:sz="4" w:color="000000"/>
+              <w:bottom w:val="single" w:sz="4" w:color="000000"/>
+              <w:right w:val="single" w:sz="4" w:color="000000"/>
             </w:tcBorders>
           </w:tcPr>
           <w:p>
@@ -2858,9 +2879,11 @@
             </w:pPr>
             <w:r>
               <w:rPr>
-                <w:rFonts w:ascii="TH Sarabun PSK" w:hAnsi="TH Sarabun PSK" w:eastAsia="TH Sarabun PSK" w:cs="TH Sarabun PSK"/>
+                <w:rFonts w:ascii="TH Sarabun PSK" w:hAnsi="TH Sarabun PSK"/>
                 <w:b w:val="0"/>
-                <w:sz w:val="22"/>
+                <w:i w:val="0"/>
+                <w:sz w:val="27"/>
+                <w:rFonts w:ascii="TH Sarabun PSK" w:hAnsi="TH Sarabun PSK" w:cs="TH Sarabun PSK"/>
               </w:rPr>
               <w:t>๒๕ / ๕๑</w:t>
             </w:r>
@@ -2868,12 +2891,12 @@
         </w:tc>
         <w:tc>
           <w:tcPr>
-            <w:tcW w:type="dxa" w:w="2160"/>
+            <w:tcW w:type="dxa" w:w="2592"/>
             <w:tcBorders>
-              <w:top w:val="single" w:color="000000" w:sz="4"/>
-              <w:left w:val="single" w:color="000000" w:sz="4"/>
-              <w:bottom w:val="single" w:color="000000" w:sz="4"/>
-              <w:right w:val="single" w:color="000000" w:sz="4"/>
+              <w:top w:val="single" w:sz="4" w:color="000000"/>
+              <w:left w:val="single" w:sz="4" w:color="000000"/>
+              <w:bottom w:val="single" w:sz="4" w:color="000000"/>
+              <w:right w:val="single" w:sz="4" w:color="000000"/>
             </w:tcBorders>
           </w:tcPr>
           <w:p>
@@ -2882,9 +2905,11 @@
             </w:pPr>
             <w:r>
               <w:rPr>
-                <w:rFonts w:ascii="TH Sarabun PSK" w:hAnsi="TH Sarabun PSK" w:eastAsia="TH Sarabun PSK" w:cs="TH Sarabun PSK"/>
+                <w:rFonts w:ascii="TH Sarabun PSK" w:hAnsi="TH Sarabun PSK"/>
                 <w:b w:val="0"/>
-                <w:sz w:val="22"/>
+                <w:i w:val="0"/>
+                <w:sz w:val="27"/>
+                <w:rFonts w:ascii="TH Sarabun PSK" w:hAnsi="TH Sarabun PSK" w:cs="TH Sarabun PSK"/>
               </w:rPr>
               <w:t>๑๓ มี.ค. ๕๑</w:t>
             </w:r>
@@ -2892,12 +2917,12 @@
         </w:tc>
         <w:tc>
           <w:tcPr>
-            <w:tcW w:type="dxa" w:w="2304"/>
+            <w:tcW w:type="dxa" w:w="2592"/>
             <w:tcBorders>
-              <w:top w:val="single" w:color="000000" w:sz="4"/>
-              <w:left w:val="single" w:color="000000" w:sz="4"/>
-              <w:bottom w:val="single" w:color="000000" w:sz="4"/>
-              <w:right w:val="single" w:color="000000" w:sz="4"/>
+              <w:top w:val="single" w:sz="4" w:color="000000"/>
+              <w:left w:val="single" w:sz="4" w:color="000000"/>
+              <w:bottom w:val="single" w:sz="4" w:color="000000"/>
+              <w:right w:val="single" w:sz="4" w:color="000000"/>
             </w:tcBorders>
           </w:tcPr>
           <w:p>
@@ -2906,9 +2931,11 @@
             </w:pPr>
             <w:r>
               <w:rPr>
-                <w:rFonts w:ascii="TH Sarabun PSK" w:hAnsi="TH Sarabun PSK" w:eastAsia="TH Sarabun PSK" w:cs="TH Sarabun PSK"/>
+                <w:rFonts w:ascii="TH Sarabun PSK" w:hAnsi="TH Sarabun PSK"/>
                 <w:b w:val="0"/>
-                <w:sz w:val="22"/>
+                <w:i w:val="0"/>
+                <w:sz w:val="27"/>
+                <w:rFonts w:ascii="TH Sarabun PSK" w:hAnsi="TH Sarabun PSK" w:cs="TH Sarabun PSK"/>
               </w:rPr>
               <w:t>๑ มิ.ย. ๕๔</w:t>
             </w:r>
@@ -2916,12 +2943,12 @@
         </w:tc>
         <w:tc>
           <w:tcPr>
-            <w:tcW w:type="dxa" w:w="2880"/>
+            <w:tcW w:type="dxa" w:w="2736"/>
             <w:tcBorders>
-              <w:top w:val="single" w:color="000000" w:sz="4"/>
-              <w:left w:val="single" w:color="000000" w:sz="4"/>
-              <w:bottom w:val="single" w:color="000000" w:sz="4"/>
-              <w:right w:val="single" w:color="000000" w:sz="4"/>
+              <w:top w:val="single" w:sz="4" w:color="000000"/>
+              <w:left w:val="single" w:sz="4" w:color="000000"/>
+              <w:bottom w:val="single" w:sz="4" w:color="000000"/>
+              <w:right w:val="single" w:sz="4" w:color="000000"/>
             </w:tcBorders>
           </w:tcPr>
           <w:p>
@@ -2930,9 +2957,11 @@
             </w:pPr>
             <w:r>
               <w:rPr>
-                <w:rFonts w:ascii="TH Sarabun PSK" w:hAnsi="TH Sarabun PSK" w:eastAsia="TH Sarabun PSK" w:cs="TH Sarabun PSK"/>
+                <w:rFonts w:ascii="TH Sarabun PSK" w:hAnsi="TH Sarabun PSK"/>
                 <w:b w:val="0"/>
-                <w:sz w:val="22"/>
+                <w:i w:val="0"/>
+                <w:sz w:val="27"/>
+                <w:rFonts w:ascii="TH Sarabun PSK" w:hAnsi="TH Sarabun PSK" w:cs="TH Sarabun PSK"/>
               </w:rPr>
             </w:r>
           </w:p>
@@ -2941,36 +2970,48 @@
       <w:tr>
         <w:tc>
           <w:tcPr>
-            <w:tcW w:type="dxa" w:w="864"/>
+            <w:tcW w:type="dxa" w:w="720"/>
             <w:tcBorders>
-              <w:top w:val="single" w:color="000000" w:sz="4"/>
-              <w:left w:val="single" w:color="000000" w:sz="4"/>
-              <w:bottom w:val="single" w:color="000000" w:sz="4"/>
-              <w:right w:val="single" w:color="000000" w:sz="4"/>
+              <w:top w:val="single" w:sz="4" w:color="000000"/>
+              <w:left w:val="single" w:sz="4" w:color="000000"/>
+              <w:bottom w:val="single" w:sz="4" w:color="000000"/>
+              <w:right w:val="single" w:sz="4" w:color="000000"/>
             </w:tcBorders>
           </w:tcPr>
           <w:p/>
         </w:tc>
         <w:tc>
           <w:tcPr>
-            <w:tcW w:type="dxa" w:w="4032"/>
+            <w:tcW w:type="dxa" w:w="3312"/>
             <w:tcBorders>
-              <w:top w:val="single" w:color="000000" w:sz="4"/>
-              <w:left w:val="single" w:color="000000" w:sz="4"/>
-              <w:bottom w:val="single" w:color="000000" w:sz="4"/>
-              <w:right w:val="single" w:color="000000" w:sz="4"/>
+              <w:top w:val="single" w:sz="4" w:color="000000"/>
+              <w:left w:val="single" w:sz="4" w:color="000000"/>
+              <w:bottom w:val="single" w:sz="4" w:color="000000"/>
+              <w:right w:val="single" w:sz="4" w:color="000000"/>
             </w:tcBorders>
           </w:tcPr>
           <w:p/>
         </w:tc>
         <w:tc>
           <w:tcPr>
-            <w:tcW w:type="dxa" w:w="3456"/>
+            <w:tcW w:type="dxa" w:w="2880"/>
             <w:tcBorders>
-              <w:top w:val="single" w:color="000000" w:sz="4"/>
-              <w:left w:val="single" w:color="000000" w:sz="4"/>
-              <w:bottom w:val="single" w:color="000000" w:sz="4"/>
-              <w:right w:val="single" w:color="000000" w:sz="4"/>
+              <w:top w:val="single" w:sz="4" w:color="000000"/>
+              <w:left w:val="single" w:sz="4" w:color="000000"/>
+              <w:bottom w:val="single" w:sz="4" w:color="000000"/>
+              <w:right w:val="single" w:sz="4" w:color="000000"/>
+            </w:tcBorders>
+          </w:tcPr>
+          <w:p/>
+        </w:tc>
+        <w:tc>
+          <w:tcPr>
+            <w:tcW w:type="dxa" w:w="3600"/>
+            <w:tcBorders>
+              <w:top w:val="single" w:sz="4" w:color="000000"/>
+              <w:left w:val="single" w:sz="4" w:color="000000"/>
+              <w:bottom w:val="single" w:sz="4" w:color="000000"/>
+              <w:right w:val="single" w:sz="4" w:color="000000"/>
             </w:tcBorders>
           </w:tcPr>
           <w:p/>
@@ -2979,34 +3020,60 @@
           <w:tcPr>
             <w:tcW w:type="dxa" w:w="2592"/>
             <w:tcBorders>
-              <w:top w:val="single" w:color="000000" w:sz="4"/>
-              <w:left w:val="single" w:color="000000" w:sz="4"/>
-              <w:bottom w:val="single" w:color="000000" w:sz="4"/>
-              <w:right w:val="single" w:color="000000" w:sz="4"/>
+              <w:top w:val="single" w:sz="4" w:color="000000"/>
+              <w:left w:val="single" w:sz="4" w:color="000000"/>
+              <w:bottom w:val="single" w:sz="4" w:color="000000"/>
+              <w:right w:val="single" w:sz="4" w:color="000000"/>
             </w:tcBorders>
           </w:tcPr>
           <w:p/>
         </w:tc>
         <w:tc>
           <w:tcPr>
-            <w:tcW w:type="dxa" w:w="2160"/>
+            <w:tcW w:type="dxa" w:w="2592"/>
             <w:tcBorders>
-              <w:top w:val="single" w:color="000000" w:sz="4"/>
-              <w:left w:val="single" w:color="000000" w:sz="4"/>
-              <w:bottom w:val="single" w:color="000000" w:sz="4"/>
-              <w:right w:val="single" w:color="000000" w:sz="4"/>
+              <w:top w:val="single" w:sz="4" w:color="000000"/>
+              <w:left w:val="single" w:sz="4" w:color="000000"/>
+              <w:bottom w:val="single" w:sz="4" w:color="000000"/>
+              <w:right w:val="single" w:sz="4" w:color="000000"/>
             </w:tcBorders>
           </w:tcPr>
           <w:p/>
         </w:tc>
         <w:tc>
           <w:tcPr>
-            <w:tcW w:type="dxa" w:w="2304"/>
+            <w:tcW w:type="dxa" w:w="2736"/>
             <w:tcBorders>
-              <w:top w:val="single" w:color="000000" w:sz="4"/>
-              <w:left w:val="single" w:color="000000" w:sz="4"/>
-              <w:bottom w:val="single" w:color="000000" w:sz="4"/>
-              <w:right w:val="single" w:color="000000" w:sz="4"/>
+              <w:top w:val="single" w:sz="4" w:color="000000"/>
+              <w:left w:val="single" w:sz="4" w:color="000000"/>
+              <w:bottom w:val="single" w:sz="4" w:color="000000"/>
+              <w:right w:val="single" w:sz="4" w:color="000000"/>
+            </w:tcBorders>
+          </w:tcPr>
+          <w:p/>
+        </w:tc>
+      </w:tr>
+      <w:tr>
+        <w:tc>
+          <w:tcPr>
+            <w:tcW w:type="dxa" w:w="720"/>
+            <w:tcBorders>
+              <w:top w:val="single" w:sz="4" w:color="000000"/>
+              <w:left w:val="single" w:sz="4" w:color="000000"/>
+              <w:bottom w:val="single" w:sz="4" w:color="000000"/>
+              <w:right w:val="single" w:sz="4" w:color="000000"/>
+            </w:tcBorders>
+          </w:tcPr>
+          <w:p/>
+        </w:tc>
+        <w:tc>
+          <w:tcPr>
+            <w:tcW w:type="dxa" w:w="3312"/>
+            <w:tcBorders>
+              <w:top w:val="single" w:sz="4" w:color="000000"/>
+              <w:left w:val="single" w:sz="4" w:color="000000"/>
+              <w:bottom w:val="single" w:sz="4" w:color="000000"/>
+              <w:right w:val="single" w:sz="4" w:color="000000"/>
             </w:tcBorders>
           </w:tcPr>
           <w:p/>
@@ -3015,10 +3082,58 @@
           <w:tcPr>
             <w:tcW w:type="dxa" w:w="2880"/>
             <w:tcBorders>
-              <w:top w:val="single" w:color="000000" w:sz="4"/>
-              <w:left w:val="single" w:color="000000" w:sz="4"/>
-              <w:bottom w:val="single" w:color="000000" w:sz="4"/>
-              <w:right w:val="single" w:color="000000" w:sz="4"/>
+              <w:top w:val="single" w:sz="4" w:color="000000"/>
+              <w:left w:val="single" w:sz="4" w:color="000000"/>
+              <w:bottom w:val="single" w:sz="4" w:color="000000"/>
+              <w:right w:val="single" w:sz="4" w:color="000000"/>
+            </w:tcBorders>
+          </w:tcPr>
+          <w:p/>
+        </w:tc>
+        <w:tc>
+          <w:tcPr>
+            <w:tcW w:type="dxa" w:w="3600"/>
+            <w:tcBorders>
+              <w:top w:val="single" w:sz="4" w:color="000000"/>
+              <w:left w:val="single" w:sz="4" w:color="000000"/>
+              <w:bottom w:val="single" w:sz="4" w:color="000000"/>
+              <w:right w:val="single" w:sz="4" w:color="000000"/>
+            </w:tcBorders>
+          </w:tcPr>
+          <w:p/>
+        </w:tc>
+        <w:tc>
+          <w:tcPr>
+            <w:tcW w:type="dxa" w:w="2592"/>
+            <w:tcBorders>
+              <w:top w:val="single" w:sz="4" w:color="000000"/>
+              <w:left w:val="single" w:sz="4" w:color="000000"/>
+              <w:bottom w:val="single" w:sz="4" w:color="000000"/>
+              <w:right w:val="single" w:sz="4" w:color="000000"/>
+            </w:tcBorders>
+          </w:tcPr>
+          <w:p/>
+        </w:tc>
+        <w:tc>
+          <w:tcPr>
+            <w:tcW w:type="dxa" w:w="2592"/>
+            <w:tcBorders>
+              <w:top w:val="single" w:sz="4" w:color="000000"/>
+              <w:left w:val="single" w:sz="4" w:color="000000"/>
+              <w:bottom w:val="single" w:sz="4" w:color="000000"/>
+              <w:right w:val="single" w:sz="4" w:color="000000"/>
+            </w:tcBorders>
+          </w:tcPr>
+          <w:p/>
+        </w:tc>
+        <w:tc>
+          <w:tcPr>
+            <w:tcW w:type="dxa" w:w="2736"/>
+            <w:tcBorders>
+              <w:top w:val="single" w:sz="4" w:color="000000"/>
+              <w:left w:val="single" w:sz="4" w:color="000000"/>
+              <w:bottom w:val="single" w:sz="4" w:color="000000"/>
+              <w:right w:val="single" w:sz="4" w:color="000000"/>
             </w:tcBorders>
           </w:tcPr>
           <w:p/>
@@ -3027,36 +3142,48 @@
       <w:tr>
         <w:tc>
           <w:tcPr>
-            <w:tcW w:type="dxa" w:w="864"/>
+            <w:tcW w:type="dxa" w:w="720"/>
             <w:tcBorders>
-              <w:top w:val="single" w:color="000000" w:sz="4"/>
-              <w:left w:val="single" w:color="000000" w:sz="4"/>
-              <w:bottom w:val="single" w:color="000000" w:sz="4"/>
-              <w:right w:val="single" w:color="000000" w:sz="4"/>
+              <w:top w:val="single" w:sz="4" w:color="000000"/>
+              <w:left w:val="single" w:sz="4" w:color="000000"/>
+              <w:bottom w:val="single" w:sz="4" w:color="000000"/>
+              <w:right w:val="single" w:sz="4" w:color="000000"/>
             </w:tcBorders>
           </w:tcPr>
           <w:p/>
         </w:tc>
         <w:tc>
           <w:tcPr>
-            <w:tcW w:type="dxa" w:w="4032"/>
+            <w:tcW w:type="dxa" w:w="3312"/>
             <w:tcBorders>
-              <w:top w:val="single" w:color="000000" w:sz="4"/>
-              <w:left w:val="single" w:color="000000" w:sz="4"/>
-              <w:bottom w:val="single" w:color="000000" w:sz="4"/>
-              <w:right w:val="single" w:color="000000" w:sz="4"/>
+              <w:top w:val="single" w:sz="4" w:color="000000"/>
+              <w:left w:val="single" w:sz="4" w:color="000000"/>
+              <w:bottom w:val="single" w:sz="4" w:color="000000"/>
+              <w:right w:val="single" w:sz="4" w:color="000000"/>
             </w:tcBorders>
           </w:tcPr>
           <w:p/>
         </w:tc>
         <w:tc>
           <w:tcPr>
-            <w:tcW w:type="dxa" w:w="3456"/>
+            <w:tcW w:type="dxa" w:w="2880"/>
             <w:tcBorders>
-              <w:top w:val="single" w:color="000000" w:sz="4"/>
-              <w:left w:val="single" w:color="000000" w:sz="4"/>
-              <w:bottom w:val="single" w:color="000000" w:sz="4"/>
-              <w:right w:val="single" w:color="000000" w:sz="4"/>
+              <w:top w:val="single" w:sz="4" w:color="000000"/>
+              <w:left w:val="single" w:sz="4" w:color="000000"/>
+              <w:bottom w:val="single" w:sz="4" w:color="000000"/>
+              <w:right w:val="single" w:sz="4" w:color="000000"/>
+            </w:tcBorders>
+          </w:tcPr>
+          <w:p/>
+        </w:tc>
+        <w:tc>
+          <w:tcPr>
+            <w:tcW w:type="dxa" w:w="3600"/>
+            <w:tcBorders>
+              <w:top w:val="single" w:sz="4" w:color="000000"/>
+              <w:left w:val="single" w:sz="4" w:color="000000"/>
+              <w:bottom w:val="single" w:sz="4" w:color="000000"/>
+              <w:right w:val="single" w:sz="4" w:color="000000"/>
             </w:tcBorders>
           </w:tcPr>
           <w:p/>
@@ -3065,34 +3192,60 @@
           <w:tcPr>
             <w:tcW w:type="dxa" w:w="2592"/>
             <w:tcBorders>
-              <w:top w:val="single" w:color="000000" w:sz="4"/>
-              <w:left w:val="single" w:color="000000" w:sz="4"/>
-              <w:bottom w:val="single" w:color="000000" w:sz="4"/>
-              <w:right w:val="single" w:color="000000" w:sz="4"/>
+              <w:top w:val="single" w:sz="4" w:color="000000"/>
+              <w:left w:val="single" w:sz="4" w:color="000000"/>
+              <w:bottom w:val="single" w:sz="4" w:color="000000"/>
+              <w:right w:val="single" w:sz="4" w:color="000000"/>
             </w:tcBorders>
           </w:tcPr>
           <w:p/>
         </w:tc>
         <w:tc>
           <w:tcPr>
-            <w:tcW w:type="dxa" w:w="2160"/>
+            <w:tcW w:type="dxa" w:w="2592"/>
             <w:tcBorders>
-              <w:top w:val="single" w:color="000000" w:sz="4"/>
-              <w:left w:val="single" w:color="000000" w:sz="4"/>
-              <w:bottom w:val="single" w:color="000000" w:sz="4"/>
-              <w:right w:val="single" w:color="000000" w:sz="4"/>
+              <w:top w:val="single" w:sz="4" w:color="000000"/>
+              <w:left w:val="single" w:sz="4" w:color="000000"/>
+              <w:bottom w:val="single" w:sz="4" w:color="000000"/>
+              <w:right w:val="single" w:sz="4" w:color="000000"/>
             </w:tcBorders>
           </w:tcPr>
           <w:p/>
         </w:tc>
         <w:tc>
           <w:tcPr>
-            <w:tcW w:type="dxa" w:w="2304"/>
+            <w:tcW w:type="dxa" w:w="2736"/>
             <w:tcBorders>
-              <w:top w:val="single" w:color="000000" w:sz="4"/>
-              <w:left w:val="single" w:color="000000" w:sz="4"/>
-              <w:bottom w:val="single" w:color="000000" w:sz="4"/>
-              <w:right w:val="single" w:color="000000" w:sz="4"/>
+              <w:top w:val="single" w:sz="4" w:color="000000"/>
+              <w:left w:val="single" w:sz="4" w:color="000000"/>
+              <w:bottom w:val="single" w:sz="4" w:color="000000"/>
+              <w:right w:val="single" w:sz="4" w:color="000000"/>
+            </w:tcBorders>
+          </w:tcPr>
+          <w:p/>
+        </w:tc>
+      </w:tr>
+      <w:tr>
+        <w:tc>
+          <w:tcPr>
+            <w:tcW w:type="dxa" w:w="720"/>
+            <w:tcBorders>
+              <w:top w:val="single" w:sz="4" w:color="000000"/>
+              <w:left w:val="single" w:sz="4" w:color="000000"/>
+              <w:bottom w:val="single" w:sz="4" w:color="000000"/>
+              <w:right w:val="single" w:sz="4" w:color="000000"/>
+            </w:tcBorders>
+          </w:tcPr>
+          <w:p/>
+        </w:tc>
+        <w:tc>
+          <w:tcPr>
+            <w:tcW w:type="dxa" w:w="3312"/>
+            <w:tcBorders>
+              <w:top w:val="single" w:sz="4" w:color="000000"/>
+              <w:left w:val="single" w:sz="4" w:color="000000"/>
+              <w:bottom w:val="single" w:sz="4" w:color="000000"/>
+              <w:right w:val="single" w:sz="4" w:color="000000"/>
             </w:tcBorders>
           </w:tcPr>
           <w:p/>
@@ -3101,48 +3254,22 @@
           <w:tcPr>
             <w:tcW w:type="dxa" w:w="2880"/>
             <w:tcBorders>
-              <w:top w:val="single" w:color="000000" w:sz="4"/>
-              <w:left w:val="single" w:color="000000" w:sz="4"/>
-              <w:bottom w:val="single" w:color="000000" w:sz="4"/>
-              <w:right w:val="single" w:color="000000" w:sz="4"/>
-            </w:tcBorders>
-          </w:tcPr>
-          <w:p/>
-        </w:tc>
-      </w:tr>
-      <w:tr>
-        <w:tc>
-          <w:tcPr>
-            <w:tcW w:type="dxa" w:w="864"/>
-            <w:tcBorders>
-              <w:top w:val="single" w:color="000000" w:sz="4"/>
-              <w:left w:val="single" w:color="000000" w:sz="4"/>
-              <w:bottom w:val="single" w:color="000000" w:sz="4"/>
-              <w:right w:val="single" w:color="000000" w:sz="4"/>
+              <w:top w:val="single" w:sz="4" w:color="000000"/>
+              <w:left w:val="single" w:sz="4" w:color="000000"/>
+              <w:bottom w:val="single" w:sz="4" w:color="000000"/>
+              <w:right w:val="single" w:sz="4" w:color="000000"/>
             </w:tcBorders>
           </w:tcPr>
           <w:p/>
         </w:tc>
         <w:tc>
           <w:tcPr>
-            <w:tcW w:type="dxa" w:w="4032"/>
+            <w:tcW w:type="dxa" w:w="3600"/>
             <w:tcBorders>
-              <w:top w:val="single" w:color="000000" w:sz="4"/>
-              <w:left w:val="single" w:color="000000" w:sz="4"/>
-              <w:bottom w:val="single" w:color="000000" w:sz="4"/>
-              <w:right w:val="single" w:color="000000" w:sz="4"/>
-            </w:tcBorders>
-          </w:tcPr>
-          <w:p/>
-        </w:tc>
-        <w:tc>
-          <w:tcPr>
-            <w:tcW w:type="dxa" w:w="3456"/>
-            <w:tcBorders>
-              <w:top w:val="single" w:color="000000" w:sz="4"/>
-              <w:left w:val="single" w:color="000000" w:sz="4"/>
-              <w:bottom w:val="single" w:color="000000" w:sz="4"/>
-              <w:right w:val="single" w:color="000000" w:sz="4"/>
+              <w:top w:val="single" w:sz="4" w:color="000000"/>
+              <w:left w:val="single" w:sz="4" w:color="000000"/>
+              <w:bottom w:val="single" w:sz="4" w:color="000000"/>
+              <w:right w:val="single" w:sz="4" w:color="000000"/>
             </w:tcBorders>
           </w:tcPr>
           <w:p/>
@@ -3151,84 +3278,10 @@
           <w:tcPr>
             <w:tcW w:type="dxa" w:w="2592"/>
             <w:tcBorders>
-              <w:top w:val="single" w:color="000000" w:sz="4"/>
-              <w:left w:val="single" w:color="000000" w:sz="4"/>
-              <w:bottom w:val="single" w:color="000000" w:sz="4"/>
-              <w:right w:val="single" w:color="000000" w:sz="4"/>
-            </w:tcBorders>
-          </w:tcPr>
-          <w:p/>
-        </w:tc>
-        <w:tc>
-          <w:tcPr>
-            <w:tcW w:type="dxa" w:w="2160"/>
-            <w:tcBorders>
-              <w:top w:val="single" w:color="000000" w:sz="4"/>
-              <w:left w:val="single" w:color="000000" w:sz="4"/>
-              <w:bottom w:val="single" w:color="000000" w:sz="4"/>
-              <w:right w:val="single" w:color="000000" w:sz="4"/>
-            </w:tcBorders>
-          </w:tcPr>
-          <w:p/>
-        </w:tc>
-        <w:tc>
-          <w:tcPr>
-            <w:tcW w:type="dxa" w:w="2304"/>
-            <w:tcBorders>
-              <w:top w:val="single" w:color="000000" w:sz="4"/>
-              <w:left w:val="single" w:color="000000" w:sz="4"/>
-              <w:bottom w:val="single" w:color="000000" w:sz="4"/>
-              <w:right w:val="single" w:color="000000" w:sz="4"/>
-            </w:tcBorders>
-          </w:tcPr>
-          <w:p/>
-        </w:tc>
-        <w:tc>
-          <w:tcPr>
-            <w:tcW w:type="dxa" w:w="2880"/>
-            <w:tcBorders>
-              <w:top w:val="single" w:color="000000" w:sz="4"/>
-              <w:left w:val="single" w:color="000000" w:sz="4"/>
-              <w:bottom w:val="single" w:color="000000" w:sz="4"/>
-              <w:right w:val="single" w:color="000000" w:sz="4"/>
-            </w:tcBorders>
-          </w:tcPr>
-          <w:p/>
-        </w:tc>
-      </w:tr>
-      <w:tr>
-        <w:tc>
-          <w:tcPr>
-            <w:tcW w:type="dxa" w:w="864"/>
-            <w:tcBorders>
-              <w:top w:val="single" w:color="000000" w:sz="4"/>
-              <w:left w:val="single" w:color="000000" w:sz="4"/>
-              <w:bottom w:val="single" w:color="000000" w:sz="4"/>
-              <w:right w:val="single" w:color="000000" w:sz="4"/>
-            </w:tcBorders>
-          </w:tcPr>
-          <w:p/>
-        </w:tc>
-        <w:tc>
-          <w:tcPr>
-            <w:tcW w:type="dxa" w:w="4032"/>
-            <w:tcBorders>
-              <w:top w:val="single" w:color="000000" w:sz="4"/>
-              <w:left w:val="single" w:color="000000" w:sz="4"/>
-              <w:bottom w:val="single" w:color="000000" w:sz="4"/>
-              <w:right w:val="single" w:color="000000" w:sz="4"/>
-            </w:tcBorders>
-          </w:tcPr>
-          <w:p/>
-        </w:tc>
-        <w:tc>
-          <w:tcPr>
-            <w:tcW w:type="dxa" w:w="3456"/>
-            <w:tcBorders>
-              <w:top w:val="single" w:color="000000" w:sz="4"/>
-              <w:left w:val="single" w:color="000000" w:sz="4"/>
-              <w:bottom w:val="single" w:color="000000" w:sz="4"/>
-              <w:right w:val="single" w:color="000000" w:sz="4"/>
+              <w:top w:val="single" w:sz="4" w:color="000000"/>
+              <w:left w:val="single" w:sz="4" w:color="000000"/>
+              <w:bottom w:val="single" w:sz="4" w:color="000000"/>
+              <w:right w:val="single" w:sz="4" w:color="000000"/>
             </w:tcBorders>
           </w:tcPr>
           <w:p/>
@@ -3237,304 +3290,22 @@
           <w:tcPr>
             <w:tcW w:type="dxa" w:w="2592"/>
             <w:tcBorders>
-              <w:top w:val="single" w:color="000000" w:sz="4"/>
-              <w:left w:val="single" w:color="000000" w:sz="4"/>
-              <w:bottom w:val="single" w:color="000000" w:sz="4"/>
-              <w:right w:val="single" w:color="000000" w:sz="4"/>
+              <w:top w:val="single" w:sz="4" w:color="000000"/>
+              <w:left w:val="single" w:sz="4" w:color="000000"/>
+              <w:bottom w:val="single" w:sz="4" w:color="000000"/>
+              <w:right w:val="single" w:sz="4" w:color="000000"/>
             </w:tcBorders>
           </w:tcPr>
           <w:p/>
         </w:tc>
         <w:tc>
           <w:tcPr>
-            <w:tcW w:type="dxa" w:w="2160"/>
+            <w:tcW w:type="dxa" w:w="2736"/>
             <w:tcBorders>
-              <w:top w:val="single" w:color="000000" w:sz="4"/>
-              <w:left w:val="single" w:color="000000" w:sz="4"/>
-              <w:bottom w:val="single" w:color="000000" w:sz="4"/>
-              <w:right w:val="single" w:color="000000" w:sz="4"/>
-            </w:tcBorders>
-          </w:tcPr>
-          <w:p/>
-        </w:tc>
-        <w:tc>
-          <w:tcPr>
-            <w:tcW w:type="dxa" w:w="2304"/>
-            <w:tcBorders>
-              <w:top w:val="single" w:color="000000" w:sz="4"/>
-              <w:left w:val="single" w:color="000000" w:sz="4"/>
-              <w:bottom w:val="single" w:color="000000" w:sz="4"/>
-              <w:right w:val="single" w:color="000000" w:sz="4"/>
-            </w:tcBorders>
-          </w:tcPr>
-          <w:p/>
-        </w:tc>
-        <w:tc>
-          <w:tcPr>
-            <w:tcW w:type="dxa" w:w="2880"/>
-            <w:tcBorders>
-              <w:top w:val="single" w:color="000000" w:sz="4"/>
-              <w:left w:val="single" w:color="000000" w:sz="4"/>
-              <w:bottom w:val="single" w:color="000000" w:sz="4"/>
-              <w:right w:val="single" w:color="000000" w:sz="4"/>
-            </w:tcBorders>
-          </w:tcPr>
-          <w:p/>
-        </w:tc>
-      </w:tr>
-      <w:tr>
-        <w:tc>
-          <w:tcPr>
-            <w:tcW w:type="dxa" w:w="864"/>
-            <w:tcBorders>
-              <w:top w:val="single" w:color="000000" w:sz="4"/>
-              <w:left w:val="single" w:color="000000" w:sz="4"/>
-              <w:bottom w:val="single" w:color="000000" w:sz="4"/>
-              <w:right w:val="single" w:color="000000" w:sz="4"/>
-            </w:tcBorders>
-          </w:tcPr>
-          <w:p/>
-        </w:tc>
-        <w:tc>
-          <w:tcPr>
-            <w:tcW w:type="dxa" w:w="4032"/>
-            <w:tcBorders>
-              <w:top w:val="single" w:color="000000" w:sz="4"/>
-              <w:left w:val="single" w:color="000000" w:sz="4"/>
-              <w:bottom w:val="single" w:color="000000" w:sz="4"/>
-              <w:right w:val="single" w:color="000000" w:sz="4"/>
-            </w:tcBorders>
-          </w:tcPr>
-          <w:p/>
-        </w:tc>
-        <w:tc>
-          <w:tcPr>
-            <w:tcW w:type="dxa" w:w="3456"/>
-            <w:tcBorders>
-              <w:top w:val="single" w:color="000000" w:sz="4"/>
-              <w:left w:val="single" w:color="000000" w:sz="4"/>
-              <w:bottom w:val="single" w:color="000000" w:sz="4"/>
-              <w:right w:val="single" w:color="000000" w:sz="4"/>
-            </w:tcBorders>
-          </w:tcPr>
-          <w:p/>
-        </w:tc>
-        <w:tc>
-          <w:tcPr>
-            <w:tcW w:type="dxa" w:w="2592"/>
-            <w:tcBorders>
-              <w:top w:val="single" w:color="000000" w:sz="4"/>
-              <w:left w:val="single" w:color="000000" w:sz="4"/>
-              <w:bottom w:val="single" w:color="000000" w:sz="4"/>
-              <w:right w:val="single" w:color="000000" w:sz="4"/>
-            </w:tcBorders>
-          </w:tcPr>
-          <w:p/>
-        </w:tc>
-        <w:tc>
-          <w:tcPr>
-            <w:tcW w:type="dxa" w:w="2160"/>
-            <w:tcBorders>
-              <w:top w:val="single" w:color="000000" w:sz="4"/>
-              <w:left w:val="single" w:color="000000" w:sz="4"/>
-              <w:bottom w:val="single" w:color="000000" w:sz="4"/>
-              <w:right w:val="single" w:color="000000" w:sz="4"/>
-            </w:tcBorders>
-          </w:tcPr>
-          <w:p/>
-        </w:tc>
-        <w:tc>
-          <w:tcPr>
-            <w:tcW w:type="dxa" w:w="2304"/>
-            <w:tcBorders>
-              <w:top w:val="single" w:color="000000" w:sz="4"/>
-              <w:left w:val="single" w:color="000000" w:sz="4"/>
-              <w:bottom w:val="single" w:color="000000" w:sz="4"/>
-              <w:right w:val="single" w:color="000000" w:sz="4"/>
-            </w:tcBorders>
-          </w:tcPr>
-          <w:p/>
-        </w:tc>
-        <w:tc>
-          <w:tcPr>
-            <w:tcW w:type="dxa" w:w="2880"/>
-            <w:tcBorders>
-              <w:top w:val="single" w:color="000000" w:sz="4"/>
-              <w:left w:val="single" w:color="000000" w:sz="4"/>
-              <w:bottom w:val="single" w:color="000000" w:sz="4"/>
-              <w:right w:val="single" w:color="000000" w:sz="4"/>
-            </w:tcBorders>
-          </w:tcPr>
-          <w:p/>
-        </w:tc>
-      </w:tr>
-      <w:tr>
-        <w:tc>
-          <w:tcPr>
-            <w:tcW w:type="dxa" w:w="864"/>
-            <w:tcBorders>
-              <w:top w:val="single" w:color="000000" w:sz="4"/>
-              <w:left w:val="single" w:color="000000" w:sz="4"/>
-              <w:bottom w:val="single" w:color="000000" w:sz="4"/>
-              <w:right w:val="single" w:color="000000" w:sz="4"/>
-            </w:tcBorders>
-          </w:tcPr>
-          <w:p/>
-        </w:tc>
-        <w:tc>
-          <w:tcPr>
-            <w:tcW w:type="dxa" w:w="4032"/>
-            <w:tcBorders>
-              <w:top w:val="single" w:color="000000" w:sz="4"/>
-              <w:left w:val="single" w:color="000000" w:sz="4"/>
-              <w:bottom w:val="single" w:color="000000" w:sz="4"/>
-              <w:right w:val="single" w:color="000000" w:sz="4"/>
-            </w:tcBorders>
-          </w:tcPr>
-          <w:p/>
-        </w:tc>
-        <w:tc>
-          <w:tcPr>
-            <w:tcW w:type="dxa" w:w="3456"/>
-            <w:tcBorders>
-              <w:top w:val="single" w:color="000000" w:sz="4"/>
-              <w:left w:val="single" w:color="000000" w:sz="4"/>
-              <w:bottom w:val="single" w:color="000000" w:sz="4"/>
-              <w:right w:val="single" w:color="000000" w:sz="4"/>
-            </w:tcBorders>
-          </w:tcPr>
-          <w:p/>
-        </w:tc>
-        <w:tc>
-          <w:tcPr>
-            <w:tcW w:type="dxa" w:w="2592"/>
-            <w:tcBorders>
-              <w:top w:val="single" w:color="000000" w:sz="4"/>
-              <w:left w:val="single" w:color="000000" w:sz="4"/>
-              <w:bottom w:val="single" w:color="000000" w:sz="4"/>
-              <w:right w:val="single" w:color="000000" w:sz="4"/>
-            </w:tcBorders>
-          </w:tcPr>
-          <w:p/>
-        </w:tc>
-        <w:tc>
-          <w:tcPr>
-            <w:tcW w:type="dxa" w:w="2160"/>
-            <w:tcBorders>
-              <w:top w:val="single" w:color="000000" w:sz="4"/>
-              <w:left w:val="single" w:color="000000" w:sz="4"/>
-              <w:bottom w:val="single" w:color="000000" w:sz="4"/>
-              <w:right w:val="single" w:color="000000" w:sz="4"/>
-            </w:tcBorders>
-          </w:tcPr>
-          <w:p/>
-        </w:tc>
-        <w:tc>
-          <w:tcPr>
-            <w:tcW w:type="dxa" w:w="2304"/>
-            <w:tcBorders>
-              <w:top w:val="single" w:color="000000" w:sz="4"/>
-              <w:left w:val="single" w:color="000000" w:sz="4"/>
-              <w:bottom w:val="single" w:color="000000" w:sz="4"/>
-              <w:right w:val="single" w:color="000000" w:sz="4"/>
-            </w:tcBorders>
-          </w:tcPr>
-          <w:p/>
-        </w:tc>
-        <w:tc>
-          <w:tcPr>
-            <w:tcW w:type="dxa" w:w="2880"/>
-            <w:tcBorders>
-              <w:top w:val="single" w:color="000000" w:sz="4"/>
-              <w:left w:val="single" w:color="000000" w:sz="4"/>
-              <w:bottom w:val="single" w:color="000000" w:sz="4"/>
-              <w:right w:val="single" w:color="000000" w:sz="4"/>
-            </w:tcBorders>
-          </w:tcPr>
-          <w:p/>
-        </w:tc>
-      </w:tr>
-      <w:tr>
-        <w:tc>
-          <w:tcPr>
-            <w:tcW w:type="dxa" w:w="864"/>
-            <w:tcBorders>
-              <w:top w:val="single" w:color="000000" w:sz="4"/>
-              <w:left w:val="single" w:color="000000" w:sz="4"/>
-              <w:bottom w:val="single" w:color="000000" w:sz="4"/>
-              <w:right w:val="single" w:color="000000" w:sz="4"/>
-            </w:tcBorders>
-          </w:tcPr>
-          <w:p/>
-        </w:tc>
-        <w:tc>
-          <w:tcPr>
-            <w:tcW w:type="dxa" w:w="4032"/>
-            <w:tcBorders>
-              <w:top w:val="single" w:color="000000" w:sz="4"/>
-              <w:left w:val="single" w:color="000000" w:sz="4"/>
-              <w:bottom w:val="single" w:color="000000" w:sz="4"/>
-              <w:right w:val="single" w:color="000000" w:sz="4"/>
-            </w:tcBorders>
-          </w:tcPr>
-          <w:p/>
-        </w:tc>
-        <w:tc>
-          <w:tcPr>
-            <w:tcW w:type="dxa" w:w="3456"/>
-            <w:tcBorders>
-              <w:top w:val="single" w:color="000000" w:sz="4"/>
-              <w:left w:val="single" w:color="000000" w:sz="4"/>
-              <w:bottom w:val="single" w:color="000000" w:sz="4"/>
-              <w:right w:val="single" w:color="000000" w:sz="4"/>
-            </w:tcBorders>
-          </w:tcPr>
-          <w:p/>
-        </w:tc>
-        <w:tc>
-          <w:tcPr>
-            <w:tcW w:type="dxa" w:w="2592"/>
-            <w:tcBorders>
-              <w:top w:val="single" w:color="000000" w:sz="4"/>
-              <w:left w:val="single" w:color="000000" w:sz="4"/>
-              <w:bottom w:val="single" w:color="000000" w:sz="4"/>
-              <w:right w:val="single" w:color="000000" w:sz="4"/>
-            </w:tcBorders>
-          </w:tcPr>
-          <w:p/>
-        </w:tc>
-        <w:tc>
-          <w:tcPr>
-            <w:tcW w:type="dxa" w:w="2160"/>
-            <w:tcBorders>
-              <w:top w:val="single" w:color="000000" w:sz="4"/>
-              <w:left w:val="single" w:color="000000" w:sz="4"/>
-              <w:bottom w:val="single" w:color="000000" w:sz="4"/>
-              <w:right w:val="single" w:color="000000" w:sz="4"/>
-            </w:tcBorders>
-          </w:tcPr>
-          <w:p/>
-        </w:tc>
-        <w:tc>
-          <w:tcPr>
-            <w:tcW w:type="dxa" w:w="2304"/>
-            <w:tcBorders>
-              <w:top w:val="single" w:color="000000" w:sz="4"/>
-              <w:left w:val="single" w:color="000000" w:sz="4"/>
-              <w:bottom w:val="single" w:color="000000" w:sz="4"/>
-              <w:right w:val="single" w:color="000000" w:sz="4"/>
-            </w:tcBorders>
-          </w:tcPr>
-          <w:p/>
-        </w:tc>
-        <w:tc>
-          <w:tcPr>
-            <w:tcW w:type="dxa" w:w="2880"/>
-            <w:tcBorders>
-              <w:top w:val="single" w:color="000000" w:sz="4"/>
-              <w:left w:val="single" w:color="000000" w:sz="4"/>
-              <w:bottom w:val="single" w:color="000000" w:sz="4"/>
-              <w:right w:val="single" w:color="000000" w:sz="4"/>
+              <w:top w:val="single" w:sz="4" w:color="000000"/>
+              <w:left w:val="single" w:sz="4" w:color="000000"/>
+              <w:bottom w:val="single" w:sz="4" w:color="000000"/>
+              <w:right w:val="single" w:sz="4" w:color="000000"/>
             </w:tcBorders>
           </w:tcPr>
           <w:p/>
@@ -3543,7 +3314,7 @@
     </w:tbl>
     <w:p>
       <w:pPr>
-        <w:spacing w:before="280"/>
+        <w:spacing w:before="200"/>
       </w:pPr>
     </w:p>
     <w:tbl>
@@ -3560,26 +3331,37 @@
         <w:tc>
           <w:tcPr>
             <w:tcW w:type="dxa" w:w="8640"/>
-            <w:tcBorders/>
           </w:tcPr>
+          <w:p/>
           <w:p>
             <w:pPr>
-              <w:spacing w:after="320"/>
+              <w:tabs>
+                <w:tab w:pos="4320" w:val="right"/>
+              </w:tabs>
+              <w:spacing w:before="0" w:after="40"/>
             </w:pPr>
-            <w:r/>
+            <w:r>
+              <w:rPr>
+                <w:rFonts w:ascii="TH Sarabun PSK" w:hAnsi="TH Sarabun PSK"/>
+                <w:b/>
+                <w:sz w:val="32"/>
+              </w:rPr>
+              <w:tab/>
+              <w:t>ผู้บังคับกองร้อย</w:t>
+            </w:r>
           </w:p>
           <w:p>
             <w:pPr>
               <w:tabs>
                 <w:tab w:pos="4320" w:val="right"/>
               </w:tabs>
-              <w:spacing w:before="0" w:after="440"/>
+              <w:spacing w:before="0" w:after="360"/>
             </w:pPr>
             <w:r>
               <w:rPr>
-                <w:rFonts w:ascii="TH Sarabun PSK" w:hAnsi="TH Sarabun PSK" w:eastAsia="TH Sarabun PSK" w:cs="TH Sarabun PSK"/>
+                <w:rFonts w:ascii="TH Sarabun PSK" w:hAnsi="TH Sarabun PSK"/>
                 <w:b w:val="0"/>
-                <w:sz w:val="24"/>
+                <w:sz w:val="32"/>
               </w:rPr>
               <w:tab/>
               <w:t>ร.อ.</w:t>
@@ -3594,9 +3376,9 @@
             </w:pPr>
             <w:r>
               <w:rPr>
-                <w:rFonts w:ascii="TH Sarabun PSK" w:hAnsi="TH Sarabun PSK" w:eastAsia="TH Sarabun PSK" w:cs="TH Sarabun PSK"/>
+                <w:rFonts w:ascii="TH Sarabun PSK" w:hAnsi="TH Sarabun PSK"/>
                 <w:b w:val="0"/>
-                <w:sz w:val="24"/>
+                <w:sz w:val="32"/>
               </w:rPr>
               <w:tab/>
               <w:t>(กฤติน  นราพงษ์)</w:t>
@@ -3605,15 +3387,15 @@
           <w:p>
             <w:pPr>
               <w:tabs>
-                <w:tab w:pos="5328" w:val="center"/>
+                <w:tab w:pos="5688" w:val="center"/>
               </w:tabs>
               <w:spacing w:before="0" w:after="0"/>
             </w:pPr>
             <w:r>
               <w:rPr>
-                <w:rFonts w:ascii="TH Sarabun PSK" w:hAnsi="TH Sarabun PSK" w:eastAsia="TH Sarabun PSK" w:cs="TH Sarabun PSK"/>
+                <w:rFonts w:ascii="TH Sarabun PSK" w:hAnsi="TH Sarabun PSK"/>
                 <w:b w:val="0"/>
-                <w:sz w:val="24"/>
+                <w:sz w:val="32"/>
               </w:rPr>
               <w:tab/>
               <w:t>ผบ.ป.พัน.๔ ร้อย.๒</w:t>
@@ -3622,38 +3404,38 @@
           <w:p>
             <w:pPr>
               <w:tabs>
-                <w:tab w:pos="5328" w:val="center"/>
+                <w:tab w:pos="5688" w:val="center"/>
               </w:tabs>
               <w:spacing w:before="0" w:after="0"/>
             </w:pPr>
             <w:r>
               <w:rPr>
-                <w:rFonts w:ascii="TH Sarabun PSK" w:hAnsi="TH Sarabun PSK" w:eastAsia="TH Sarabun PSK" w:cs="TH Sarabun PSK"/>
+                <w:rFonts w:ascii="TH Sarabun PSK" w:hAnsi="TH Sarabun PSK"/>
                 <w:b w:val="0"/>
-                <w:sz w:val="24"/>
+                <w:sz w:val="32"/>
               </w:rPr>
               <w:tab/>
-              <w:t>มิ.ย. ๕๔</w:t>
+              <w:t xml:space="preserve">          มิ.ย. ๕๔</w:t>
             </w:r>
           </w:p>
         </w:tc>
         <w:tc>
           <w:tcPr>
             <w:tcW w:type="dxa" w:w="8640"/>
-            <w:tcBorders/>
           </w:tcPr>
+          <w:p/>
           <w:p>
             <w:pPr>
               <w:tabs>
-                <w:tab w:pos="3168" w:val="left"/>
+                <w:tab w:pos="4320" w:val="right"/>
               </w:tabs>
-              <w:spacing w:after="320"/>
+              <w:spacing w:before="0" w:after="40"/>
             </w:pPr>
             <w:r>
               <w:rPr>
-                <w:rFonts w:ascii="TH Sarabun PSK" w:hAnsi="TH Sarabun PSK" w:eastAsia="TH Sarabun PSK" w:cs="TH Sarabun PSK"/>
+                <w:rFonts w:ascii="TH Sarabun PSK" w:hAnsi="TH Sarabun PSK"/>
                 <w:b/>
-                <w:sz w:val="24"/>
+                <w:sz w:val="32"/>
               </w:rPr>
               <w:tab/>
               <w:t>ผู้ตรวจสอบ</w:t>
@@ -3664,13 +3446,13 @@
               <w:tabs>
                 <w:tab w:pos="4320" w:val="right"/>
               </w:tabs>
-              <w:spacing w:before="0" w:after="440"/>
+              <w:spacing w:before="0" w:after="360"/>
             </w:pPr>
             <w:r>
               <w:rPr>
-                <w:rFonts w:ascii="TH Sarabun PSK" w:hAnsi="TH Sarabun PSK" w:eastAsia="TH Sarabun PSK" w:cs="TH Sarabun PSK"/>
+                <w:rFonts w:ascii="TH Sarabun PSK" w:hAnsi="TH Sarabun PSK"/>
                 <w:b w:val="0"/>
-                <w:sz w:val="24"/>
+                <w:sz w:val="32"/>
               </w:rPr>
               <w:tab/>
               <w:t>จ.ส.อ.</w:t>
@@ -3685,9 +3467,9 @@
             </w:pPr>
             <w:r>
               <w:rPr>
-                <w:rFonts w:ascii="TH Sarabun PSK" w:hAnsi="TH Sarabun PSK" w:eastAsia="TH Sarabun PSK" w:cs="TH Sarabun PSK"/>
+                <w:rFonts w:ascii="TH Sarabun PSK" w:hAnsi="TH Sarabun PSK"/>
                 <w:b w:val="0"/>
-                <w:sz w:val="24"/>
+                <w:sz w:val="32"/>
               </w:rPr>
               <w:tab/>
               <w:t>(ณัฐชัย  รักษาวงษ์)</w:t>
@@ -3696,15 +3478,15 @@
           <w:p>
             <w:pPr>
               <w:tabs>
-                <w:tab w:pos="5285" w:val="center"/>
+                <w:tab w:pos="5688" w:val="center"/>
               </w:tabs>
               <w:spacing w:before="0" w:after="0"/>
             </w:pPr>
             <w:r>
               <w:rPr>
-                <w:rFonts w:ascii="TH Sarabun PSK" w:hAnsi="TH Sarabun PSK" w:eastAsia="TH Sarabun PSK" w:cs="TH Sarabun PSK"/>
+                <w:rFonts w:ascii="TH Sarabun PSK" w:hAnsi="TH Sarabun PSK"/>
                 <w:b w:val="0"/>
-                <w:sz w:val="24"/>
+                <w:sz w:val="32"/>
               </w:rPr>
               <w:tab/>
               <w:t>ส.หน.สย. ป.๔ พัน.๔ ร้อย.๒</w:t>
@@ -3713,18 +3495,18 @@
           <w:p>
             <w:pPr>
               <w:tabs>
-                <w:tab w:pos="5285" w:val="center"/>
+                <w:tab w:pos="5688" w:val="center"/>
               </w:tabs>
               <w:spacing w:before="0" w:after="0"/>
             </w:pPr>
             <w:r>
               <w:rPr>
-                <w:rFonts w:ascii="TH Sarabun PSK" w:hAnsi="TH Sarabun PSK" w:eastAsia="TH Sarabun PSK" w:cs="TH Sarabun PSK"/>
+                <w:rFonts w:ascii="TH Sarabun PSK" w:hAnsi="TH Sarabun PSK"/>
                 <w:b w:val="0"/>
-                <w:sz w:val="24"/>
+                <w:sz w:val="32"/>
               </w:rPr>
               <w:tab/>
-              <w:t>มิ.ย. ๕๔</w:t>
+              <w:t xml:space="preserve">          มิ.ย. ๕๔</w:t>
             </w:r>
           </w:p>
         </w:tc>
@@ -3732,21 +3514,23 @@
     </w:tbl>
     <w:p>
       <w:pPr>
-        <w:spacing w:before="360"/>
+        <w:spacing w:before="160"/>
         <w:jc w:val="center"/>
       </w:pPr>
       <w:r>
         <w:rPr>
-          <w:rFonts w:ascii="TH Sarabun PSK" w:hAnsi="TH Sarabun PSK" w:eastAsia="TH Sarabun PSK" w:cs="TH Sarabun PSK"/>
+          <w:rFonts w:ascii="TH Sarabun PSK" w:hAnsi="TH Sarabun PSK"/>
           <w:b w:val="0"/>
-          <w:sz w:val="21"/>
+          <w:i w:val="0"/>
+          <w:sz w:val="24"/>
+          <w:rFonts w:ascii="TH Sarabun PSK" w:hAnsi="TH Sarabun PSK" w:cs="TH Sarabun PSK"/>
         </w:rPr>
         <w:t>( พิมพ์ตามระเบียบกองทัพบกว่าด้วยการส่งกำลังสิ่งอุปกรณ์ ประเภท ๒ และ ๔ พ.ศ. ๒๕๓๔ )</w:t>
       </w:r>
     </w:p>
     <w:sectPr>
       <w:pgSz w:w="20160" w:h="12240" w:orient="landscape"/>
-      <w:pgMar w:top="850" w:right="850" w:bottom="720" w:left="850" w:header="720" w:footer="720" w:gutter="0"/>
+      <w:pgMar w:top="562" w:right="850" w:bottom="562" w:left="850" w:header="720" w:footer="720" w:gutter="0"/>
       <w:cols w:space="720"/>
       <w:docGrid w:linePitch="360"/>
     </w:sectPr>

</xml_diff>